<commit_message>
Regenerate territorial diagnostics and PMD base documents
</commit_message>
<xml_diff>
--- a/public/downloads/pmd-borradores/01090005_PMD_san-victor_Borrador_Tecnico_2025-2028.docx
+++ b/public/downloads/pmd-borradores/01090005_PMD_san-victor_Borrador_Tecnico_2025-2028.docx
@@ -456,6 +456,64 @@
         <w:tc>
           <w:tcPr>
             <w:tcW w:type="dxa" w:w="8460"/>
+            <w:vAlign w:val="top"/>
+            <w:tcMar>
+              <w:top w:w="80" w:type="dxa"/>
+              <w:start w:w="120" w:type="dxa"/>
+              <w:bottom w:w="80" w:type="dxa"/>
+              <w:end w:w="120" w:type="dxa"/>
+            </w:tcMar>
+          </w:tcPr>
+          <w:p>
+            <w:pPr>
+              <w:spacing w:after="0"/>
+            </w:pPr>
+            <w:r>
+              <w:rPr>
+                <w:rFonts w:ascii="Calibri" w:hAnsi="Calibri" w:eastAsia="Calibri"/>
+                <w:b w:val="0"/>
+                <w:i w:val="0"/>
+                <w:color w:val="203740"/>
+                <w:sz w:val="17"/>
+              </w:rPr>
+              <w:t>Inversión pública: proyectos en ejecución o reprogramados identificados específicamente para el municipio en MapaInversiones.</w:t>
+            </w:r>
+          </w:p>
+        </w:tc>
+      </w:tr>
+      <w:tr>
+        <w:tc>
+          <w:tcPr>
+            <w:tcW w:type="dxa" w:w="900"/>
+            <w:shd w:fill="F7F9F9"/>
+            <w:vAlign w:val="top"/>
+            <w:tcMar>
+              <w:top w:w="80" w:type="dxa"/>
+              <w:start w:w="120" w:type="dxa"/>
+              <w:bottom w:w="80" w:type="dxa"/>
+              <w:end w:w="120" w:type="dxa"/>
+            </w:tcMar>
+          </w:tcPr>
+          <w:p>
+            <w:pPr>
+              <w:spacing w:after="0"/>
+            </w:pPr>
+            <w:r>
+              <w:rPr>
+                <w:rFonts w:ascii="Calibri" w:hAnsi="Calibri" w:eastAsia="Calibri"/>
+                <w:b w:val="0"/>
+                <w:i w:val="0"/>
+                <w:color w:val="203740"/>
+                <w:sz w:val="17"/>
+              </w:rPr>
+              <w:t>6</w:t>
+            </w:r>
+          </w:p>
+        </w:tc>
+        <w:tc>
+          <w:tcPr>
+            <w:tcW w:type="dxa" w:w="8460"/>
+            <w:shd w:fill="F7F9F9"/>
             <w:vAlign w:val="top"/>
             <w:tcMar>
               <w:top w:w="80" w:type="dxa"/>
@@ -2361,7 +2419,7 @@
     </w:p>
     <w:p>
       <w:r>
-        <w:t>Las cinco láminas siguientes reproducen en Word la lógica de impresión del Dashboard de Diagnóstico Territorial. Presentan la línea base estadística antes de su interpretación narrativa. Los datos corresponden al territorio seleccionado y conservan el año y la fuente; una ausencia se muestra como «No disponible» y no se sustituye por estimaciones.</w:t>
+        <w:t>Las 8 páginas siguientes reproducen la exportación vigente del Dashboard Territorial. Presentan la línea base estadística antes de su interpretación narrativa e incorporan los indicadores demográficos, sociales, económicos, institucionales, ambientales y de inversión disponibles. Los datos conservan el año, la fuente y el ámbito territorial; cuando la fuente solo publica un total provincial, la página lo identifica como «Provincia completa» y no lo atribuye al municipio.</w:t>
       </w:r>
     </w:p>
     <w:tbl>
@@ -2413,7 +2471,7 @@
                 <w:color w:val="FFFFFF"/>
                 <w:sz w:val="17"/>
               </w:rPr>
-              <w:t>Lámina</w:t>
+              <w:t>Bloque</w:t>
             </w:r>
           </w:p>
         </w:tc>
@@ -2498,7 +2556,7 @@
                 <w:color w:val="203740"/>
                 <w:sz w:val="17"/>
               </w:rPr>
-              <w:t>1</w:t>
+              <w:t>Demografía</w:t>
             </w:r>
           </w:p>
         </w:tc>
@@ -2582,7 +2640,7 @@
                 <w:color w:val="203740"/>
                 <w:sz w:val="17"/>
               </w:rPr>
-              <w:t>2</w:t>
+              <w:t>Condiciones de vida</w:t>
             </w:r>
           </w:p>
         </w:tc>
@@ -2610,7 +2668,7 @@
                 <w:color w:val="203740"/>
                 <w:sz w:val="17"/>
               </w:rPr>
-              <w:t>Agua, saneamiento, alumbrado, combustible y residuos</w:t>
+              <w:t>Agua, saneamiento, energía, residuos, educación, salud y conectividad</w:t>
             </w:r>
           </w:p>
         </w:tc>
@@ -2638,7 +2696,7 @@
                 <w:color w:val="203740"/>
                 <w:sz w:val="17"/>
               </w:rPr>
-              <w:t>Coberturas declaradas por hogares</w:t>
+              <w:t>Coberturas y brechas observadas</w:t>
             </w:r>
           </w:p>
         </w:tc>
@@ -2667,7 +2725,7 @@
                 <w:color w:val="203740"/>
                 <w:sz w:val="17"/>
               </w:rPr>
-              <w:t>3</w:t>
+              <w:t>Resultados y riesgos</w:t>
             </w:r>
           </w:p>
         </w:tc>
@@ -2694,7 +2752,7 @@
                 <w:color w:val="203740"/>
                 <w:sz w:val="17"/>
               </w:rPr>
-              <w:t>Oferta, nivel de instrucción, infraestructura y eficiencia educativa</w:t>
+              <w:t>Seguridad, movilidad, incendios, inclusión, primera infancia y deporte</w:t>
             </w:r>
           </w:p>
         </w:tc>
@@ -2721,7 +2779,7 @@
                 <w:color w:val="203740"/>
                 <w:sz w:val="17"/>
               </w:rPr>
-              <w:t>Capacidades y alertas educativas</w:t>
+              <w:t>Dato municipal o contexto provincial, según la fuente</w:t>
             </w:r>
           </w:p>
         </w:tc>
@@ -2751,7 +2809,7 @@
                 <w:color w:val="203740"/>
                 <w:sz w:val="17"/>
               </w:rPr>
-              <w:t>4</w:t>
+              <w:t>Gestión e inversión</w:t>
             </w:r>
           </w:p>
         </w:tc>
@@ -2779,7 +2837,7 @@
                 <w:color w:val="203740"/>
                 <w:sz w:val="17"/>
               </w:rPr>
-              <w:t>Establecimientos, empleo, tamaño empresarial y sectores CIIU</w:t>
+              <w:t>Inversión territorial, SISMAP, obras viales y licencias</w:t>
             </w:r>
           </w:p>
         </w:tc>
@@ -2807,7 +2865,7 @@
                 <w:color w:val="203740"/>
                 <w:sz w:val="17"/>
               </w:rPr>
-              <w:t>Estructura económica formal observada</w:t>
+              <w:t>Magnitud, ejecución y capacidad institucional</w:t>
             </w:r>
           </w:p>
         </w:tc>
@@ -2836,7 +2894,7 @@
                 <w:color w:val="203740"/>
                 <w:sz w:val="17"/>
               </w:rPr>
-              <w:t>5</w:t>
+              <w:t>Comparación</w:t>
             </w:r>
           </w:p>
         </w:tc>
@@ -2863,7 +2921,7 @@
                 <w:color w:val="203740"/>
                 <w:sz w:val="17"/>
               </w:rPr>
-              <w:t>Establecimientos de salud y comparación nacional</w:t>
+              <w:t>Municipio, provincia, región y país</w:t>
             </w:r>
           </w:p>
         </w:tc>
@@ -2890,7 +2948,7 @@
                 <w:color w:val="203740"/>
                 <w:sz w:val="17"/>
               </w:rPr>
-              <w:t>Presencia física y brechas relativas</w:t>
+              <w:t>Posición relativa sin convertirla automáticamente en prioridad</w:t>
             </w:r>
           </w:p>
         </w:tc>
@@ -2984,7 +3042,7 @@
       <w:r>
         <w:drawing>
           <wp:inline xmlns:a="http://schemas.openxmlformats.org/drawingml/2006/main" xmlns:pic="http://schemas.openxmlformats.org/drawingml/2006/picture">
-            <wp:extent cx="5943600" cy="7135215"/>
+            <wp:extent cx="5943600" cy="7691718"/>
             <wp:docPr id="1" name="Picture 1"/>
             <wp:cNvGraphicFramePr>
               <a:graphicFrameLocks noChangeAspect="1"/>
@@ -2993,7 +3051,7 @@
               <a:graphicData uri="http://schemas.openxmlformats.org/drawingml/2006/picture">
                 <pic:pic>
                   <pic:nvPicPr>
-                    <pic:cNvPr id="0" name="diagnostico-1.png"/>
+                    <pic:cNvPr id="0" name="dashboard-pdf-page-1.jpg"/>
                     <pic:cNvPicPr/>
                   </pic:nvPicPr>
                   <pic:blipFill>
@@ -3005,7 +3063,7 @@
                   <pic:spPr>
                     <a:xfrm>
                       <a:off x="0" y="0"/>
-                      <a:ext cx="5943600" cy="7135215"/>
+                      <a:ext cx="5943600" cy="7691718"/>
                     </a:xfrm>
                     <a:prstGeom prst="rect"/>
                   </pic:spPr>
@@ -3030,7 +3088,7 @@
       <w:r>
         <w:drawing>
           <wp:inline xmlns:a="http://schemas.openxmlformats.org/drawingml/2006/main" xmlns:pic="http://schemas.openxmlformats.org/drawingml/2006/picture">
-            <wp:extent cx="5943600" cy="7135215"/>
+            <wp:extent cx="5943600" cy="7691718"/>
             <wp:docPr id="2" name="Picture 2"/>
             <wp:cNvGraphicFramePr>
               <a:graphicFrameLocks noChangeAspect="1"/>
@@ -3039,7 +3097,7 @@
               <a:graphicData uri="http://schemas.openxmlformats.org/drawingml/2006/picture">
                 <pic:pic>
                   <pic:nvPicPr>
-                    <pic:cNvPr id="0" name="diagnostico-2.png"/>
+                    <pic:cNvPr id="0" name="dashboard-pdf-page-2.jpg"/>
                     <pic:cNvPicPr/>
                   </pic:nvPicPr>
                   <pic:blipFill>
@@ -3051,7 +3109,7 @@
                   <pic:spPr>
                     <a:xfrm>
                       <a:off x="0" y="0"/>
-                      <a:ext cx="5943600" cy="7135215"/>
+                      <a:ext cx="5943600" cy="7691718"/>
                     </a:xfrm>
                     <a:prstGeom prst="rect"/>
                   </pic:spPr>
@@ -3076,7 +3134,7 @@
       <w:r>
         <w:drawing>
           <wp:inline xmlns:a="http://schemas.openxmlformats.org/drawingml/2006/main" xmlns:pic="http://schemas.openxmlformats.org/drawingml/2006/picture">
-            <wp:extent cx="5943600" cy="7135215"/>
+            <wp:extent cx="5943600" cy="7691718"/>
             <wp:docPr id="3" name="Picture 3"/>
             <wp:cNvGraphicFramePr>
               <a:graphicFrameLocks noChangeAspect="1"/>
@@ -3085,7 +3143,7 @@
               <a:graphicData uri="http://schemas.openxmlformats.org/drawingml/2006/picture">
                 <pic:pic>
                   <pic:nvPicPr>
-                    <pic:cNvPr id="0" name="diagnostico-3.png"/>
+                    <pic:cNvPr id="0" name="dashboard-pdf-page-3.jpg"/>
                     <pic:cNvPicPr/>
                   </pic:nvPicPr>
                   <pic:blipFill>
@@ -3097,7 +3155,7 @@
                   <pic:spPr>
                     <a:xfrm>
                       <a:off x="0" y="0"/>
-                      <a:ext cx="5943600" cy="7135215"/>
+                      <a:ext cx="5943600" cy="7691718"/>
                     </a:xfrm>
                     <a:prstGeom prst="rect"/>
                   </pic:spPr>
@@ -3122,7 +3180,7 @@
       <w:r>
         <w:drawing>
           <wp:inline xmlns:a="http://schemas.openxmlformats.org/drawingml/2006/main" xmlns:pic="http://schemas.openxmlformats.org/drawingml/2006/picture">
-            <wp:extent cx="5943600" cy="7135215"/>
+            <wp:extent cx="5943600" cy="7691718"/>
             <wp:docPr id="4" name="Picture 4"/>
             <wp:cNvGraphicFramePr>
               <a:graphicFrameLocks noChangeAspect="1"/>
@@ -3131,7 +3189,7 @@
               <a:graphicData uri="http://schemas.openxmlformats.org/drawingml/2006/picture">
                 <pic:pic>
                   <pic:nvPicPr>
-                    <pic:cNvPr id="0" name="diagnostico-4.png"/>
+                    <pic:cNvPr id="0" name="dashboard-pdf-page-4.jpg"/>
                     <pic:cNvPicPr/>
                   </pic:nvPicPr>
                   <pic:blipFill>
@@ -3143,7 +3201,7 @@
                   <pic:spPr>
                     <a:xfrm>
                       <a:off x="0" y="0"/>
-                      <a:ext cx="5943600" cy="7135215"/>
+                      <a:ext cx="5943600" cy="7691718"/>
                     </a:xfrm>
                     <a:prstGeom prst="rect"/>
                   </pic:spPr>
@@ -3168,7 +3226,7 @@
       <w:r>
         <w:drawing>
           <wp:inline xmlns:a="http://schemas.openxmlformats.org/drawingml/2006/main" xmlns:pic="http://schemas.openxmlformats.org/drawingml/2006/picture">
-            <wp:extent cx="5943600" cy="7135215"/>
+            <wp:extent cx="5943600" cy="7691718"/>
             <wp:docPr id="5" name="Picture 5"/>
             <wp:cNvGraphicFramePr>
               <a:graphicFrameLocks noChangeAspect="1"/>
@@ -3177,7 +3235,7 @@
               <a:graphicData uri="http://schemas.openxmlformats.org/drawingml/2006/picture">
                 <pic:pic>
                   <pic:nvPicPr>
-                    <pic:cNvPr id="0" name="diagnostico-5.png"/>
+                    <pic:cNvPr id="0" name="dashboard-pdf-page-5.jpg"/>
                     <pic:cNvPicPr/>
                   </pic:nvPicPr>
                   <pic:blipFill>
@@ -3189,7 +3247,145 @@
                   <pic:spPr>
                     <a:xfrm>
                       <a:off x="0" y="0"/>
-                      <a:ext cx="5943600" cy="7135215"/>
+                      <a:ext cx="5943600" cy="7691718"/>
+                    </a:xfrm>
+                    <a:prstGeom prst="rect"/>
+                  </pic:spPr>
+                </pic:pic>
+              </a:graphicData>
+            </a:graphic>
+          </wp:inline>
+        </w:drawing>
+      </w:r>
+    </w:p>
+    <w:p>
+      <w:r>
+        <w:br w:type="page"/>
+      </w:r>
+    </w:p>
+    <w:p>
+      <w:pPr>
+        <w:keepLines/>
+        <w:spacing w:after="0"/>
+        <w:jc w:val="center"/>
+      </w:pPr>
+      <w:r>
+        <w:drawing>
+          <wp:inline xmlns:a="http://schemas.openxmlformats.org/drawingml/2006/main" xmlns:pic="http://schemas.openxmlformats.org/drawingml/2006/picture">
+            <wp:extent cx="5943600" cy="7691718"/>
+            <wp:docPr id="6" name="Picture 6"/>
+            <wp:cNvGraphicFramePr>
+              <a:graphicFrameLocks noChangeAspect="1"/>
+            </wp:cNvGraphicFramePr>
+            <a:graphic>
+              <a:graphicData uri="http://schemas.openxmlformats.org/drawingml/2006/picture">
+                <pic:pic>
+                  <pic:nvPicPr>
+                    <pic:cNvPr id="0" name="dashboard-pdf-page-6.jpg"/>
+                    <pic:cNvPicPr/>
+                  </pic:nvPicPr>
+                  <pic:blipFill>
+                    <a:blip r:embed="rId16"/>
+                    <a:stretch>
+                      <a:fillRect/>
+                    </a:stretch>
+                  </pic:blipFill>
+                  <pic:spPr>
+                    <a:xfrm>
+                      <a:off x="0" y="0"/>
+                      <a:ext cx="5943600" cy="7691718"/>
+                    </a:xfrm>
+                    <a:prstGeom prst="rect"/>
+                  </pic:spPr>
+                </pic:pic>
+              </a:graphicData>
+            </a:graphic>
+          </wp:inline>
+        </w:drawing>
+      </w:r>
+    </w:p>
+    <w:p>
+      <w:r>
+        <w:br w:type="page"/>
+      </w:r>
+    </w:p>
+    <w:p>
+      <w:pPr>
+        <w:keepLines/>
+        <w:spacing w:after="0"/>
+        <w:jc w:val="center"/>
+      </w:pPr>
+      <w:r>
+        <w:drawing>
+          <wp:inline xmlns:a="http://schemas.openxmlformats.org/drawingml/2006/main" xmlns:pic="http://schemas.openxmlformats.org/drawingml/2006/picture">
+            <wp:extent cx="5943600" cy="7691718"/>
+            <wp:docPr id="7" name="Picture 7"/>
+            <wp:cNvGraphicFramePr>
+              <a:graphicFrameLocks noChangeAspect="1"/>
+            </wp:cNvGraphicFramePr>
+            <a:graphic>
+              <a:graphicData uri="http://schemas.openxmlformats.org/drawingml/2006/picture">
+                <pic:pic>
+                  <pic:nvPicPr>
+                    <pic:cNvPr id="0" name="dashboard-pdf-page-7.jpg"/>
+                    <pic:cNvPicPr/>
+                  </pic:nvPicPr>
+                  <pic:blipFill>
+                    <a:blip r:embed="rId17"/>
+                    <a:stretch>
+                      <a:fillRect/>
+                    </a:stretch>
+                  </pic:blipFill>
+                  <pic:spPr>
+                    <a:xfrm>
+                      <a:off x="0" y="0"/>
+                      <a:ext cx="5943600" cy="7691718"/>
+                    </a:xfrm>
+                    <a:prstGeom prst="rect"/>
+                  </pic:spPr>
+                </pic:pic>
+              </a:graphicData>
+            </a:graphic>
+          </wp:inline>
+        </w:drawing>
+      </w:r>
+    </w:p>
+    <w:p>
+      <w:r>
+        <w:br w:type="page"/>
+      </w:r>
+    </w:p>
+    <w:p>
+      <w:pPr>
+        <w:keepLines/>
+        <w:spacing w:after="0"/>
+        <w:jc w:val="center"/>
+      </w:pPr>
+      <w:r>
+        <w:drawing>
+          <wp:inline xmlns:a="http://schemas.openxmlformats.org/drawingml/2006/main" xmlns:pic="http://schemas.openxmlformats.org/drawingml/2006/picture">
+            <wp:extent cx="5943600" cy="7691718"/>
+            <wp:docPr id="8" name="Picture 8"/>
+            <wp:cNvGraphicFramePr>
+              <a:graphicFrameLocks noChangeAspect="1"/>
+            </wp:cNvGraphicFramePr>
+            <a:graphic>
+              <a:graphicData uri="http://schemas.openxmlformats.org/drawingml/2006/picture">
+                <pic:pic>
+                  <pic:nvPicPr>
+                    <pic:cNvPr id="0" name="dashboard-pdf-page-8.jpg"/>
+                    <pic:cNvPicPr/>
+                  </pic:nvPicPr>
+                  <pic:blipFill>
+                    <a:blip r:embed="rId18"/>
+                    <a:stretch>
+                      <a:fillRect/>
+                    </a:stretch>
+                  </pic:blipFill>
+                  <pic:spPr>
+                    <a:xfrm>
+                      <a:off x="0" y="0"/>
+                      <a:ext cx="5943600" cy="7691718"/>
                     </a:xfrm>
                     <a:prstGeom prst="rect"/>
                   </pic:spPr>
@@ -3212,7 +3408,7 @@
           <w:color w:val="5E7076"/>
           <w:sz w:val="17"/>
         </w:rPr>
-        <w:t>Fuente: Dashboard de Diagnóstico Territorial, ficha de San Víctor. Láminas generadas el 2026-07-28.</w:t>
+        <w:t>Fuente: DDPT, Dashboard Territorial, ficha de San Víctor. Exportación generada el 2026-08-02.</w:t>
       </w:r>
     </w:p>
     <w:p>
@@ -3344,6 +3540,1740 @@
     <w:p>
       <w:r>
         <w:t>Las fuentes estadísticas utilizadas no describen con suficiente detalle uso del suelo, riesgos, hidrología, residuos, movilidad o estado de la infraestructura. Este apartado debe completarse con cartografía oficial, instrumentos ambientales y verificación técnica municipal; no se agregaron afirmaciones de prensa ni datos no comprobables.</w:t>
+      </w:r>
+    </w:p>
+    <w:p>
+      <w:pPr>
+        <w:pStyle w:val="Heading2"/>
+      </w:pPr>
+      <w:r>
+        <w:t>2.7 Indicadores territoriales adicionales</w:t>
+      </w:r>
+    </w:p>
+    <w:p>
+      <w:r>
+        <w:t>El Dashboard Territorial amplía la línea base con registros administrativos recientes. La columna de ámbito es parte del dato: los valores provinciales sirven como contexto y no describen por sí solos la situación exclusiva del municipio.</w:t>
+      </w:r>
+    </w:p>
+    <w:tbl>
+      <w:tblPr>
+        <w:tblW w:type="dxa" w:w="9360"/>
+        <w:tblLayout w:type="fixed"/>
+        <w:tblLook w:firstColumn="1" w:firstRow="1" w:lastColumn="0" w:lastRow="0" w:noHBand="0" w:noVBand="1" w:val="04A0"/>
+        <w:jc w:val="center"/>
+        <w:tblInd w:w="120" w:type="dxa"/>
+        <w:tblBorders>
+          <w:top w:val="single" w:sz="5" w:color="D7E0E1"/>
+          <w:left w:val="single" w:sz="5" w:color="D7E0E1"/>
+          <w:bottom w:val="single" w:sz="5" w:color="D7E0E1"/>
+          <w:right w:val="single" w:sz="5" w:color="D7E0E1"/>
+          <w:insideH w:val="single" w:sz="5" w:color="D7E0E1"/>
+          <w:insideV w:val="single" w:sz="5" w:color="D7E0E1"/>
+        </w:tblBorders>
+      </w:tblPr>
+      <w:tblGrid>
+        <w:gridCol w:w="2200"/>
+        <w:gridCol w:w="2200"/>
+        <w:gridCol w:w="2020"/>
+        <w:gridCol w:w="1300"/>
+        <w:gridCol w:w="1640"/>
+      </w:tblGrid>
+      <w:tr>
+        <w:trPr>
+          <w:tblHeader w:val="true"/>
+        </w:trPr>
+        <w:tc>
+          <w:tcPr>
+            <w:tcW w:type="dxa" w:w="2200"/>
+            <w:tcMar>
+              <w:top w:w="80" w:type="dxa"/>
+              <w:start w:w="120" w:type="dxa"/>
+              <w:bottom w:w="80" w:type="dxa"/>
+              <w:end w:w="120" w:type="dxa"/>
+            </w:tcMar>
+            <w:shd w:fill="203740"/>
+            <w:vAlign w:val="center"/>
+          </w:tcPr>
+          <w:p>
+            <w:pPr>
+              <w:spacing w:after="0"/>
+            </w:pPr>
+            <w:r>
+              <w:rPr>
+                <w:rFonts w:ascii="Calibri" w:hAnsi="Calibri" w:eastAsia="Calibri"/>
+                <w:b/>
+                <w:i w:val="0"/>
+                <w:color w:val="FFFFFF"/>
+                <w:sz w:val="17"/>
+              </w:rPr>
+              <w:t>Indicador</w:t>
+            </w:r>
+          </w:p>
+        </w:tc>
+        <w:tc>
+          <w:tcPr>
+            <w:tcW w:type="dxa" w:w="2200"/>
+            <w:tcMar>
+              <w:top w:w="80" w:type="dxa"/>
+              <w:start w:w="120" w:type="dxa"/>
+              <w:bottom w:w="80" w:type="dxa"/>
+              <w:end w:w="120" w:type="dxa"/>
+            </w:tcMar>
+            <w:shd w:fill="203740"/>
+            <w:vAlign w:val="center"/>
+          </w:tcPr>
+          <w:p>
+            <w:pPr>
+              <w:spacing w:after="0"/>
+            </w:pPr>
+            <w:r>
+              <w:rPr>
+                <w:rFonts w:ascii="Calibri" w:hAnsi="Calibri" w:eastAsia="Calibri"/>
+                <w:b/>
+                <w:i w:val="0"/>
+                <w:color w:val="FFFFFF"/>
+                <w:sz w:val="17"/>
+              </w:rPr>
+              <w:t>Valor publicado</w:t>
+            </w:r>
+          </w:p>
+        </w:tc>
+        <w:tc>
+          <w:tcPr>
+            <w:tcW w:type="dxa" w:w="2020"/>
+            <w:tcMar>
+              <w:top w:w="80" w:type="dxa"/>
+              <w:start w:w="120" w:type="dxa"/>
+              <w:bottom w:w="80" w:type="dxa"/>
+              <w:end w:w="120" w:type="dxa"/>
+            </w:tcMar>
+            <w:shd w:fill="203740"/>
+            <w:vAlign w:val="center"/>
+          </w:tcPr>
+          <w:p>
+            <w:pPr>
+              <w:spacing w:after="0"/>
+            </w:pPr>
+            <w:r>
+              <w:rPr>
+                <w:rFonts w:ascii="Calibri" w:hAnsi="Calibri" w:eastAsia="Calibri"/>
+                <w:b/>
+                <w:i w:val="0"/>
+                <w:color w:val="FFFFFF"/>
+                <w:sz w:val="17"/>
+              </w:rPr>
+              <w:t>Ámbito</w:t>
+            </w:r>
+          </w:p>
+        </w:tc>
+        <w:tc>
+          <w:tcPr>
+            <w:tcW w:type="dxa" w:w="1300"/>
+            <w:tcMar>
+              <w:top w:w="80" w:type="dxa"/>
+              <w:start w:w="120" w:type="dxa"/>
+              <w:bottom w:w="80" w:type="dxa"/>
+              <w:end w:w="120" w:type="dxa"/>
+            </w:tcMar>
+            <w:shd w:fill="203740"/>
+            <w:vAlign w:val="center"/>
+          </w:tcPr>
+          <w:p>
+            <w:pPr>
+              <w:spacing w:after="0"/>
+            </w:pPr>
+            <w:r>
+              <w:rPr>
+                <w:rFonts w:ascii="Calibri" w:hAnsi="Calibri" w:eastAsia="Calibri"/>
+                <w:b/>
+                <w:i w:val="0"/>
+                <w:color w:val="FFFFFF"/>
+                <w:sz w:val="17"/>
+              </w:rPr>
+              <w:t>Período</w:t>
+            </w:r>
+          </w:p>
+        </w:tc>
+        <w:tc>
+          <w:tcPr>
+            <w:tcW w:type="dxa" w:w="1640"/>
+            <w:tcMar>
+              <w:top w:w="80" w:type="dxa"/>
+              <w:start w:w="120" w:type="dxa"/>
+              <w:bottom w:w="80" w:type="dxa"/>
+              <w:end w:w="120" w:type="dxa"/>
+            </w:tcMar>
+            <w:shd w:fill="203740"/>
+            <w:vAlign w:val="center"/>
+          </w:tcPr>
+          <w:p>
+            <w:pPr>
+              <w:spacing w:after="0"/>
+            </w:pPr>
+            <w:r>
+              <w:rPr>
+                <w:rFonts w:ascii="Calibri" w:hAnsi="Calibri" w:eastAsia="Calibri"/>
+                <w:b/>
+                <w:i w:val="0"/>
+                <w:color w:val="FFFFFF"/>
+                <w:sz w:val="17"/>
+              </w:rPr>
+              <w:t>Fuente</w:t>
+            </w:r>
+          </w:p>
+        </w:tc>
+      </w:tr>
+      <w:tr>
+        <w:tc>
+          <w:tcPr>
+            <w:tcW w:type="dxa" w:w="2200"/>
+            <w:vAlign w:val="top"/>
+            <w:tcMar>
+              <w:top w:w="80" w:type="dxa"/>
+              <w:start w:w="120" w:type="dxa"/>
+              <w:bottom w:w="80" w:type="dxa"/>
+              <w:end w:w="120" w:type="dxa"/>
+            </w:tcMar>
+          </w:tcPr>
+          <w:p>
+            <w:pPr>
+              <w:spacing w:after="0"/>
+            </w:pPr>
+            <w:r>
+              <w:rPr>
+                <w:rFonts w:ascii="Calibri" w:hAnsi="Calibri" w:eastAsia="Calibri"/>
+                <w:b w:val="0"/>
+                <w:i w:val="0"/>
+                <w:color w:val="203740"/>
+                <w:sz w:val="17"/>
+              </w:rPr>
+              <w:t>Instalaciones deportivas registradas</w:t>
+            </w:r>
+          </w:p>
+        </w:tc>
+        <w:tc>
+          <w:tcPr>
+            <w:tcW w:type="dxa" w:w="2200"/>
+            <w:vAlign w:val="top"/>
+            <w:tcMar>
+              <w:top w:w="80" w:type="dxa"/>
+              <w:start w:w="120" w:type="dxa"/>
+              <w:bottom w:w="80" w:type="dxa"/>
+              <w:end w:w="120" w:type="dxa"/>
+            </w:tcMar>
+          </w:tcPr>
+          <w:p>
+            <w:pPr>
+              <w:spacing w:after="0"/>
+            </w:pPr>
+            <w:r>
+              <w:rPr>
+                <w:rFonts w:ascii="Calibri" w:hAnsi="Calibri" w:eastAsia="Calibri"/>
+                <w:b w:val="0"/>
+                <w:i w:val="0"/>
+                <w:color w:val="203740"/>
+                <w:sz w:val="17"/>
+              </w:rPr>
+              <w:t>0 instalaciones; 0.0 por 10 mil habitantes</w:t>
+            </w:r>
+          </w:p>
+        </w:tc>
+        <w:tc>
+          <w:tcPr>
+            <w:tcW w:type="dxa" w:w="2020"/>
+            <w:vAlign w:val="top"/>
+            <w:tcMar>
+              <w:top w:w="80" w:type="dxa"/>
+              <w:start w:w="120" w:type="dxa"/>
+              <w:bottom w:w="80" w:type="dxa"/>
+              <w:end w:w="120" w:type="dxa"/>
+            </w:tcMar>
+          </w:tcPr>
+          <w:p>
+            <w:pPr>
+              <w:spacing w:after="0"/>
+            </w:pPr>
+            <w:r>
+              <w:rPr>
+                <w:rFonts w:ascii="Calibri" w:hAnsi="Calibri" w:eastAsia="Calibri"/>
+                <w:b w:val="0"/>
+                <w:i w:val="0"/>
+                <w:color w:val="203740"/>
+                <w:sz w:val="17"/>
+              </w:rPr>
+              <w:t>Municipio de San Víctor</w:t>
+            </w:r>
+          </w:p>
+        </w:tc>
+        <w:tc>
+          <w:tcPr>
+            <w:tcW w:type="dxa" w:w="1300"/>
+            <w:vAlign w:val="top"/>
+            <w:tcMar>
+              <w:top w:w="80" w:type="dxa"/>
+              <w:start w:w="120" w:type="dxa"/>
+              <w:bottom w:w="80" w:type="dxa"/>
+              <w:end w:w="120" w:type="dxa"/>
+            </w:tcMar>
+          </w:tcPr>
+          <w:p>
+            <w:pPr>
+              <w:spacing w:after="0"/>
+            </w:pPr>
+            <w:r>
+              <w:rPr>
+                <w:rFonts w:ascii="Calibri" w:hAnsi="Calibri" w:eastAsia="Calibri"/>
+                <w:b w:val="0"/>
+                <w:i w:val="0"/>
+                <w:color w:val="203740"/>
+                <w:sz w:val="17"/>
+              </w:rPr>
+              <w:t>2025</w:t>
+            </w:r>
+          </w:p>
+        </w:tc>
+        <w:tc>
+          <w:tcPr>
+            <w:tcW w:type="dxa" w:w="1640"/>
+            <w:vAlign w:val="top"/>
+            <w:tcMar>
+              <w:top w:w="80" w:type="dxa"/>
+              <w:start w:w="120" w:type="dxa"/>
+              <w:bottom w:w="80" w:type="dxa"/>
+              <w:end w:w="120" w:type="dxa"/>
+            </w:tcMar>
+          </w:tcPr>
+          <w:p>
+            <w:pPr>
+              <w:spacing w:after="0"/>
+            </w:pPr>
+            <w:r>
+              <w:rPr>
+                <w:rFonts w:ascii="Calibri" w:hAnsi="Calibri" w:eastAsia="Calibri"/>
+                <w:b w:val="0"/>
+                <w:i w:val="0"/>
+                <w:color w:val="203740"/>
+                <w:sz w:val="17"/>
+              </w:rPr>
+              <w:t>Datos abiertos · instalaciones deportivas</w:t>
+            </w:r>
+          </w:p>
+        </w:tc>
+      </w:tr>
+      <w:tr>
+        <w:tc>
+          <w:tcPr>
+            <w:tcW w:type="dxa" w:w="2200"/>
+            <w:shd w:fill="F7F9F9"/>
+            <w:vAlign w:val="top"/>
+            <w:tcMar>
+              <w:top w:w="80" w:type="dxa"/>
+              <w:start w:w="120" w:type="dxa"/>
+              <w:bottom w:w="80" w:type="dxa"/>
+              <w:end w:w="120" w:type="dxa"/>
+            </w:tcMar>
+          </w:tcPr>
+          <w:p>
+            <w:pPr>
+              <w:spacing w:after="0"/>
+            </w:pPr>
+            <w:r>
+              <w:rPr>
+                <w:rFonts w:ascii="Calibri" w:hAnsi="Calibri" w:eastAsia="Calibri"/>
+                <w:b w:val="0"/>
+                <w:i w:val="0"/>
+                <w:color w:val="203740"/>
+                <w:sz w:val="17"/>
+              </w:rPr>
+              <w:t>Inversión pública territorial</w:t>
+            </w:r>
+          </w:p>
+        </w:tc>
+        <w:tc>
+          <w:tcPr>
+            <w:tcW w:type="dxa" w:w="2200"/>
+            <w:shd w:fill="F7F9F9"/>
+            <w:vAlign w:val="top"/>
+            <w:tcMar>
+              <w:top w:w="80" w:type="dxa"/>
+              <w:start w:w="120" w:type="dxa"/>
+              <w:bottom w:w="80" w:type="dxa"/>
+              <w:end w:w="120" w:type="dxa"/>
+            </w:tcMar>
+          </w:tcPr>
+          <w:p>
+            <w:pPr>
+              <w:spacing w:after="0"/>
+            </w:pPr>
+            <w:r>
+              <w:rPr>
+                <w:rFonts w:ascii="Calibri" w:hAnsi="Calibri" w:eastAsia="Calibri"/>
+                <w:b w:val="0"/>
+                <w:i w:val="0"/>
+                <w:color w:val="203740"/>
+                <w:sz w:val="17"/>
+              </w:rPr>
+              <w:t>Presupuesto RD$ 91,916,846; ejecutado RD$ 91,916,845; ejecución 100.0%</w:t>
+            </w:r>
+          </w:p>
+        </w:tc>
+        <w:tc>
+          <w:tcPr>
+            <w:tcW w:type="dxa" w:w="2020"/>
+            <w:shd w:fill="F7F9F9"/>
+            <w:vAlign w:val="top"/>
+            <w:tcMar>
+              <w:top w:w="80" w:type="dxa"/>
+              <w:start w:w="120" w:type="dxa"/>
+              <w:bottom w:w="80" w:type="dxa"/>
+              <w:end w:w="120" w:type="dxa"/>
+            </w:tcMar>
+          </w:tcPr>
+          <w:p>
+            <w:pPr>
+              <w:spacing w:after="0"/>
+            </w:pPr>
+            <w:r>
+              <w:rPr>
+                <w:rFonts w:ascii="Calibri" w:hAnsi="Calibri" w:eastAsia="Calibri"/>
+                <w:b w:val="0"/>
+                <w:i w:val="0"/>
+                <w:color w:val="203740"/>
+                <w:sz w:val="17"/>
+              </w:rPr>
+              <w:t>Municipio de San Víctor</w:t>
+            </w:r>
+          </w:p>
+        </w:tc>
+        <w:tc>
+          <w:tcPr>
+            <w:tcW w:type="dxa" w:w="1300"/>
+            <w:shd w:fill="F7F9F9"/>
+            <w:vAlign w:val="top"/>
+            <w:tcMar>
+              <w:top w:w="80" w:type="dxa"/>
+              <w:start w:w="120" w:type="dxa"/>
+              <w:bottom w:w="80" w:type="dxa"/>
+              <w:end w:w="120" w:type="dxa"/>
+            </w:tcMar>
+          </w:tcPr>
+          <w:p>
+            <w:pPr>
+              <w:spacing w:after="0"/>
+            </w:pPr>
+            <w:r>
+              <w:rPr>
+                <w:rFonts w:ascii="Calibri" w:hAnsi="Calibri" w:eastAsia="Calibri"/>
+                <w:b w:val="0"/>
+                <w:i w:val="0"/>
+                <w:color w:val="203740"/>
+                <w:sz w:val="17"/>
+              </w:rPr>
+              <w:t>2025</w:t>
+            </w:r>
+          </w:p>
+        </w:tc>
+        <w:tc>
+          <w:tcPr>
+            <w:tcW w:type="dxa" w:w="1640"/>
+            <w:shd w:fill="F7F9F9"/>
+            <w:vAlign w:val="top"/>
+            <w:tcMar>
+              <w:top w:w="80" w:type="dxa"/>
+              <w:start w:w="120" w:type="dxa"/>
+              <w:bottom w:w="80" w:type="dxa"/>
+              <w:end w:w="120" w:type="dxa"/>
+            </w:tcMar>
+          </w:tcPr>
+          <w:p>
+            <w:pPr>
+              <w:spacing w:after="0"/>
+            </w:pPr>
+            <w:r>
+              <w:rPr>
+                <w:rFonts w:ascii="Calibri" w:hAnsi="Calibri" w:eastAsia="Calibri"/>
+                <w:b w:val="0"/>
+                <w:i w:val="0"/>
+                <w:color w:val="203740"/>
+                <w:sz w:val="17"/>
+              </w:rPr>
+              <w:t>Datos abiertos · estadísticas de proyectos de inversión</w:t>
+            </w:r>
+          </w:p>
+        </w:tc>
+      </w:tr>
+      <w:tr>
+        <w:tc>
+          <w:tcPr>
+            <w:tcW w:type="dxa" w:w="2200"/>
+            <w:vAlign w:val="top"/>
+            <w:tcMar>
+              <w:top w:w="80" w:type="dxa"/>
+              <w:start w:w="120" w:type="dxa"/>
+              <w:bottom w:w="80" w:type="dxa"/>
+              <w:end w:w="120" w:type="dxa"/>
+            </w:tcMar>
+          </w:tcPr>
+          <w:p>
+            <w:pPr>
+              <w:spacing w:after="0"/>
+            </w:pPr>
+            <w:r>
+              <w:rPr>
+                <w:rFonts w:ascii="Calibri" w:hAnsi="Calibri" w:eastAsia="Calibri"/>
+                <w:b w:val="0"/>
+                <w:i w:val="0"/>
+                <w:color w:val="203740"/>
+                <w:sz w:val="17"/>
+              </w:rPr>
+              <w:t>Puntuación SISMAP Municipal</w:t>
+            </w:r>
+          </w:p>
+        </w:tc>
+        <w:tc>
+          <w:tcPr>
+            <w:tcW w:type="dxa" w:w="2200"/>
+            <w:vAlign w:val="top"/>
+            <w:tcMar>
+              <w:top w:w="80" w:type="dxa"/>
+              <w:start w:w="120" w:type="dxa"/>
+              <w:bottom w:w="80" w:type="dxa"/>
+              <w:end w:w="120" w:type="dxa"/>
+            </w:tcMar>
+          </w:tcPr>
+          <w:p>
+            <w:pPr>
+              <w:spacing w:after="0"/>
+            </w:pPr>
+            <w:r>
+              <w:rPr>
+                <w:rFonts w:ascii="Calibri" w:hAnsi="Calibri" w:eastAsia="Calibri"/>
+                <w:b w:val="0"/>
+                <w:i w:val="0"/>
+                <w:color w:val="203740"/>
+                <w:sz w:val="17"/>
+              </w:rPr>
+              <w:t>73.9 / 100</w:t>
+            </w:r>
+          </w:p>
+        </w:tc>
+        <w:tc>
+          <w:tcPr>
+            <w:tcW w:type="dxa" w:w="2020"/>
+            <w:vAlign w:val="top"/>
+            <w:tcMar>
+              <w:top w:w="80" w:type="dxa"/>
+              <w:start w:w="120" w:type="dxa"/>
+              <w:bottom w:w="80" w:type="dxa"/>
+              <w:end w:w="120" w:type="dxa"/>
+            </w:tcMar>
+          </w:tcPr>
+          <w:p>
+            <w:pPr>
+              <w:spacing w:after="0"/>
+            </w:pPr>
+            <w:r>
+              <w:rPr>
+                <w:rFonts w:ascii="Calibri" w:hAnsi="Calibri" w:eastAsia="Calibri"/>
+                <w:b w:val="0"/>
+                <w:i w:val="0"/>
+                <w:color w:val="203740"/>
+                <w:sz w:val="17"/>
+              </w:rPr>
+              <w:t>Municipio de San Víctor</w:t>
+            </w:r>
+          </w:p>
+        </w:tc>
+        <w:tc>
+          <w:tcPr>
+            <w:tcW w:type="dxa" w:w="1300"/>
+            <w:vAlign w:val="top"/>
+            <w:tcMar>
+              <w:top w:w="80" w:type="dxa"/>
+              <w:start w:w="120" w:type="dxa"/>
+              <w:bottom w:w="80" w:type="dxa"/>
+              <w:end w:w="120" w:type="dxa"/>
+            </w:tcMar>
+          </w:tcPr>
+          <w:p>
+            <w:pPr>
+              <w:spacing w:after="0"/>
+            </w:pPr>
+            <w:r>
+              <w:rPr>
+                <w:rFonts w:ascii="Calibri" w:hAnsi="Calibri" w:eastAsia="Calibri"/>
+                <w:b w:val="0"/>
+                <w:i w:val="0"/>
+                <w:color w:val="203740"/>
+                <w:sz w:val="17"/>
+              </w:rPr>
+              <w:t>2026-07-31</w:t>
+            </w:r>
+          </w:p>
+        </w:tc>
+        <w:tc>
+          <w:tcPr>
+            <w:tcW w:type="dxa" w:w="1640"/>
+            <w:vAlign w:val="top"/>
+            <w:tcMar>
+              <w:top w:w="80" w:type="dxa"/>
+              <w:start w:w="120" w:type="dxa"/>
+              <w:bottom w:w="80" w:type="dxa"/>
+              <w:end w:w="120" w:type="dxa"/>
+            </w:tcMar>
+          </w:tcPr>
+          <w:p>
+            <w:pPr>
+              <w:spacing w:after="0"/>
+            </w:pPr>
+            <w:r>
+              <w:rPr>
+                <w:rFonts w:ascii="Calibri" w:hAnsi="Calibri" w:eastAsia="Calibri"/>
+                <w:b w:val="0"/>
+                <w:i w:val="0"/>
+                <w:color w:val="203740"/>
+                <w:sz w:val="17"/>
+              </w:rPr>
+              <w:t>SISMAP Municipal</w:t>
+            </w:r>
+          </w:p>
+        </w:tc>
+      </w:tr>
+      <w:tr>
+        <w:tc>
+          <w:tcPr>
+            <w:tcW w:type="dxa" w:w="2200"/>
+            <w:shd w:fill="F7F9F9"/>
+            <w:vAlign w:val="top"/>
+            <w:tcMar>
+              <w:top w:w="80" w:type="dxa"/>
+              <w:start w:w="120" w:type="dxa"/>
+              <w:bottom w:w="80" w:type="dxa"/>
+              <w:end w:w="120" w:type="dxa"/>
+            </w:tcMar>
+          </w:tcPr>
+          <w:p>
+            <w:pPr>
+              <w:spacing w:after="0"/>
+            </w:pPr>
+            <w:r>
+              <w:rPr>
+                <w:rFonts w:ascii="Calibri" w:hAnsi="Calibri" w:eastAsia="Calibri"/>
+                <w:b w:val="0"/>
+                <w:i w:val="0"/>
+                <w:color w:val="203740"/>
+                <w:sz w:val="17"/>
+              </w:rPr>
+              <w:t>Trabajos viales registrados</w:t>
+            </w:r>
+          </w:p>
+        </w:tc>
+        <w:tc>
+          <w:tcPr>
+            <w:tcW w:type="dxa" w:w="2200"/>
+            <w:shd w:fill="F7F9F9"/>
+            <w:vAlign w:val="top"/>
+            <w:tcMar>
+              <w:top w:w="80" w:type="dxa"/>
+              <w:start w:w="120" w:type="dxa"/>
+              <w:bottom w:w="80" w:type="dxa"/>
+              <w:end w:w="120" w:type="dxa"/>
+            </w:tcMar>
+          </w:tcPr>
+          <w:p>
+            <w:pPr>
+              <w:spacing w:after="0"/>
+            </w:pPr>
+            <w:r>
+              <w:rPr>
+                <w:rFonts w:ascii="Calibri" w:hAnsi="Calibri" w:eastAsia="Calibri"/>
+                <w:b w:val="0"/>
+                <w:i w:val="0"/>
+                <w:color w:val="203740"/>
+                <w:sz w:val="17"/>
+              </w:rPr>
+              <w:t>16 registros; 2.1 km</w:t>
+            </w:r>
+          </w:p>
+        </w:tc>
+        <w:tc>
+          <w:tcPr>
+            <w:tcW w:type="dxa" w:w="2020"/>
+            <w:shd w:fill="F7F9F9"/>
+            <w:vAlign w:val="top"/>
+            <w:tcMar>
+              <w:top w:w="80" w:type="dxa"/>
+              <w:start w:w="120" w:type="dxa"/>
+              <w:bottom w:w="80" w:type="dxa"/>
+              <w:end w:w="120" w:type="dxa"/>
+            </w:tcMar>
+          </w:tcPr>
+          <w:p>
+            <w:pPr>
+              <w:spacing w:after="0"/>
+            </w:pPr>
+            <w:r>
+              <w:rPr>
+                <w:rFonts w:ascii="Calibri" w:hAnsi="Calibri" w:eastAsia="Calibri"/>
+                <w:b w:val="0"/>
+                <w:i w:val="0"/>
+                <w:color w:val="203740"/>
+                <w:sz w:val="17"/>
+              </w:rPr>
+              <w:t>Municipio de San Víctor</w:t>
+            </w:r>
+          </w:p>
+        </w:tc>
+        <w:tc>
+          <w:tcPr>
+            <w:tcW w:type="dxa" w:w="1300"/>
+            <w:shd w:fill="F7F9F9"/>
+            <w:vAlign w:val="top"/>
+            <w:tcMar>
+              <w:top w:w="80" w:type="dxa"/>
+              <w:start w:w="120" w:type="dxa"/>
+              <w:bottom w:w="80" w:type="dxa"/>
+              <w:end w:w="120" w:type="dxa"/>
+            </w:tcMar>
+          </w:tcPr>
+          <w:p>
+            <w:pPr>
+              <w:spacing w:after="0"/>
+            </w:pPr>
+            <w:r>
+              <w:rPr>
+                <w:rFonts w:ascii="Calibri" w:hAnsi="Calibri" w:eastAsia="Calibri"/>
+                <w:b w:val="0"/>
+                <w:i w:val="0"/>
+                <w:color w:val="203740"/>
+                <w:sz w:val="17"/>
+              </w:rPr>
+              <w:t>Octubre de 2025–marzo de 2026</w:t>
+            </w:r>
+          </w:p>
+        </w:tc>
+        <w:tc>
+          <w:tcPr>
+            <w:tcW w:type="dxa" w:w="1640"/>
+            <w:shd w:fill="F7F9F9"/>
+            <w:vAlign w:val="top"/>
+            <w:tcMar>
+              <w:top w:w="80" w:type="dxa"/>
+              <w:start w:w="120" w:type="dxa"/>
+              <w:bottom w:w="80" w:type="dxa"/>
+              <w:end w:w="120" w:type="dxa"/>
+            </w:tcMar>
+          </w:tcPr>
+          <w:p>
+            <w:pPr>
+              <w:spacing w:after="0"/>
+            </w:pPr>
+            <w:r>
+              <w:rPr>
+                <w:rFonts w:ascii="Calibri" w:hAnsi="Calibri" w:eastAsia="Calibri"/>
+                <w:b w:val="0"/>
+                <w:i w:val="0"/>
+                <w:color w:val="203740"/>
+                <w:sz w:val="17"/>
+              </w:rPr>
+              <w:t>Datos abiertos · infraestructura vial</w:t>
+            </w:r>
+          </w:p>
+        </w:tc>
+      </w:tr>
+      <w:tr>
+        <w:tc>
+          <w:tcPr>
+            <w:tcW w:type="dxa" w:w="2200"/>
+            <w:vAlign w:val="top"/>
+            <w:tcMar>
+              <w:top w:w="80" w:type="dxa"/>
+              <w:start w:w="120" w:type="dxa"/>
+              <w:bottom w:w="80" w:type="dxa"/>
+              <w:end w:w="120" w:type="dxa"/>
+            </w:tcMar>
+          </w:tcPr>
+          <w:p>
+            <w:pPr>
+              <w:spacing w:after="0"/>
+            </w:pPr>
+            <w:r>
+              <w:rPr>
+                <w:rFonts w:ascii="Calibri" w:hAnsi="Calibri" w:eastAsia="Calibri"/>
+                <w:b w:val="0"/>
+                <w:i w:val="0"/>
+                <w:color w:val="203740"/>
+                <w:sz w:val="17"/>
+              </w:rPr>
+              <w:t>Licencias de construcción</w:t>
+            </w:r>
+          </w:p>
+        </w:tc>
+        <w:tc>
+          <w:tcPr>
+            <w:tcW w:type="dxa" w:w="2200"/>
+            <w:vAlign w:val="top"/>
+            <w:tcMar>
+              <w:top w:w="80" w:type="dxa"/>
+              <w:start w:w="120" w:type="dxa"/>
+              <w:bottom w:w="80" w:type="dxa"/>
+              <w:end w:w="120" w:type="dxa"/>
+            </w:tcMar>
+          </w:tcPr>
+          <w:p>
+            <w:pPr>
+              <w:spacing w:after="0"/>
+            </w:pPr>
+            <w:r>
+              <w:rPr>
+                <w:rFonts w:ascii="Calibri" w:hAnsi="Calibri" w:eastAsia="Calibri"/>
+                <w:b w:val="0"/>
+                <w:i w:val="0"/>
+                <w:color w:val="203740"/>
+                <w:sz w:val="17"/>
+              </w:rPr>
+              <w:t>1 licencias; 506 m²; inversión RD$ 31,181,920</w:t>
+            </w:r>
+          </w:p>
+        </w:tc>
+        <w:tc>
+          <w:tcPr>
+            <w:tcW w:type="dxa" w:w="2020"/>
+            <w:vAlign w:val="top"/>
+            <w:tcMar>
+              <w:top w:w="80" w:type="dxa"/>
+              <w:start w:w="120" w:type="dxa"/>
+              <w:bottom w:w="80" w:type="dxa"/>
+              <w:end w:w="120" w:type="dxa"/>
+            </w:tcMar>
+          </w:tcPr>
+          <w:p>
+            <w:pPr>
+              <w:spacing w:after="0"/>
+            </w:pPr>
+            <w:r>
+              <w:rPr>
+                <w:rFonts w:ascii="Calibri" w:hAnsi="Calibri" w:eastAsia="Calibri"/>
+                <w:b w:val="0"/>
+                <w:i w:val="0"/>
+                <w:color w:val="203740"/>
+                <w:sz w:val="17"/>
+              </w:rPr>
+              <w:t>Municipio de San Víctor</w:t>
+            </w:r>
+          </w:p>
+        </w:tc>
+        <w:tc>
+          <w:tcPr>
+            <w:tcW w:type="dxa" w:w="1300"/>
+            <w:vAlign w:val="top"/>
+            <w:tcMar>
+              <w:top w:w="80" w:type="dxa"/>
+              <w:start w:w="120" w:type="dxa"/>
+              <w:bottom w:w="80" w:type="dxa"/>
+              <w:end w:w="120" w:type="dxa"/>
+            </w:tcMar>
+          </w:tcPr>
+          <w:p>
+            <w:pPr>
+              <w:spacing w:after="0"/>
+            </w:pPr>
+            <w:r>
+              <w:rPr>
+                <w:rFonts w:ascii="Calibri" w:hAnsi="Calibri" w:eastAsia="Calibri"/>
+                <w:b w:val="0"/>
+                <w:i w:val="0"/>
+                <w:color w:val="203740"/>
+                <w:sz w:val="17"/>
+              </w:rPr>
+              <w:t>2025</w:t>
+            </w:r>
+          </w:p>
+        </w:tc>
+        <w:tc>
+          <w:tcPr>
+            <w:tcW w:type="dxa" w:w="1640"/>
+            <w:vAlign w:val="top"/>
+            <w:tcMar>
+              <w:top w:w="80" w:type="dxa"/>
+              <w:start w:w="120" w:type="dxa"/>
+              <w:bottom w:w="80" w:type="dxa"/>
+              <w:end w:w="120" w:type="dxa"/>
+            </w:tcMar>
+          </w:tcPr>
+          <w:p>
+            <w:pPr>
+              <w:spacing w:after="0"/>
+            </w:pPr>
+            <w:r>
+              <w:rPr>
+                <w:rFonts w:ascii="Calibri" w:hAnsi="Calibri" w:eastAsia="Calibri"/>
+                <w:b w:val="0"/>
+                <w:i w:val="0"/>
+                <w:color w:val="203740"/>
+                <w:sz w:val="17"/>
+              </w:rPr>
+              <w:t>Datos abiertos · licencias emitidas</w:t>
+            </w:r>
+          </w:p>
+        </w:tc>
+      </w:tr>
+      <w:tr>
+        <w:tc>
+          <w:tcPr>
+            <w:tcW w:type="dxa" w:w="2200"/>
+            <w:shd w:fill="F7F9F9"/>
+            <w:vAlign w:val="top"/>
+            <w:tcMar>
+              <w:top w:w="80" w:type="dxa"/>
+              <w:start w:w="120" w:type="dxa"/>
+              <w:bottom w:w="80" w:type="dxa"/>
+              <w:end w:w="120" w:type="dxa"/>
+            </w:tcMar>
+          </w:tcPr>
+          <w:p>
+            <w:pPr>
+              <w:spacing w:after="0"/>
+            </w:pPr>
+            <w:r>
+              <w:rPr>
+                <w:rFonts w:ascii="Calibri" w:hAnsi="Calibri" w:eastAsia="Calibri"/>
+                <w:b w:val="0"/>
+                <w:i w:val="0"/>
+                <w:color w:val="203740"/>
+                <w:sz w:val="17"/>
+              </w:rPr>
+              <w:t>Robos reportados</w:t>
+            </w:r>
+          </w:p>
+        </w:tc>
+        <w:tc>
+          <w:tcPr>
+            <w:tcW w:type="dxa" w:w="2200"/>
+            <w:shd w:fill="F7F9F9"/>
+            <w:vAlign w:val="top"/>
+            <w:tcMar>
+              <w:top w:w="80" w:type="dxa"/>
+              <w:start w:w="120" w:type="dxa"/>
+              <w:bottom w:w="80" w:type="dxa"/>
+              <w:end w:w="120" w:type="dxa"/>
+            </w:tcMar>
+          </w:tcPr>
+          <w:p>
+            <w:pPr>
+              <w:spacing w:after="0"/>
+            </w:pPr>
+            <w:r>
+              <w:rPr>
+                <w:rFonts w:ascii="Calibri" w:hAnsi="Calibri" w:eastAsia="Calibri"/>
+                <w:b w:val="0"/>
+                <w:i w:val="0"/>
+                <w:color w:val="203740"/>
+                <w:sz w:val="17"/>
+              </w:rPr>
+              <w:t>116 casos; 48.1 por 100 mil habitantes</w:t>
+            </w:r>
+          </w:p>
+        </w:tc>
+        <w:tc>
+          <w:tcPr>
+            <w:tcW w:type="dxa" w:w="2020"/>
+            <w:shd w:fill="F7F9F9"/>
+            <w:vAlign w:val="top"/>
+            <w:tcMar>
+              <w:top w:w="80" w:type="dxa"/>
+              <w:start w:w="120" w:type="dxa"/>
+              <w:bottom w:w="80" w:type="dxa"/>
+              <w:end w:w="120" w:type="dxa"/>
+            </w:tcMar>
+          </w:tcPr>
+          <w:p>
+            <w:pPr>
+              <w:spacing w:after="0"/>
+            </w:pPr>
+            <w:r>
+              <w:rPr>
+                <w:rFonts w:ascii="Calibri" w:hAnsi="Calibri" w:eastAsia="Calibri"/>
+                <w:b w:val="0"/>
+                <w:i w:val="0"/>
+                <w:color w:val="203740"/>
+                <w:sz w:val="17"/>
+              </w:rPr>
+              <w:t>Provincia completa de Espaillat; no es valor municipal</w:t>
+            </w:r>
+          </w:p>
+        </w:tc>
+        <w:tc>
+          <w:tcPr>
+            <w:tcW w:type="dxa" w:w="1300"/>
+            <w:shd w:fill="F7F9F9"/>
+            <w:vAlign w:val="top"/>
+            <w:tcMar>
+              <w:top w:w="80" w:type="dxa"/>
+              <w:start w:w="120" w:type="dxa"/>
+              <w:bottom w:w="80" w:type="dxa"/>
+              <w:end w:w="120" w:type="dxa"/>
+            </w:tcMar>
+          </w:tcPr>
+          <w:p>
+            <w:pPr>
+              <w:spacing w:after="0"/>
+            </w:pPr>
+            <w:r>
+              <w:rPr>
+                <w:rFonts w:ascii="Calibri" w:hAnsi="Calibri" w:eastAsia="Calibri"/>
+                <w:b w:val="0"/>
+                <w:i w:val="0"/>
+                <w:color w:val="203740"/>
+                <w:sz w:val="17"/>
+              </w:rPr>
+              <w:t>Enero–junio de 2026</w:t>
+            </w:r>
+          </w:p>
+        </w:tc>
+        <w:tc>
+          <w:tcPr>
+            <w:tcW w:type="dxa" w:w="1640"/>
+            <w:shd w:fill="F7F9F9"/>
+            <w:vAlign w:val="top"/>
+            <w:tcMar>
+              <w:top w:w="80" w:type="dxa"/>
+              <w:start w:w="120" w:type="dxa"/>
+              <w:bottom w:w="80" w:type="dxa"/>
+              <w:end w:w="120" w:type="dxa"/>
+            </w:tcMar>
+          </w:tcPr>
+          <w:p>
+            <w:pPr>
+              <w:spacing w:after="0"/>
+            </w:pPr>
+            <w:r>
+              <w:rPr>
+                <w:rFonts w:ascii="Calibri" w:hAnsi="Calibri" w:eastAsia="Calibri"/>
+                <w:b w:val="0"/>
+                <w:i w:val="0"/>
+                <w:color w:val="203740"/>
+                <w:sz w:val="17"/>
+              </w:rPr>
+              <w:t>Datos abiertos · robos reportados</w:t>
+            </w:r>
+          </w:p>
+        </w:tc>
+      </w:tr>
+      <w:tr>
+        <w:tc>
+          <w:tcPr>
+            <w:tcW w:type="dxa" w:w="2200"/>
+            <w:vAlign w:val="top"/>
+            <w:tcMar>
+              <w:top w:w="80" w:type="dxa"/>
+              <w:start w:w="120" w:type="dxa"/>
+              <w:bottom w:w="80" w:type="dxa"/>
+              <w:end w:w="120" w:type="dxa"/>
+            </w:tcMar>
+          </w:tcPr>
+          <w:p>
+            <w:pPr>
+              <w:spacing w:after="0"/>
+            </w:pPr>
+            <w:r>
+              <w:rPr>
+                <w:rFonts w:ascii="Calibri" w:hAnsi="Calibri" w:eastAsia="Calibri"/>
+                <w:b w:val="0"/>
+                <w:i w:val="0"/>
+                <w:color w:val="203740"/>
+                <w:sz w:val="17"/>
+              </w:rPr>
+              <w:t>Homicidios intencionales</w:t>
+            </w:r>
+          </w:p>
+        </w:tc>
+        <w:tc>
+          <w:tcPr>
+            <w:tcW w:type="dxa" w:w="2200"/>
+            <w:vAlign w:val="top"/>
+            <w:tcMar>
+              <w:top w:w="80" w:type="dxa"/>
+              <w:start w:w="120" w:type="dxa"/>
+              <w:bottom w:w="80" w:type="dxa"/>
+              <w:end w:w="120" w:type="dxa"/>
+            </w:tcMar>
+          </w:tcPr>
+          <w:p>
+            <w:pPr>
+              <w:spacing w:after="0"/>
+            </w:pPr>
+            <w:r>
+              <w:rPr>
+                <w:rFonts w:ascii="Calibri" w:hAnsi="Calibri" w:eastAsia="Calibri"/>
+                <w:b w:val="0"/>
+                <w:i w:val="0"/>
+                <w:color w:val="203740"/>
+                <w:sz w:val="17"/>
+              </w:rPr>
+              <w:t>11 casos; 4.6 por 100 mil habitantes</w:t>
+            </w:r>
+          </w:p>
+        </w:tc>
+        <w:tc>
+          <w:tcPr>
+            <w:tcW w:type="dxa" w:w="2020"/>
+            <w:vAlign w:val="top"/>
+            <w:tcMar>
+              <w:top w:w="80" w:type="dxa"/>
+              <w:start w:w="120" w:type="dxa"/>
+              <w:bottom w:w="80" w:type="dxa"/>
+              <w:end w:w="120" w:type="dxa"/>
+            </w:tcMar>
+          </w:tcPr>
+          <w:p>
+            <w:pPr>
+              <w:spacing w:after="0"/>
+            </w:pPr>
+            <w:r>
+              <w:rPr>
+                <w:rFonts w:ascii="Calibri" w:hAnsi="Calibri" w:eastAsia="Calibri"/>
+                <w:b w:val="0"/>
+                <w:i w:val="0"/>
+                <w:color w:val="203740"/>
+                <w:sz w:val="17"/>
+              </w:rPr>
+              <w:t>Provincia completa de Espaillat; no es valor municipal</w:t>
+            </w:r>
+          </w:p>
+        </w:tc>
+        <w:tc>
+          <w:tcPr>
+            <w:tcW w:type="dxa" w:w="1300"/>
+            <w:vAlign w:val="top"/>
+            <w:tcMar>
+              <w:top w:w="80" w:type="dxa"/>
+              <w:start w:w="120" w:type="dxa"/>
+              <w:bottom w:w="80" w:type="dxa"/>
+              <w:end w:w="120" w:type="dxa"/>
+            </w:tcMar>
+          </w:tcPr>
+          <w:p>
+            <w:pPr>
+              <w:spacing w:after="0"/>
+            </w:pPr>
+            <w:r>
+              <w:rPr>
+                <w:rFonts w:ascii="Calibri" w:hAnsi="Calibri" w:eastAsia="Calibri"/>
+                <w:b w:val="0"/>
+                <w:i w:val="0"/>
+                <w:color w:val="203740"/>
+                <w:sz w:val="17"/>
+              </w:rPr>
+              <w:t>2024</w:t>
+            </w:r>
+          </w:p>
+        </w:tc>
+        <w:tc>
+          <w:tcPr>
+            <w:tcW w:type="dxa" w:w="1640"/>
+            <w:vAlign w:val="top"/>
+            <w:tcMar>
+              <w:top w:w="80" w:type="dxa"/>
+              <w:start w:w="120" w:type="dxa"/>
+              <w:bottom w:w="80" w:type="dxa"/>
+              <w:end w:w="120" w:type="dxa"/>
+            </w:tcMar>
+          </w:tcPr>
+          <w:p>
+            <w:pPr>
+              <w:spacing w:after="0"/>
+            </w:pPr>
+            <w:r>
+              <w:rPr>
+                <w:rFonts w:ascii="Calibri" w:hAnsi="Calibri" w:eastAsia="Calibri"/>
+                <w:b w:val="0"/>
+                <w:i w:val="0"/>
+                <w:color w:val="203740"/>
+                <w:sz w:val="17"/>
+              </w:rPr>
+              <w:t>ONE · muertes accidentales y violentas</w:t>
+            </w:r>
+          </w:p>
+        </w:tc>
+      </w:tr>
+      <w:tr>
+        <w:tc>
+          <w:tcPr>
+            <w:tcW w:type="dxa" w:w="2200"/>
+            <w:shd w:fill="F7F9F9"/>
+            <w:vAlign w:val="top"/>
+            <w:tcMar>
+              <w:top w:w="80" w:type="dxa"/>
+              <w:start w:w="120" w:type="dxa"/>
+              <w:bottom w:w="80" w:type="dxa"/>
+              <w:end w:w="120" w:type="dxa"/>
+            </w:tcMar>
+          </w:tcPr>
+          <w:p>
+            <w:pPr>
+              <w:spacing w:after="0"/>
+            </w:pPr>
+            <w:r>
+              <w:rPr>
+                <w:rFonts w:ascii="Calibri" w:hAnsi="Calibri" w:eastAsia="Calibri"/>
+                <w:b w:val="0"/>
+                <w:i w:val="0"/>
+                <w:color w:val="203740"/>
+                <w:sz w:val="17"/>
+              </w:rPr>
+              <w:t>Fallecimientos de tránsito</w:t>
+            </w:r>
+          </w:p>
+        </w:tc>
+        <w:tc>
+          <w:tcPr>
+            <w:tcW w:type="dxa" w:w="2200"/>
+            <w:shd w:fill="F7F9F9"/>
+            <w:vAlign w:val="top"/>
+            <w:tcMar>
+              <w:top w:w="80" w:type="dxa"/>
+              <w:start w:w="120" w:type="dxa"/>
+              <w:bottom w:w="80" w:type="dxa"/>
+              <w:end w:w="120" w:type="dxa"/>
+            </w:tcMar>
+          </w:tcPr>
+          <w:p>
+            <w:pPr>
+              <w:spacing w:after="0"/>
+            </w:pPr>
+            <w:r>
+              <w:rPr>
+                <w:rFonts w:ascii="Calibri" w:hAnsi="Calibri" w:eastAsia="Calibri"/>
+                <w:b w:val="0"/>
+                <w:i w:val="0"/>
+                <w:color w:val="203740"/>
+                <w:sz w:val="17"/>
+              </w:rPr>
+              <w:t>25 personas; 10.4 por 100 mil habitantes</w:t>
+            </w:r>
+          </w:p>
+        </w:tc>
+        <w:tc>
+          <w:tcPr>
+            <w:tcW w:type="dxa" w:w="2020"/>
+            <w:shd w:fill="F7F9F9"/>
+            <w:vAlign w:val="top"/>
+            <w:tcMar>
+              <w:top w:w="80" w:type="dxa"/>
+              <w:start w:w="120" w:type="dxa"/>
+              <w:bottom w:w="80" w:type="dxa"/>
+              <w:end w:w="120" w:type="dxa"/>
+            </w:tcMar>
+          </w:tcPr>
+          <w:p>
+            <w:pPr>
+              <w:spacing w:after="0"/>
+            </w:pPr>
+            <w:r>
+              <w:rPr>
+                <w:rFonts w:ascii="Calibri" w:hAnsi="Calibri" w:eastAsia="Calibri"/>
+                <w:b w:val="0"/>
+                <w:i w:val="0"/>
+                <w:color w:val="203740"/>
+                <w:sz w:val="17"/>
+              </w:rPr>
+              <w:t>Provincia completa de Espaillat; no es valor municipal</w:t>
+            </w:r>
+          </w:p>
+        </w:tc>
+        <w:tc>
+          <w:tcPr>
+            <w:tcW w:type="dxa" w:w="1300"/>
+            <w:shd w:fill="F7F9F9"/>
+            <w:vAlign w:val="top"/>
+            <w:tcMar>
+              <w:top w:w="80" w:type="dxa"/>
+              <w:start w:w="120" w:type="dxa"/>
+              <w:bottom w:w="80" w:type="dxa"/>
+              <w:end w:w="120" w:type="dxa"/>
+            </w:tcMar>
+          </w:tcPr>
+          <w:p>
+            <w:pPr>
+              <w:spacing w:after="0"/>
+            </w:pPr>
+            <w:r>
+              <w:rPr>
+                <w:rFonts w:ascii="Calibri" w:hAnsi="Calibri" w:eastAsia="Calibri"/>
+                <w:b w:val="0"/>
+                <w:i w:val="0"/>
+                <w:color w:val="203740"/>
+                <w:sz w:val="17"/>
+              </w:rPr>
+              <w:t>Enero–junio de 2026</w:t>
+            </w:r>
+          </w:p>
+        </w:tc>
+        <w:tc>
+          <w:tcPr>
+            <w:tcW w:type="dxa" w:w="1640"/>
+            <w:shd w:fill="F7F9F9"/>
+            <w:vAlign w:val="top"/>
+            <w:tcMar>
+              <w:top w:w="80" w:type="dxa"/>
+              <w:start w:w="120" w:type="dxa"/>
+              <w:bottom w:w="80" w:type="dxa"/>
+              <w:end w:w="120" w:type="dxa"/>
+            </w:tcMar>
+          </w:tcPr>
+          <w:p>
+            <w:pPr>
+              <w:spacing w:after="0"/>
+            </w:pPr>
+            <w:r>
+              <w:rPr>
+                <w:rFonts w:ascii="Calibri" w:hAnsi="Calibri" w:eastAsia="Calibri"/>
+                <w:b w:val="0"/>
+                <w:i w:val="0"/>
+                <w:color w:val="203740"/>
+                <w:sz w:val="17"/>
+              </w:rPr>
+              <w:t>Datos abiertos · fallecimientos de tránsito</w:t>
+            </w:r>
+          </w:p>
+        </w:tc>
+      </w:tr>
+      <w:tr>
+        <w:tc>
+          <w:tcPr>
+            <w:tcW w:type="dxa" w:w="2200"/>
+            <w:vAlign w:val="top"/>
+            <w:tcMar>
+              <w:top w:w="80" w:type="dxa"/>
+              <w:start w:w="120" w:type="dxa"/>
+              <w:bottom w:w="80" w:type="dxa"/>
+              <w:end w:w="120" w:type="dxa"/>
+            </w:tcMar>
+          </w:tcPr>
+          <w:p>
+            <w:pPr>
+              <w:spacing w:after="0"/>
+            </w:pPr>
+            <w:r>
+              <w:rPr>
+                <w:rFonts w:ascii="Calibri" w:hAnsi="Calibri" w:eastAsia="Calibri"/>
+                <w:b w:val="0"/>
+                <w:i w:val="0"/>
+                <w:color w:val="203740"/>
+                <w:sz w:val="17"/>
+              </w:rPr>
+              <w:t>Hacinamiento extremo o moderado</w:t>
+            </w:r>
+          </w:p>
+        </w:tc>
+        <w:tc>
+          <w:tcPr>
+            <w:tcW w:type="dxa" w:w="2200"/>
+            <w:vAlign w:val="top"/>
+            <w:tcMar>
+              <w:top w:w="80" w:type="dxa"/>
+              <w:start w:w="120" w:type="dxa"/>
+              <w:bottom w:w="80" w:type="dxa"/>
+              <w:end w:w="120" w:type="dxa"/>
+            </w:tcMar>
+          </w:tcPr>
+          <w:p>
+            <w:pPr>
+              <w:spacing w:after="0"/>
+            </w:pPr>
+            <w:r>
+              <w:rPr>
+                <w:rFonts w:ascii="Calibri" w:hAnsi="Calibri" w:eastAsia="Calibri"/>
+                <w:b w:val="0"/>
+                <w:i w:val="0"/>
+                <w:color w:val="203740"/>
+                <w:sz w:val="17"/>
+              </w:rPr>
+              <w:t>16.9%</w:t>
+            </w:r>
+          </w:p>
+        </w:tc>
+        <w:tc>
+          <w:tcPr>
+            <w:tcW w:type="dxa" w:w="2020"/>
+            <w:vAlign w:val="top"/>
+            <w:tcMar>
+              <w:top w:w="80" w:type="dxa"/>
+              <w:start w:w="120" w:type="dxa"/>
+              <w:bottom w:w="80" w:type="dxa"/>
+              <w:end w:w="120" w:type="dxa"/>
+            </w:tcMar>
+          </w:tcPr>
+          <w:p>
+            <w:pPr>
+              <w:spacing w:after="0"/>
+            </w:pPr>
+            <w:r>
+              <w:rPr>
+                <w:rFonts w:ascii="Calibri" w:hAnsi="Calibri" w:eastAsia="Calibri"/>
+                <w:b w:val="0"/>
+                <w:i w:val="0"/>
+                <w:color w:val="203740"/>
+                <w:sz w:val="17"/>
+              </w:rPr>
+              <w:t>Provincia completa de Espaillat; no es valor municipal</w:t>
+            </w:r>
+          </w:p>
+        </w:tc>
+        <w:tc>
+          <w:tcPr>
+            <w:tcW w:type="dxa" w:w="1300"/>
+            <w:vAlign w:val="top"/>
+            <w:tcMar>
+              <w:top w:w="80" w:type="dxa"/>
+              <w:start w:w="120" w:type="dxa"/>
+              <w:bottom w:w="80" w:type="dxa"/>
+              <w:end w:w="120" w:type="dxa"/>
+            </w:tcMar>
+          </w:tcPr>
+          <w:p>
+            <w:pPr>
+              <w:spacing w:after="0"/>
+            </w:pPr>
+            <w:r>
+              <w:rPr>
+                <w:rFonts w:ascii="Calibri" w:hAnsi="Calibri" w:eastAsia="Calibri"/>
+                <w:b w:val="0"/>
+                <w:i w:val="0"/>
+                <w:color w:val="203740"/>
+                <w:sz w:val="17"/>
+              </w:rPr>
+              <w:t>2026</w:t>
+            </w:r>
+          </w:p>
+        </w:tc>
+        <w:tc>
+          <w:tcPr>
+            <w:tcW w:type="dxa" w:w="1640"/>
+            <w:vAlign w:val="top"/>
+            <w:tcMar>
+              <w:top w:w="80" w:type="dxa"/>
+              <w:start w:w="120" w:type="dxa"/>
+              <w:bottom w:w="80" w:type="dxa"/>
+              <w:end w:w="120" w:type="dxa"/>
+            </w:tcMar>
+          </w:tcPr>
+          <w:p>
+            <w:pPr>
+              <w:spacing w:after="0"/>
+            </w:pPr>
+            <w:r>
+              <w:rPr>
+                <w:rFonts w:ascii="Calibri" w:hAnsi="Calibri" w:eastAsia="Calibri"/>
+                <w:b w:val="0"/>
+                <w:i w:val="0"/>
+                <w:color w:val="203740"/>
+                <w:sz w:val="17"/>
+              </w:rPr>
+              <w:t>Datos abiertos · hacinamiento</w:t>
+            </w:r>
+          </w:p>
+        </w:tc>
+      </w:tr>
+      <w:tr>
+        <w:tc>
+          <w:tcPr>
+            <w:tcW w:type="dxa" w:w="2200"/>
+            <w:shd w:fill="F7F9F9"/>
+            <w:vAlign w:val="top"/>
+            <w:tcMar>
+              <w:top w:w="80" w:type="dxa"/>
+              <w:start w:w="120" w:type="dxa"/>
+              <w:bottom w:w="80" w:type="dxa"/>
+              <w:end w:w="120" w:type="dxa"/>
+            </w:tcMar>
+          </w:tcPr>
+          <w:p>
+            <w:pPr>
+              <w:spacing w:after="0"/>
+            </w:pPr>
+            <w:r>
+              <w:rPr>
+                <w:rFonts w:ascii="Calibri" w:hAnsi="Calibri" w:eastAsia="Calibri"/>
+                <w:b w:val="0"/>
+                <w:i w:val="0"/>
+                <w:color w:val="203740"/>
+                <w:sz w:val="17"/>
+              </w:rPr>
+              <w:t>Personas con discapacidad en ICV-1 o ICV-2</w:t>
+            </w:r>
+          </w:p>
+        </w:tc>
+        <w:tc>
+          <w:tcPr>
+            <w:tcW w:type="dxa" w:w="2200"/>
+            <w:shd w:fill="F7F9F9"/>
+            <w:vAlign w:val="top"/>
+            <w:tcMar>
+              <w:top w:w="80" w:type="dxa"/>
+              <w:start w:w="120" w:type="dxa"/>
+              <w:bottom w:w="80" w:type="dxa"/>
+              <w:end w:w="120" w:type="dxa"/>
+            </w:tcMar>
+          </w:tcPr>
+          <w:p>
+            <w:pPr>
+              <w:spacing w:after="0"/>
+            </w:pPr>
+            <w:r>
+              <w:rPr>
+                <w:rFonts w:ascii="Calibri" w:hAnsi="Calibri" w:eastAsia="Calibri"/>
+                <w:b w:val="0"/>
+                <w:i w:val="0"/>
+                <w:color w:val="203740"/>
+                <w:sz w:val="17"/>
+              </w:rPr>
+              <w:t>45.9%</w:t>
+            </w:r>
+          </w:p>
+        </w:tc>
+        <w:tc>
+          <w:tcPr>
+            <w:tcW w:type="dxa" w:w="2020"/>
+            <w:shd w:fill="F7F9F9"/>
+            <w:vAlign w:val="top"/>
+            <w:tcMar>
+              <w:top w:w="80" w:type="dxa"/>
+              <w:start w:w="120" w:type="dxa"/>
+              <w:bottom w:w="80" w:type="dxa"/>
+              <w:end w:w="120" w:type="dxa"/>
+            </w:tcMar>
+          </w:tcPr>
+          <w:p>
+            <w:pPr>
+              <w:spacing w:after="0"/>
+            </w:pPr>
+            <w:r>
+              <w:rPr>
+                <w:rFonts w:ascii="Calibri" w:hAnsi="Calibri" w:eastAsia="Calibri"/>
+                <w:b w:val="0"/>
+                <w:i w:val="0"/>
+                <w:color w:val="203740"/>
+                <w:sz w:val="17"/>
+              </w:rPr>
+              <w:t>Provincia completa de Espaillat; no es valor municipal</w:t>
+            </w:r>
+          </w:p>
+        </w:tc>
+        <w:tc>
+          <w:tcPr>
+            <w:tcW w:type="dxa" w:w="1300"/>
+            <w:shd w:fill="F7F9F9"/>
+            <w:vAlign w:val="top"/>
+            <w:tcMar>
+              <w:top w:w="80" w:type="dxa"/>
+              <w:start w:w="120" w:type="dxa"/>
+              <w:bottom w:w="80" w:type="dxa"/>
+              <w:end w:w="120" w:type="dxa"/>
+            </w:tcMar>
+          </w:tcPr>
+          <w:p>
+            <w:pPr>
+              <w:spacing w:after="0"/>
+            </w:pPr>
+            <w:r>
+              <w:rPr>
+                <w:rFonts w:ascii="Calibri" w:hAnsi="Calibri" w:eastAsia="Calibri"/>
+                <w:b w:val="0"/>
+                <w:i w:val="0"/>
+                <w:color w:val="203740"/>
+                <w:sz w:val="17"/>
+              </w:rPr>
+              <w:t>2026</w:t>
+            </w:r>
+          </w:p>
+        </w:tc>
+        <w:tc>
+          <w:tcPr>
+            <w:tcW w:type="dxa" w:w="1640"/>
+            <w:shd w:fill="F7F9F9"/>
+            <w:vAlign w:val="top"/>
+            <w:tcMar>
+              <w:top w:w="80" w:type="dxa"/>
+              <w:start w:w="120" w:type="dxa"/>
+              <w:bottom w:w="80" w:type="dxa"/>
+              <w:end w:w="120" w:type="dxa"/>
+            </w:tcMar>
+          </w:tcPr>
+          <w:p>
+            <w:pPr>
+              <w:spacing w:after="0"/>
+            </w:pPr>
+            <w:r>
+              <w:rPr>
+                <w:rFonts w:ascii="Calibri" w:hAnsi="Calibri" w:eastAsia="Calibri"/>
+                <w:b w:val="0"/>
+                <w:i w:val="0"/>
+                <w:color w:val="203740"/>
+                <w:sz w:val="17"/>
+              </w:rPr>
+              <w:t>Datos abiertos · discapacidad por provincia</w:t>
+            </w:r>
+          </w:p>
+        </w:tc>
+      </w:tr>
+      <w:tr>
+        <w:tc>
+          <w:tcPr>
+            <w:tcW w:type="dxa" w:w="2200"/>
+            <w:vAlign w:val="top"/>
+            <w:tcMar>
+              <w:top w:w="80" w:type="dxa"/>
+              <w:start w:w="120" w:type="dxa"/>
+              <w:bottom w:w="80" w:type="dxa"/>
+              <w:end w:w="120" w:type="dxa"/>
+            </w:tcMar>
+          </w:tcPr>
+          <w:p>
+            <w:pPr>
+              <w:spacing w:after="0"/>
+            </w:pPr>
+            <w:r>
+              <w:rPr>
+                <w:rFonts w:ascii="Calibri" w:hAnsi="Calibri" w:eastAsia="Calibri"/>
+                <w:b w:val="0"/>
+                <w:i w:val="0"/>
+                <w:color w:val="203740"/>
+                <w:sz w:val="17"/>
+              </w:rPr>
+              <w:t>Registros de nacimiento</w:t>
+            </w:r>
+          </w:p>
+        </w:tc>
+        <w:tc>
+          <w:tcPr>
+            <w:tcW w:type="dxa" w:w="2200"/>
+            <w:vAlign w:val="top"/>
+            <w:tcMar>
+              <w:top w:w="80" w:type="dxa"/>
+              <w:start w:w="120" w:type="dxa"/>
+              <w:bottom w:w="80" w:type="dxa"/>
+              <w:end w:w="120" w:type="dxa"/>
+            </w:tcMar>
+          </w:tcPr>
+          <w:p>
+            <w:pPr>
+              <w:spacing w:after="0"/>
+            </w:pPr>
+            <w:r>
+              <w:rPr>
+                <w:rFonts w:ascii="Calibri" w:hAnsi="Calibri" w:eastAsia="Calibri"/>
+                <w:b w:val="0"/>
+                <w:i w:val="0"/>
+                <w:color w:val="203740"/>
+                <w:sz w:val="17"/>
+              </w:rPr>
+              <w:t>3,355 registros; 13.9 por mil habitantes</w:t>
+            </w:r>
+          </w:p>
+        </w:tc>
+        <w:tc>
+          <w:tcPr>
+            <w:tcW w:type="dxa" w:w="2020"/>
+            <w:vAlign w:val="top"/>
+            <w:tcMar>
+              <w:top w:w="80" w:type="dxa"/>
+              <w:start w:w="120" w:type="dxa"/>
+              <w:bottom w:w="80" w:type="dxa"/>
+              <w:end w:w="120" w:type="dxa"/>
+            </w:tcMar>
+          </w:tcPr>
+          <w:p>
+            <w:pPr>
+              <w:spacing w:after="0"/>
+            </w:pPr>
+            <w:r>
+              <w:rPr>
+                <w:rFonts w:ascii="Calibri" w:hAnsi="Calibri" w:eastAsia="Calibri"/>
+                <w:b w:val="0"/>
+                <w:i w:val="0"/>
+                <w:color w:val="203740"/>
+                <w:sz w:val="17"/>
+              </w:rPr>
+              <w:t>Provincia completa de Espaillat; no es valor municipal</w:t>
+            </w:r>
+          </w:p>
+        </w:tc>
+        <w:tc>
+          <w:tcPr>
+            <w:tcW w:type="dxa" w:w="1300"/>
+            <w:vAlign w:val="top"/>
+            <w:tcMar>
+              <w:top w:w="80" w:type="dxa"/>
+              <w:start w:w="120" w:type="dxa"/>
+              <w:bottom w:w="80" w:type="dxa"/>
+              <w:end w:w="120" w:type="dxa"/>
+            </w:tcMar>
+          </w:tcPr>
+          <w:p>
+            <w:pPr>
+              <w:spacing w:after="0"/>
+            </w:pPr>
+            <w:r>
+              <w:rPr>
+                <w:rFonts w:ascii="Calibri" w:hAnsi="Calibri" w:eastAsia="Calibri"/>
+                <w:b w:val="0"/>
+                <w:i w:val="0"/>
+                <w:color w:val="203740"/>
+                <w:sz w:val="17"/>
+              </w:rPr>
+              <w:t>2024</w:t>
+            </w:r>
+          </w:p>
+        </w:tc>
+        <w:tc>
+          <w:tcPr>
+            <w:tcW w:type="dxa" w:w="1640"/>
+            <w:vAlign w:val="top"/>
+            <w:tcMar>
+              <w:top w:w="80" w:type="dxa"/>
+              <w:start w:w="120" w:type="dxa"/>
+              <w:bottom w:w="80" w:type="dxa"/>
+              <w:end w:w="120" w:type="dxa"/>
+            </w:tcMar>
+          </w:tcPr>
+          <w:p>
+            <w:pPr>
+              <w:spacing w:after="0"/>
+            </w:pPr>
+            <w:r>
+              <w:rPr>
+                <w:rFonts w:ascii="Calibri" w:hAnsi="Calibri" w:eastAsia="Calibri"/>
+                <w:b w:val="0"/>
+                <w:i w:val="0"/>
+                <w:color w:val="203740"/>
+                <w:sz w:val="17"/>
+              </w:rPr>
+              <w:t>Datos abiertos · provincia de registro</w:t>
+            </w:r>
+          </w:p>
+        </w:tc>
+      </w:tr>
+    </w:tbl>
+    <w:p>
+      <w:pPr>
+        <w:spacing w:after="0"/>
+      </w:pPr>
+    </w:p>
+    <w:p>
+      <w:pPr>
+        <w:pStyle w:val="SourceNote"/>
+      </w:pPr>
+      <w:r>
+        <w:rPr>
+          <w:rFonts w:ascii="Calibri" w:hAnsi="Calibri" w:eastAsia="Calibri"/>
+          <w:b w:val="0"/>
+          <w:i w:val="0"/>
+          <w:color w:val="5E7076"/>
+          <w:sz w:val="17"/>
+        </w:rPr>
+        <w:t>Fuente: DDPT, Dashboard Territorial, dataset generado el 2026-08-01T15:52:35.655Z. La ausencia de registros no se interpreta automáticamente como cero.</w:t>
       </w:r>
     </w:p>
     <w:p>
@@ -4395,11 +6325,509 @@
       </w:r>
     </w:p>
     <w:p>
+      <w:r>
+        <w:br w:type="page"/>
+      </w:r>
+    </w:p>
+    <w:p>
       <w:pPr>
         <w:pStyle w:val="Heading1"/>
       </w:pPr>
       <w:r>
-        <w:t>5. Plan de acción a acordar por el CDM</w:t>
+        <w:t>5. Inversión pública</w:t>
+      </w:r>
+    </w:p>
+    <w:p>
+      <w:r>
+        <w:t>Con corte al 2026-08-02, MapaInversiones registra 2 proyectos en ejecución o reprogramados con identificación territorial específica para San Víctor. La programación presupuestaria 2026 asociada suma RD$ 124,649,182 y la ejecución registrada suma RD$ 110,094,432. Estos proyectos pertenecen a instituciones públicas y no constituyen por sí mismos acuerdos, compromisos ni proyectos aprobados por el CDM o el ayuntamiento.</w:t>
+      </w:r>
+    </w:p>
+    <w:p>
+      <w:pPr>
+        <w:pStyle w:val="SourceNote"/>
+      </w:pPr>
+      <w:r>
+        <w:rPr>
+          <w:rFonts w:ascii="Calibri" w:hAnsi="Calibri" w:eastAsia="Calibri"/>
+          <w:b w:val="0"/>
+          <w:i w:val="0"/>
+          <w:color w:val="5E7076"/>
+          <w:sz w:val="17"/>
+        </w:rPr>
+        <w:t>Fuente: MapaInversiones, datos abiertos 2026 y perfiles oficiales de proyectos, https://mapainversiones.gob.do/. Se incluyen únicamente proyectos con alcance municipal específico y estado EJECUCIÓN o REPROGRAMAR; los proyectos nacionales o provinciales sin municipio confirmado no se asignan artificialmente. Los importes se presentan en pesos dominicanos nominales, exactamente en la unidad publicada por la fuente y sin aplicar multiplicadores; los valores inusualmente bajos deben confirmarse en el perfil oficial.</w:t>
+      </w:r>
+    </w:p>
+    <w:tbl>
+      <w:tblPr>
+        <w:tblW w:type="dxa" w:w="9360"/>
+        <w:tblLayout w:type="fixed"/>
+        <w:tblLook w:firstColumn="1" w:firstRow="1" w:lastColumn="0" w:lastRow="0" w:noHBand="0" w:noVBand="1" w:val="04A0"/>
+        <w:jc w:val="center"/>
+        <w:tblInd w:w="120" w:type="dxa"/>
+        <w:tblBorders>
+          <w:top w:val="single" w:sz="5" w:color="D7E0E1"/>
+          <w:left w:val="single" w:sz="5" w:color="D7E0E1"/>
+          <w:bottom w:val="single" w:sz="5" w:color="D7E0E1"/>
+          <w:right w:val="single" w:sz="5" w:color="D7E0E1"/>
+          <w:insideH w:val="single" w:sz="5" w:color="D7E0E1"/>
+          <w:insideV w:val="single" w:sz="5" w:color="D7E0E1"/>
+        </w:tblBorders>
+      </w:tblPr>
+      <w:tblGrid>
+        <w:gridCol w:w="3540"/>
+        <w:gridCol w:w="1980"/>
+        <w:gridCol w:w="1500"/>
+        <w:gridCol w:w="1170"/>
+        <w:gridCol w:w="1170"/>
+      </w:tblGrid>
+      <w:tr>
+        <w:trPr>
+          <w:tblHeader w:val="true"/>
+        </w:trPr>
+        <w:tc>
+          <w:tcPr>
+            <w:tcW w:type="dxa" w:w="3540"/>
+            <w:tcMar>
+              <w:top w:w="80" w:type="dxa"/>
+              <w:start w:w="120" w:type="dxa"/>
+              <w:bottom w:w="80" w:type="dxa"/>
+              <w:end w:w="120" w:type="dxa"/>
+            </w:tcMar>
+            <w:shd w:fill="203740"/>
+            <w:vAlign w:val="center"/>
+          </w:tcPr>
+          <w:p>
+            <w:pPr>
+              <w:spacing w:after="0"/>
+            </w:pPr>
+            <w:r>
+              <w:rPr>
+                <w:rFonts w:ascii="Calibri" w:hAnsi="Calibri" w:eastAsia="Calibri"/>
+                <w:b/>
+                <w:i w:val="0"/>
+                <w:color w:val="FFFFFF"/>
+                <w:sz w:val="17"/>
+              </w:rPr>
+              <w:t>Proyecto</w:t>
+            </w:r>
+          </w:p>
+        </w:tc>
+        <w:tc>
+          <w:tcPr>
+            <w:tcW w:type="dxa" w:w="1980"/>
+            <w:tcMar>
+              <w:top w:w="80" w:type="dxa"/>
+              <w:start w:w="120" w:type="dxa"/>
+              <w:bottom w:w="80" w:type="dxa"/>
+              <w:end w:w="120" w:type="dxa"/>
+            </w:tcMar>
+            <w:shd w:fill="203740"/>
+            <w:vAlign w:val="center"/>
+          </w:tcPr>
+          <w:p>
+            <w:pPr>
+              <w:spacing w:after="0"/>
+            </w:pPr>
+            <w:r>
+              <w:rPr>
+                <w:rFonts w:ascii="Calibri" w:hAnsi="Calibri" w:eastAsia="Calibri"/>
+                <w:b/>
+                <w:i w:val="0"/>
+                <w:color w:val="FFFFFF"/>
+                <w:sz w:val="17"/>
+              </w:rPr>
+              <w:t>Institución</w:t>
+            </w:r>
+          </w:p>
+        </w:tc>
+        <w:tc>
+          <w:tcPr>
+            <w:tcW w:type="dxa" w:w="1500"/>
+            <w:tcMar>
+              <w:top w:w="80" w:type="dxa"/>
+              <w:start w:w="120" w:type="dxa"/>
+              <w:bottom w:w="80" w:type="dxa"/>
+              <w:end w:w="120" w:type="dxa"/>
+            </w:tcMar>
+            <w:shd w:fill="203740"/>
+            <w:vAlign w:val="center"/>
+          </w:tcPr>
+          <w:p>
+            <w:pPr>
+              <w:spacing w:after="0"/>
+            </w:pPr>
+            <w:r>
+              <w:rPr>
+                <w:rFonts w:ascii="Calibri" w:hAnsi="Calibri" w:eastAsia="Calibri"/>
+                <w:b/>
+                <w:i w:val="0"/>
+                <w:color w:val="FFFFFF"/>
+                <w:sz w:val="17"/>
+              </w:rPr>
+              <w:t>Estado / período</w:t>
+            </w:r>
+          </w:p>
+        </w:tc>
+        <w:tc>
+          <w:tcPr>
+            <w:tcW w:type="dxa" w:w="1170"/>
+            <w:tcMar>
+              <w:top w:w="80" w:type="dxa"/>
+              <w:start w:w="120" w:type="dxa"/>
+              <w:bottom w:w="80" w:type="dxa"/>
+              <w:end w:w="120" w:type="dxa"/>
+            </w:tcMar>
+            <w:shd w:fill="203740"/>
+            <w:vAlign w:val="center"/>
+          </w:tcPr>
+          <w:p>
+            <w:pPr>
+              <w:spacing w:after="0"/>
+            </w:pPr>
+            <w:r>
+              <w:rPr>
+                <w:rFonts w:ascii="Calibri" w:hAnsi="Calibri" w:eastAsia="Calibri"/>
+                <w:b/>
+                <w:i w:val="0"/>
+                <w:color w:val="FFFFFF"/>
+                <w:sz w:val="17"/>
+              </w:rPr>
+              <w:t>Asignación 2026 (RD$)</w:t>
+            </w:r>
+          </w:p>
+        </w:tc>
+        <w:tc>
+          <w:tcPr>
+            <w:tcW w:type="dxa" w:w="1170"/>
+            <w:tcMar>
+              <w:top w:w="80" w:type="dxa"/>
+              <w:start w:w="120" w:type="dxa"/>
+              <w:bottom w:w="80" w:type="dxa"/>
+              <w:end w:w="120" w:type="dxa"/>
+            </w:tcMar>
+            <w:shd w:fill="203740"/>
+            <w:vAlign w:val="center"/>
+          </w:tcPr>
+          <w:p>
+            <w:pPr>
+              <w:spacing w:after="0"/>
+            </w:pPr>
+            <w:r>
+              <w:rPr>
+                <w:rFonts w:ascii="Calibri" w:hAnsi="Calibri" w:eastAsia="Calibri"/>
+                <w:b/>
+                <w:i w:val="0"/>
+                <w:color w:val="FFFFFF"/>
+                <w:sz w:val="17"/>
+              </w:rPr>
+              <w:t>Ejecutado 2026 (RD$)</w:t>
+            </w:r>
+          </w:p>
+        </w:tc>
+      </w:tr>
+      <w:tr>
+        <w:tc>
+          <w:tcPr>
+            <w:tcW w:type="dxa" w:w="3540"/>
+            <w:vAlign w:val="top"/>
+            <w:tcMar>
+              <w:top w:w="80" w:type="dxa"/>
+              <w:start w:w="120" w:type="dxa"/>
+              <w:bottom w:w="80" w:type="dxa"/>
+              <w:end w:w="120" w:type="dxa"/>
+            </w:tcMar>
+          </w:tcPr>
+          <w:p>
+            <w:pPr>
+              <w:spacing w:after="0"/>
+            </w:pPr>
+            <w:r>
+              <w:rPr>
+                <w:rFonts w:ascii="Calibri" w:hAnsi="Calibri" w:eastAsia="Calibri"/>
+                <w:b w:val="0"/>
+                <w:i w:val="0"/>
+                <w:color w:val="203740"/>
+                <w:sz w:val="17"/>
+              </w:rPr>
+              <w:t>RECONSTRUCCIÓN DE LA INFRAESTRUCTURA VIAL URBANA DEL MUNICIPIO SAN VICTOR, PROVINCIA ESPAILLAT</w:t>
+              <w:br/>
+              <w:t>SNIP 15804 · Ficha 6172</w:t>
+              <w:br/>
+              <w:t>Ubicación: perfil oficial</w:t>
+            </w:r>
+          </w:p>
+        </w:tc>
+        <w:tc>
+          <w:tcPr>
+            <w:tcW w:type="dxa" w:w="1980"/>
+            <w:vAlign w:val="top"/>
+            <w:tcMar>
+              <w:top w:w="80" w:type="dxa"/>
+              <w:start w:w="120" w:type="dxa"/>
+              <w:bottom w:w="80" w:type="dxa"/>
+              <w:end w:w="120" w:type="dxa"/>
+            </w:tcMar>
+          </w:tcPr>
+          <w:p>
+            <w:pPr>
+              <w:spacing w:after="0"/>
+            </w:pPr>
+            <w:r>
+              <w:rPr>
+                <w:rFonts w:ascii="Calibri" w:hAnsi="Calibri" w:eastAsia="Calibri"/>
+                <w:b w:val="0"/>
+                <w:i w:val="0"/>
+                <w:color w:val="203740"/>
+                <w:sz w:val="17"/>
+              </w:rPr>
+              <w:t>MINISTERIO DE OBRAS PUBLICAS Y COMUNICACIONES</w:t>
+            </w:r>
+          </w:p>
+        </w:tc>
+        <w:tc>
+          <w:tcPr>
+            <w:tcW w:type="dxa" w:w="1500"/>
+            <w:vAlign w:val="top"/>
+            <w:tcMar>
+              <w:top w:w="80" w:type="dxa"/>
+              <w:start w:w="120" w:type="dxa"/>
+              <w:bottom w:w="80" w:type="dxa"/>
+              <w:end w:w="120" w:type="dxa"/>
+            </w:tcMar>
+          </w:tcPr>
+          <w:p>
+            <w:pPr>
+              <w:spacing w:after="0"/>
+            </w:pPr>
+            <w:r>
+              <w:rPr>
+                <w:rFonts w:ascii="Calibri" w:hAnsi="Calibri" w:eastAsia="Calibri"/>
+                <w:b w:val="0"/>
+                <w:i w:val="0"/>
+                <w:color w:val="203740"/>
+                <w:sz w:val="17"/>
+              </w:rPr>
+              <w:t>En ejecución</w:t>
+              <w:br/>
+              <w:t>2023–2027</w:t>
+            </w:r>
+          </w:p>
+        </w:tc>
+        <w:tc>
+          <w:tcPr>
+            <w:tcW w:type="dxa" w:w="1170"/>
+            <w:vAlign w:val="top"/>
+            <w:tcMar>
+              <w:top w:w="80" w:type="dxa"/>
+              <w:start w:w="120" w:type="dxa"/>
+              <w:bottom w:w="80" w:type="dxa"/>
+              <w:end w:w="120" w:type="dxa"/>
+            </w:tcMar>
+          </w:tcPr>
+          <w:p>
+            <w:pPr>
+              <w:spacing w:after="0"/>
+            </w:pPr>
+            <w:r>
+              <w:rPr>
+                <w:rFonts w:ascii="Calibri" w:hAnsi="Calibri" w:eastAsia="Calibri"/>
+                <w:b w:val="0"/>
+                <w:i w:val="0"/>
+                <w:color w:val="203740"/>
+                <w:sz w:val="17"/>
+              </w:rPr>
+              <w:t>105,000,032</w:t>
+            </w:r>
+          </w:p>
+        </w:tc>
+        <w:tc>
+          <w:tcPr>
+            <w:tcW w:type="dxa" w:w="1170"/>
+            <w:vAlign w:val="top"/>
+            <w:tcMar>
+              <w:top w:w="80" w:type="dxa"/>
+              <w:start w:w="120" w:type="dxa"/>
+              <w:bottom w:w="80" w:type="dxa"/>
+              <w:end w:w="120" w:type="dxa"/>
+            </w:tcMar>
+          </w:tcPr>
+          <w:p>
+            <w:pPr>
+              <w:spacing w:after="0"/>
+            </w:pPr>
+            <w:r>
+              <w:rPr>
+                <w:rFonts w:ascii="Calibri" w:hAnsi="Calibri" w:eastAsia="Calibri"/>
+                <w:b w:val="0"/>
+                <w:i w:val="0"/>
+                <w:color w:val="203740"/>
+                <w:sz w:val="17"/>
+              </w:rPr>
+              <w:t>104,058,217</w:t>
+            </w:r>
+          </w:p>
+        </w:tc>
+      </w:tr>
+      <w:tr>
+        <w:tc>
+          <w:tcPr>
+            <w:tcW w:type="dxa" w:w="3540"/>
+            <w:shd w:fill="F7F9F9"/>
+            <w:vAlign w:val="top"/>
+            <w:tcMar>
+              <w:top w:w="80" w:type="dxa"/>
+              <w:start w:w="120" w:type="dxa"/>
+              <w:bottom w:w="80" w:type="dxa"/>
+              <w:end w:w="120" w:type="dxa"/>
+            </w:tcMar>
+          </w:tcPr>
+          <w:p>
+            <w:pPr>
+              <w:spacing w:after="0"/>
+            </w:pPr>
+            <w:r>
+              <w:rPr>
+                <w:rFonts w:ascii="Calibri" w:hAnsi="Calibri" w:eastAsia="Calibri"/>
+                <w:b w:val="0"/>
+                <w:i w:val="0"/>
+                <w:color w:val="203740"/>
+                <w:sz w:val="17"/>
+              </w:rPr>
+              <w:t>RECONSTRUCCIÓN CANCHA MUNICIPAL SAN VÍCTOR, PROVINCIA ESPAILLAT</w:t>
+              <w:br/>
+              <w:t>SNIP 17121 · Ficha 8790</w:t>
+              <w:br/>
+              <w:t>Ubicación: perfil oficial</w:t>
+            </w:r>
+          </w:p>
+        </w:tc>
+        <w:tc>
+          <w:tcPr>
+            <w:tcW w:type="dxa" w:w="1980"/>
+            <w:shd w:fill="F7F9F9"/>
+            <w:vAlign w:val="top"/>
+            <w:tcMar>
+              <w:top w:w="80" w:type="dxa"/>
+              <w:start w:w="120" w:type="dxa"/>
+              <w:bottom w:w="80" w:type="dxa"/>
+              <w:end w:w="120" w:type="dxa"/>
+            </w:tcMar>
+          </w:tcPr>
+          <w:p>
+            <w:pPr>
+              <w:spacing w:after="0"/>
+            </w:pPr>
+            <w:r>
+              <w:rPr>
+                <w:rFonts w:ascii="Calibri" w:hAnsi="Calibri" w:eastAsia="Calibri"/>
+                <w:b w:val="0"/>
+                <w:i w:val="0"/>
+                <w:color w:val="203740"/>
+                <w:sz w:val="17"/>
+              </w:rPr>
+              <w:t>MINISTERIO DE DEPORTES Y RECREACIÓN</w:t>
+            </w:r>
+          </w:p>
+        </w:tc>
+        <w:tc>
+          <w:tcPr>
+            <w:tcW w:type="dxa" w:w="1500"/>
+            <w:shd w:fill="F7F9F9"/>
+            <w:vAlign w:val="top"/>
+            <w:tcMar>
+              <w:top w:w="80" w:type="dxa"/>
+              <w:start w:w="120" w:type="dxa"/>
+              <w:bottom w:w="80" w:type="dxa"/>
+              <w:end w:w="120" w:type="dxa"/>
+            </w:tcMar>
+          </w:tcPr>
+          <w:p>
+            <w:pPr>
+              <w:spacing w:after="0"/>
+            </w:pPr>
+            <w:r>
+              <w:rPr>
+                <w:rFonts w:ascii="Calibri" w:hAnsi="Calibri" w:eastAsia="Calibri"/>
+                <w:b w:val="0"/>
+                <w:i w:val="0"/>
+                <w:color w:val="203740"/>
+                <w:sz w:val="17"/>
+              </w:rPr>
+              <w:t>En ejecución</w:t>
+              <w:br/>
+              <w:t>2026–2027</w:t>
+            </w:r>
+          </w:p>
+        </w:tc>
+        <w:tc>
+          <w:tcPr>
+            <w:tcW w:type="dxa" w:w="1170"/>
+            <w:shd w:fill="F7F9F9"/>
+            <w:vAlign w:val="top"/>
+            <w:tcMar>
+              <w:top w:w="80" w:type="dxa"/>
+              <w:start w:w="120" w:type="dxa"/>
+              <w:bottom w:w="80" w:type="dxa"/>
+              <w:end w:w="120" w:type="dxa"/>
+            </w:tcMar>
+          </w:tcPr>
+          <w:p>
+            <w:pPr>
+              <w:spacing w:after="0"/>
+            </w:pPr>
+            <w:r>
+              <w:rPr>
+                <w:rFonts w:ascii="Calibri" w:hAnsi="Calibri" w:eastAsia="Calibri"/>
+                <w:b w:val="0"/>
+                <w:i w:val="0"/>
+                <w:color w:val="203740"/>
+                <w:sz w:val="17"/>
+              </w:rPr>
+              <w:t>19,649,150</w:t>
+            </w:r>
+          </w:p>
+        </w:tc>
+        <w:tc>
+          <w:tcPr>
+            <w:tcW w:type="dxa" w:w="1170"/>
+            <w:shd w:fill="F7F9F9"/>
+            <w:vAlign w:val="top"/>
+            <w:tcMar>
+              <w:top w:w="80" w:type="dxa"/>
+              <w:start w:w="120" w:type="dxa"/>
+              <w:bottom w:w="80" w:type="dxa"/>
+              <w:end w:w="120" w:type="dxa"/>
+            </w:tcMar>
+          </w:tcPr>
+          <w:p>
+            <w:pPr>
+              <w:spacing w:after="0"/>
+            </w:pPr>
+            <w:r>
+              <w:rPr>
+                <w:rFonts w:ascii="Calibri" w:hAnsi="Calibri" w:eastAsia="Calibri"/>
+                <w:b w:val="0"/>
+                <w:i w:val="0"/>
+                <w:color w:val="203740"/>
+                <w:sz w:val="17"/>
+              </w:rPr>
+              <w:t>6,036,214</w:t>
+            </w:r>
+          </w:p>
+        </w:tc>
+      </w:tr>
+    </w:tbl>
+    <w:p>
+      <w:pPr>
+        <w:spacing w:after="0"/>
+      </w:pPr>
+    </w:p>
+    <w:p>
+      <w:pPr>
+        <w:pStyle w:val="Heading1"/>
+      </w:pPr>
+      <w:r>
+        <w:t>6. Plan de acción a acordar por el CDM</w:t>
       </w:r>
     </w:p>
     <w:p>
@@ -4991,6 +7419,285 @@
                 <w:sz w:val="17"/>
               </w:rPr>
               <w:t>Alta</w:t>
+            </w:r>
+          </w:p>
+        </w:tc>
+      </w:tr>
+      <w:tr>
+        <w:tc>
+          <w:tcPr>
+            <w:tcW w:type="dxa" w:w="1300"/>
+            <w:shd w:fill="F7F9F9"/>
+            <w:vAlign w:val="top"/>
+            <w:tcMar>
+              <w:top w:w="80" w:type="dxa"/>
+              <w:start w:w="120" w:type="dxa"/>
+              <w:bottom w:w="80" w:type="dxa"/>
+              <w:end w:w="120" w:type="dxa"/>
+            </w:tcMar>
+          </w:tcPr>
+          <w:p>
+            <w:pPr>
+              <w:spacing w:after="0"/>
+            </w:pPr>
+            <w:r>
+              <w:rPr>
+                <w:rFonts w:ascii="Calibri" w:hAnsi="Calibri" w:eastAsia="Calibri"/>
+                <w:b w:val="0"/>
+                <w:i w:val="0"/>
+                <w:color w:val="203740"/>
+                <w:sz w:val="17"/>
+              </w:rPr>
+              <w:t>MAPA-IP</w:t>
+            </w:r>
+          </w:p>
+        </w:tc>
+        <w:tc>
+          <w:tcPr>
+            <w:tcW w:type="dxa" w:w="3300"/>
+            <w:shd w:fill="F7F9F9"/>
+            <w:vAlign w:val="top"/>
+            <w:tcMar>
+              <w:top w:w="80" w:type="dxa"/>
+              <w:start w:w="120" w:type="dxa"/>
+              <w:bottom w:w="80" w:type="dxa"/>
+              <w:end w:w="120" w:type="dxa"/>
+            </w:tcMar>
+          </w:tcPr>
+          <w:p>
+            <w:pPr>
+              <w:spacing w:after="0"/>
+            </w:pPr>
+            <w:r>
+              <w:rPr>
+                <w:rFonts w:ascii="Calibri" w:hAnsi="Calibri" w:eastAsia="Calibri"/>
+                <w:b w:val="0"/>
+                <w:i w:val="0"/>
+                <w:color w:val="203740"/>
+                <w:sz w:val="17"/>
+              </w:rPr>
+              <w:t>MapaInversiones: datos abiertos y perfiles de proyectos</w:t>
+            </w:r>
+          </w:p>
+        </w:tc>
+        <w:tc>
+          <w:tcPr>
+            <w:tcW w:type="dxa" w:w="1300"/>
+            <w:shd w:fill="F7F9F9"/>
+            <w:vAlign w:val="top"/>
+            <w:tcMar>
+              <w:top w:w="80" w:type="dxa"/>
+              <w:start w:w="120" w:type="dxa"/>
+              <w:bottom w:w="80" w:type="dxa"/>
+              <w:end w:w="120" w:type="dxa"/>
+            </w:tcMar>
+          </w:tcPr>
+          <w:p>
+            <w:pPr>
+              <w:spacing w:after="0"/>
+            </w:pPr>
+            <w:r>
+              <w:rPr>
+                <w:rFonts w:ascii="Calibri" w:hAnsi="Calibri" w:eastAsia="Calibri"/>
+                <w:b w:val="0"/>
+                <w:i w:val="0"/>
+                <w:color w:val="203740"/>
+                <w:sz w:val="17"/>
+              </w:rPr>
+              <w:t>2026</w:t>
+            </w:r>
+          </w:p>
+        </w:tc>
+        <w:tc>
+          <w:tcPr>
+            <w:tcW w:type="dxa" w:w="2200"/>
+            <w:shd w:fill="F7F9F9"/>
+            <w:vAlign w:val="top"/>
+            <w:tcMar>
+              <w:top w:w="80" w:type="dxa"/>
+              <w:start w:w="120" w:type="dxa"/>
+              <w:bottom w:w="80" w:type="dxa"/>
+              <w:end w:w="120" w:type="dxa"/>
+            </w:tcMar>
+          </w:tcPr>
+          <w:p>
+            <w:pPr>
+              <w:spacing w:after="0"/>
+            </w:pPr>
+            <w:r>
+              <w:rPr>
+                <w:rFonts w:ascii="Calibri" w:hAnsi="Calibri" w:eastAsia="Calibri"/>
+                <w:b w:val="0"/>
+                <w:i w:val="0"/>
+                <w:color w:val="203740"/>
+                <w:sz w:val="17"/>
+              </w:rPr>
+              <w:t>2 proyectos con alcance municipal específico; corte 2026-08-02</w:t>
+            </w:r>
+          </w:p>
+        </w:tc>
+        <w:tc>
+          <w:tcPr>
+            <w:tcW w:type="dxa" w:w="1260"/>
+            <w:shd w:fill="F7F9F9"/>
+            <w:vAlign w:val="top"/>
+            <w:tcMar>
+              <w:top w:w="80" w:type="dxa"/>
+              <w:start w:w="120" w:type="dxa"/>
+              <w:bottom w:w="80" w:type="dxa"/>
+              <w:end w:w="120" w:type="dxa"/>
+            </w:tcMar>
+          </w:tcPr>
+          <w:p>
+            <w:pPr>
+              <w:spacing w:after="0"/>
+            </w:pPr>
+            <w:r>
+              <w:rPr>
+                <w:rFonts w:ascii="Calibri" w:hAnsi="Calibri" w:eastAsia="Calibri"/>
+                <w:b w:val="0"/>
+                <w:i w:val="0"/>
+                <w:color w:val="203740"/>
+                <w:sz w:val="17"/>
+              </w:rPr>
+              <w:t>Alta si perfil oficial; media si nombre del proyecto</w:t>
+            </w:r>
+          </w:p>
+        </w:tc>
+      </w:tr>
+      <w:tr>
+        <w:tc>
+          <w:tcPr>
+            <w:tcW w:type="dxa" w:w="1300"/>
+            <w:vAlign w:val="top"/>
+            <w:tcMar>
+              <w:top w:w="80" w:type="dxa"/>
+              <w:start w:w="120" w:type="dxa"/>
+              <w:bottom w:w="80" w:type="dxa"/>
+              <w:end w:w="120" w:type="dxa"/>
+            </w:tcMar>
+          </w:tcPr>
+          <w:p>
+            <w:pPr>
+              <w:spacing w:after="0"/>
+            </w:pPr>
+            <w:r>
+              <w:rPr>
+                <w:rFonts w:ascii="Calibri" w:hAnsi="Calibri" w:eastAsia="Calibri"/>
+                <w:b w:val="0"/>
+                <w:i w:val="0"/>
+                <w:color w:val="203740"/>
+                <w:sz w:val="17"/>
+              </w:rPr>
+              <w:t>DASH-TERR</w:t>
+            </w:r>
+          </w:p>
+        </w:tc>
+        <w:tc>
+          <w:tcPr>
+            <w:tcW w:type="dxa" w:w="3300"/>
+            <w:vAlign w:val="top"/>
+            <w:tcMar>
+              <w:top w:w="80" w:type="dxa"/>
+              <w:start w:w="120" w:type="dxa"/>
+              <w:bottom w:w="80" w:type="dxa"/>
+              <w:end w:w="120" w:type="dxa"/>
+            </w:tcMar>
+          </w:tcPr>
+          <w:p>
+            <w:pPr>
+              <w:spacing w:after="0"/>
+            </w:pPr>
+            <w:r>
+              <w:rPr>
+                <w:rFonts w:ascii="Calibri" w:hAnsi="Calibri" w:eastAsia="Calibri"/>
+                <w:b w:val="0"/>
+                <w:i w:val="0"/>
+                <w:color w:val="203740"/>
+                <w:sz w:val="17"/>
+              </w:rPr>
+              <w:t>DDPT Dashboard Territorial: indicadores administrativos y comparación territorial</w:t>
+            </w:r>
+          </w:p>
+        </w:tc>
+        <w:tc>
+          <w:tcPr>
+            <w:tcW w:type="dxa" w:w="1300"/>
+            <w:vAlign w:val="top"/>
+            <w:tcMar>
+              <w:top w:w="80" w:type="dxa"/>
+              <w:start w:w="120" w:type="dxa"/>
+              <w:bottom w:w="80" w:type="dxa"/>
+              <w:end w:w="120" w:type="dxa"/>
+            </w:tcMar>
+          </w:tcPr>
+          <w:p>
+            <w:pPr>
+              <w:spacing w:after="0"/>
+            </w:pPr>
+            <w:r>
+              <w:rPr>
+                <w:rFonts w:ascii="Calibri" w:hAnsi="Calibri" w:eastAsia="Calibri"/>
+                <w:b w:val="0"/>
+                <w:i w:val="0"/>
+                <w:color w:val="203740"/>
+                <w:sz w:val="17"/>
+              </w:rPr>
+              <w:t>2026-08-01</w:t>
+            </w:r>
+          </w:p>
+        </w:tc>
+        <w:tc>
+          <w:tcPr>
+            <w:tcW w:type="dxa" w:w="2200"/>
+            <w:vAlign w:val="top"/>
+            <w:tcMar>
+              <w:top w:w="80" w:type="dxa"/>
+              <w:start w:w="120" w:type="dxa"/>
+              <w:bottom w:w="80" w:type="dxa"/>
+              <w:end w:w="120" w:type="dxa"/>
+            </w:tcMar>
+          </w:tcPr>
+          <w:p>
+            <w:pPr>
+              <w:spacing w:after="0"/>
+            </w:pPr>
+            <w:r>
+              <w:rPr>
+                <w:rFonts w:ascii="Calibri" w:hAnsi="Calibri" w:eastAsia="Calibri"/>
+                <w:b w:val="0"/>
+                <w:i w:val="0"/>
+                <w:color w:val="203740"/>
+                <w:sz w:val="17"/>
+              </w:rPr>
+              <w:t>Dataset municipal y provincial; ámbito rotulado en cada indicador</w:t>
+            </w:r>
+          </w:p>
+        </w:tc>
+        <w:tc>
+          <w:tcPr>
+            <w:tcW w:type="dxa" w:w="1260"/>
+            <w:vAlign w:val="top"/>
+            <w:tcMar>
+              <w:top w:w="80" w:type="dxa"/>
+              <w:start w:w="120" w:type="dxa"/>
+              <w:bottom w:w="80" w:type="dxa"/>
+              <w:end w:w="120" w:type="dxa"/>
+            </w:tcMar>
+          </w:tcPr>
+          <w:p>
+            <w:pPr>
+              <w:spacing w:after="0"/>
+            </w:pPr>
+            <w:r>
+              <w:rPr>
+                <w:rFonts w:ascii="Calibri" w:hAnsi="Calibri" w:eastAsia="Calibri"/>
+                <w:b w:val="0"/>
+                <w:i w:val="0"/>
+                <w:color w:val="203740"/>
+                <w:sz w:val="17"/>
+              </w:rPr>
+              <w:t>Alta / según fuente oficial enlazada</w:t>
             </w:r>
           </w:p>
         </w:tc>
@@ -6471,7 +9178,7 @@
                 <w:color w:val="203740"/>
                 <w:sz w:val="17"/>
               </w:rPr>
-              <w:t>2026-07-28</w:t>
+              <w:t>2026-08-02</w:t>
             </w:r>
           </w:p>
         </w:tc>

</xml_diff>

<commit_message>
Add complete municipal public investment data to PMD documents
</commit_message>
<xml_diff>
--- a/public/downloads/pmd-borradores/01090005_PMD_san-victor_Borrador_Tecnico_2025-2028.docx
+++ b/public/downloads/pmd-borradores/01090005_PMD_san-victor_Borrador_Tecnico_2025-2028.docx
@@ -476,7 +476,7 @@
                 <w:color w:val="203740"/>
                 <w:sz w:val="17"/>
               </w:rPr>
-              <w:t>Inversión pública: proyectos en ejecución o reprogramados identificados específicamente para el municipio en MapaInversiones.</w:t>
+              <w:t>Inversión pública: cartera completa de proyectos asignados específicamente al municipio en MapaInversiones, con presupuesto, ejecución, avances, contratos y trazabilidad.</w:t>
             </w:r>
           </w:p>
         </w:tc>
@@ -6339,7 +6339,7 @@
     </w:p>
     <w:p>
       <w:r>
-        <w:t>Con corte al 2026-08-02, MapaInversiones registra 2 proyectos en ejecución o reprogramados con identificación territorial específica para San Víctor. La programación presupuestaria 2026 asociada suma RD$ 124,649,182 y la ejecución registrada suma RD$ 110,094,432. Estos proyectos pertenecen a instituciones públicas y no constituyen por sí mismos acuerdos, compromisos ni proyectos aprobados por el CDM o el ayuntamiento.</w:t>
+        <w:t>Con corte al 2026-08-02, MapaInversiones registra 2 proyectos con identificación territorial específica para San Víctor. El costo total publicado de la cartera suma RD$ 237,658,503; la asignación presupuestaria 2026 suma RD$ 124,649,182 y la ejecución registrada suma RD$ 110,094,432, equivalente a 88.3%. Estados publicados: EJECUCIÓN: 2. Estos proyectos pertenecen a instituciones públicas y no constituyen por sí mismos acuerdos, compromisos ni proyectos aprobados por el CDM o el ayuntamiento.</w:t>
       </w:r>
     </w:p>
     <w:p>
@@ -6354,7 +6354,15 @@
           <w:color w:val="5E7076"/>
           <w:sz w:val="17"/>
         </w:rPr>
-        <w:t>Fuente: MapaInversiones, datos abiertos 2026 y perfiles oficiales de proyectos, https://mapainversiones.gob.do/. Se incluyen únicamente proyectos con alcance municipal específico y estado EJECUCIÓN o REPROGRAMAR; los proyectos nacionales o provinciales sin municipio confirmado no se asignan artificialmente. Los importes se presentan en pesos dominicanos nominales, exactamente en la unidad publicada por la fuente y sin aplicar multiplicadores; los valores inusualmente bajos deben confirmarse en el perfil oficial.</w:t>
+        <w:t>Fuente: MapaInversiones, datos abiertos 2026 y perfiles oficiales de proyectos, https://mapainversiones.gob.do/. Se incluyen todos los proyectos del universo 2026 con alcance municipal específico, sin excluir estados publicados como DESCONOCIDO o PARALIZADO. Los proyectos nacionales o provinciales sin municipio confirmado no se asignan artificialmente. Los importes se presentan en pesos dominicanos nominales, exactamente en la unidad publicada por la fuente y sin aplicar multiplicadores; los valores inusualmente bajos deben confirmarse en el perfil oficial.</w:t>
+      </w:r>
+    </w:p>
+    <w:p>
+      <w:pPr>
+        <w:pStyle w:val="Heading2"/>
+      </w:pPr>
+      <w:r>
+        <w:t>5.1 Cartera completa asignada al municipio</w:t>
       </w:r>
     </w:p>
     <w:tbl>
@@ -6374,11 +6382,11 @@
         </w:tblBorders>
       </w:tblPr>
       <w:tblGrid>
-        <w:gridCol w:w="3540"/>
-        <w:gridCol w:w="1980"/>
-        <w:gridCol w:w="1500"/>
-        <w:gridCol w:w="1170"/>
-        <w:gridCol w:w="1170"/>
+        <w:gridCol w:w="500"/>
+        <w:gridCol w:w="1200"/>
+        <w:gridCol w:w="3700"/>
+        <w:gridCol w:w="1300"/>
+        <w:gridCol w:w="2660"/>
       </w:tblGrid>
       <w:tr>
         <w:trPr>
@@ -6386,7 +6394,7 @@
         </w:trPr>
         <w:tc>
           <w:tcPr>
-            <w:tcW w:type="dxa" w:w="3540"/>
+            <w:tcW w:type="dxa" w:w="500"/>
             <w:tcMar>
               <w:top w:w="80" w:type="dxa"/>
               <w:start w:w="120" w:type="dxa"/>
@@ -6408,13 +6416,13 @@
                 <w:color w:val="FFFFFF"/>
                 <w:sz w:val="17"/>
               </w:rPr>
-              <w:t>Proyecto</w:t>
+              <w:t>N.º</w:t>
             </w:r>
           </w:p>
         </w:tc>
         <w:tc>
           <w:tcPr>
-            <w:tcW w:type="dxa" w:w="1980"/>
+            <w:tcW w:type="dxa" w:w="1200"/>
             <w:tcMar>
               <w:top w:w="80" w:type="dxa"/>
               <w:start w:w="120" w:type="dxa"/>
@@ -6436,13 +6444,41 @@
                 <w:color w:val="FFFFFF"/>
                 <w:sz w:val="17"/>
               </w:rPr>
-              <w:t>Institución</w:t>
+              <w:t>Identificación</w:t>
             </w:r>
           </w:p>
         </w:tc>
         <w:tc>
           <w:tcPr>
-            <w:tcW w:type="dxa" w:w="1500"/>
+            <w:tcW w:type="dxa" w:w="3700"/>
+            <w:tcMar>
+              <w:top w:w="80" w:type="dxa"/>
+              <w:start w:w="120" w:type="dxa"/>
+              <w:bottom w:w="80" w:type="dxa"/>
+              <w:end w:w="120" w:type="dxa"/>
+            </w:tcMar>
+            <w:shd w:fill="203740"/>
+            <w:vAlign w:val="center"/>
+          </w:tcPr>
+          <w:p>
+            <w:pPr>
+              <w:spacing w:after="0"/>
+            </w:pPr>
+            <w:r>
+              <w:rPr>
+                <w:rFonts w:ascii="Calibri" w:hAnsi="Calibri" w:eastAsia="Calibri"/>
+                <w:b/>
+                <w:i w:val="0"/>
+                <w:color w:val="FFFFFF"/>
+                <w:sz w:val="17"/>
+              </w:rPr>
+              <w:t>Proyecto / institución</w:t>
+            </w:r>
+          </w:p>
+        </w:tc>
+        <w:tc>
+          <w:tcPr>
+            <w:tcW w:type="dxa" w:w="1300"/>
             <w:tcMar>
               <w:top w:w="80" w:type="dxa"/>
               <w:start w:w="120" w:type="dxa"/>
@@ -6470,7 +6506,7 @@
         </w:tc>
         <w:tc>
           <w:tcPr>
-            <w:tcW w:type="dxa" w:w="1170"/>
+            <w:tcW w:type="dxa" w:w="2660"/>
             <w:tcMar>
               <w:top w:w="80" w:type="dxa"/>
               <w:start w:w="120" w:type="dxa"/>
@@ -6492,21 +6528,22 @@
                 <w:color w:val="FFFFFF"/>
                 <w:sz w:val="17"/>
               </w:rPr>
-              <w:t>Asignación 2026 (RD$)</w:t>
+              <w:t>Presupuesto 2026 (RD$)</w:t>
             </w:r>
           </w:p>
         </w:tc>
+      </w:tr>
+      <w:tr>
         <w:tc>
           <w:tcPr>
-            <w:tcW w:type="dxa" w:w="1170"/>
+            <w:tcW w:type="dxa" w:w="500"/>
+            <w:vAlign w:val="top"/>
             <w:tcMar>
               <w:top w:w="80" w:type="dxa"/>
               <w:start w:w="120" w:type="dxa"/>
               <w:bottom w:w="80" w:type="dxa"/>
               <w:end w:w="120" w:type="dxa"/>
             </w:tcMar>
-            <w:shd w:fill="203740"/>
-            <w:vAlign w:val="center"/>
           </w:tcPr>
           <w:p>
             <w:pPr>
@@ -6515,20 +6552,47 @@
             <w:r>
               <w:rPr>
                 <w:rFonts w:ascii="Calibri" w:hAnsi="Calibri" w:eastAsia="Calibri"/>
-                <w:b/>
+                <w:b w:val="0"/>
                 <w:i w:val="0"/>
-                <w:color w:val="FFFFFF"/>
+                <w:color w:val="203740"/>
                 <w:sz w:val="17"/>
               </w:rPr>
-              <w:t>Ejecutado 2026 (RD$)</w:t>
+              <w:t>1</w:t>
             </w:r>
           </w:p>
         </w:tc>
-      </w:tr>
-      <w:tr>
         <w:tc>
           <w:tcPr>
-            <w:tcW w:type="dxa" w:w="3540"/>
+            <w:tcW w:type="dxa" w:w="1200"/>
+            <w:vAlign w:val="top"/>
+            <w:tcMar>
+              <w:top w:w="80" w:type="dxa"/>
+              <w:start w:w="120" w:type="dxa"/>
+              <w:bottom w:w="80" w:type="dxa"/>
+              <w:end w:w="120" w:type="dxa"/>
+            </w:tcMar>
+          </w:tcPr>
+          <w:p>
+            <w:pPr>
+              <w:spacing w:after="0"/>
+            </w:pPr>
+            <w:r>
+              <w:rPr>
+                <w:rFonts w:ascii="Calibri" w:hAnsi="Calibri" w:eastAsia="Calibri"/>
+                <w:b w:val="0"/>
+                <w:i w:val="0"/>
+                <w:color w:val="203740"/>
+                <w:sz w:val="17"/>
+              </w:rPr>
+              <w:t>SNIP 15804</w:t>
+              <w:br/>
+              <w:t>Ficha 6172</w:t>
+            </w:r>
+          </w:p>
+        </w:tc>
+        <w:tc>
+          <w:tcPr>
+            <w:tcW w:type="dxa" w:w="3700"/>
             <w:vAlign w:val="top"/>
             <w:tcMar>
               <w:top w:w="80" w:type="dxa"/>
@@ -6551,15 +6615,13 @@
               </w:rPr>
               <w:t>RECONSTRUCCIÓN DE LA INFRAESTRUCTURA VIAL URBANA DEL MUNICIPIO SAN VICTOR, PROVINCIA ESPAILLAT</w:t>
               <w:br/>
-              <w:t>SNIP 15804 · Ficha 6172</w:t>
-              <w:br/>
-              <w:t>Ubicación: perfil oficial</w:t>
+              <w:t>Institución: MINISTERIO DE OBRAS PUBLICAS Y COMUNICACIONES</w:t>
             </w:r>
           </w:p>
         </w:tc>
         <w:tc>
           <w:tcPr>
-            <w:tcW w:type="dxa" w:w="1980"/>
+            <w:tcW w:type="dxa" w:w="1300"/>
             <w:vAlign w:val="top"/>
             <w:tcMar>
               <w:top w:w="80" w:type="dxa"/>
@@ -6580,13 +6642,15 @@
                 <w:color w:val="203740"/>
                 <w:sz w:val="17"/>
               </w:rPr>
-              <w:t>MINISTERIO DE OBRAS PUBLICAS Y COMUNICACIONES</w:t>
+              <w:t>EJECUCIÓN</w:t>
+              <w:br/>
+              <w:t>2023-01-01–2027-01-31</w:t>
             </w:r>
           </w:p>
         </w:tc>
         <w:tc>
           <w:tcPr>
-            <w:tcW w:type="dxa" w:w="1500"/>
+            <w:tcW w:type="dxa" w:w="2660"/>
             <w:vAlign w:val="top"/>
             <w:tcMar>
               <w:top w:w="80" w:type="dxa"/>
@@ -6607,15 +6671,20 @@
                 <w:color w:val="203740"/>
                 <w:sz w:val="17"/>
               </w:rPr>
-              <w:t>En ejecución</w:t>
+              <w:t>Asignación: 105,000,032</w:t>
               <w:br/>
-              <w:t>2023–2027</w:t>
+              <w:t>Ejecutado: 104,058,217</w:t>
+              <w:br/>
+              <w:t>Tasa: 99.1%</w:t>
             </w:r>
           </w:p>
         </w:tc>
+      </w:tr>
+      <w:tr>
         <w:tc>
           <w:tcPr>
-            <w:tcW w:type="dxa" w:w="1170"/>
+            <w:tcW w:type="dxa" w:w="500"/>
+            <w:shd w:fill="F7F9F9"/>
             <w:vAlign w:val="top"/>
             <w:tcMar>
               <w:top w:w="80" w:type="dxa"/>
@@ -6636,13 +6705,14 @@
                 <w:color w:val="203740"/>
                 <w:sz w:val="17"/>
               </w:rPr>
-              <w:t>105,000,032</w:t>
+              <w:t>2</w:t>
             </w:r>
           </w:p>
         </w:tc>
         <w:tc>
           <w:tcPr>
-            <w:tcW w:type="dxa" w:w="1170"/>
+            <w:tcW w:type="dxa" w:w="1200"/>
+            <w:shd w:fill="F7F9F9"/>
             <w:vAlign w:val="top"/>
             <w:tcMar>
               <w:top w:w="80" w:type="dxa"/>
@@ -6663,15 +6733,15 @@
                 <w:color w:val="203740"/>
                 <w:sz w:val="17"/>
               </w:rPr>
-              <w:t>104,058,217</w:t>
+              <w:t>SNIP 17121</w:t>
+              <w:br/>
+              <w:t>Ficha 8790</w:t>
             </w:r>
           </w:p>
         </w:tc>
-      </w:tr>
-      <w:tr>
         <w:tc>
           <w:tcPr>
-            <w:tcW w:type="dxa" w:w="3540"/>
+            <w:tcW w:type="dxa" w:w="3700"/>
             <w:shd w:fill="F7F9F9"/>
             <w:vAlign w:val="top"/>
             <w:tcMar>
@@ -6695,15 +6765,13 @@
               </w:rPr>
               <w:t>RECONSTRUCCIÓN CANCHA MUNICIPAL SAN VÍCTOR, PROVINCIA ESPAILLAT</w:t>
               <w:br/>
-              <w:t>SNIP 17121 · Ficha 8790</w:t>
-              <w:br/>
-              <w:t>Ubicación: perfil oficial</w:t>
+              <w:t>Institución: MINISTERIO DE DEPORTES Y RECREACIÓN</w:t>
             </w:r>
           </w:p>
         </w:tc>
         <w:tc>
           <w:tcPr>
-            <w:tcW w:type="dxa" w:w="1980"/>
+            <w:tcW w:type="dxa" w:w="1300"/>
             <w:shd w:fill="F7F9F9"/>
             <w:vAlign w:val="top"/>
             <w:tcMar>
@@ -6725,13 +6793,15 @@
                 <w:color w:val="203740"/>
                 <w:sz w:val="17"/>
               </w:rPr>
-              <w:t>MINISTERIO DE DEPORTES Y RECREACIÓN</w:t>
+              <w:t>EJECUCIÓN</w:t>
+              <w:br/>
+              <w:t>2026-01-01–2027-01-31</w:t>
             </w:r>
           </w:p>
         </w:tc>
         <w:tc>
           <w:tcPr>
-            <w:tcW w:type="dxa" w:w="1500"/>
+            <w:tcW w:type="dxa" w:w="2660"/>
             <w:shd w:fill="F7F9F9"/>
             <w:vAlign w:val="top"/>
             <w:tcMar>
@@ -6753,15 +6823,183 @@
                 <w:color w:val="203740"/>
                 <w:sz w:val="17"/>
               </w:rPr>
-              <w:t>En ejecución</w:t>
+              <w:t>Asignación: 19,649,150</w:t>
               <w:br/>
-              <w:t>2026–2027</w:t>
+              <w:t>Ejecutado: 6,036,214</w:t>
+              <w:br/>
+              <w:t>Tasa: 30.7%</w:t>
+            </w:r>
+          </w:p>
+        </w:tc>
+      </w:tr>
+    </w:tbl>
+    <w:p>
+      <w:pPr>
+        <w:spacing w:after="0"/>
+      </w:pPr>
+    </w:p>
+    <w:p>
+      <w:pPr>
+        <w:pStyle w:val="Heading2"/>
+      </w:pPr>
+      <w:r>
+        <w:t>5.2 Fichas completas de los proyectos</w:t>
+      </w:r>
+    </w:p>
+    <w:p>
+      <w:r>
+        <w:t>Las fichas siguientes reproducen todos los campos disponibles en el dataset utilizado. La tasa de ejecución presupuestaria se calcula como ejecutado 2026 dividido entre la asignación 2026; los avances físico y financiero son los porcentajes publicados en el perfil.</w:t>
+      </w:r>
+    </w:p>
+    <w:p>
+      <w:pPr>
+        <w:pStyle w:val="Heading3"/>
+      </w:pPr>
+      <w:r>
+        <w:t>5.2.1 RECONSTRUCCIÓN DE LA INFRAESTRUCTURA VIAL URBANA DEL MUNICIPIO SAN VICTOR, PROVINCIA ESPAILLAT</w:t>
+      </w:r>
+    </w:p>
+    <w:tbl>
+      <w:tblPr>
+        <w:tblW w:type="dxa" w:w="9360"/>
+        <w:tblLayout w:type="fixed"/>
+        <w:tblLook w:firstColumn="1" w:firstRow="1" w:lastColumn="0" w:lastRow="0" w:noHBand="0" w:noVBand="1" w:val="04A0"/>
+        <w:jc w:val="center"/>
+        <w:tblInd w:w="120" w:type="dxa"/>
+        <w:tblBorders>
+          <w:top w:val="single" w:sz="5" w:color="D7E0E1"/>
+          <w:left w:val="single" w:sz="5" w:color="D7E0E1"/>
+          <w:bottom w:val="single" w:sz="5" w:color="D7E0E1"/>
+          <w:right w:val="single" w:sz="5" w:color="D7E0E1"/>
+          <w:insideH w:val="single" w:sz="5" w:color="D7E0E1"/>
+          <w:insideV w:val="single" w:sz="5" w:color="D7E0E1"/>
+        </w:tblBorders>
+      </w:tblPr>
+      <w:tblGrid>
+        <w:gridCol w:w="2600"/>
+        <w:gridCol w:w="6760"/>
+      </w:tblGrid>
+      <w:tr>
+        <w:trPr>
+          <w:tblHeader w:val="true"/>
+        </w:trPr>
+        <w:tc>
+          <w:tcPr>
+            <w:tcW w:type="dxa" w:w="2600"/>
+            <w:tcMar>
+              <w:top w:w="80" w:type="dxa"/>
+              <w:start w:w="120" w:type="dxa"/>
+              <w:bottom w:w="80" w:type="dxa"/>
+              <w:end w:w="120" w:type="dxa"/>
+            </w:tcMar>
+            <w:shd w:fill="203740"/>
+            <w:vAlign w:val="center"/>
+          </w:tcPr>
+          <w:p>
+            <w:pPr>
+              <w:spacing w:after="0"/>
+            </w:pPr>
+            <w:r>
+              <w:rPr>
+                <w:rFonts w:ascii="Calibri" w:hAnsi="Calibri" w:eastAsia="Calibri"/>
+                <w:b/>
+                <w:i w:val="0"/>
+                <w:color w:val="FFFFFF"/>
+                <w:sz w:val="17"/>
+              </w:rPr>
+              <w:t>Campo</w:t>
             </w:r>
           </w:p>
         </w:tc>
         <w:tc>
           <w:tcPr>
-            <w:tcW w:type="dxa" w:w="1170"/>
+            <w:tcW w:type="dxa" w:w="6760"/>
+            <w:tcMar>
+              <w:top w:w="80" w:type="dxa"/>
+              <w:start w:w="120" w:type="dxa"/>
+              <w:bottom w:w="80" w:type="dxa"/>
+              <w:end w:w="120" w:type="dxa"/>
+            </w:tcMar>
+            <w:shd w:fill="203740"/>
+            <w:vAlign w:val="center"/>
+          </w:tcPr>
+          <w:p>
+            <w:pPr>
+              <w:spacing w:after="0"/>
+            </w:pPr>
+            <w:r>
+              <w:rPr>
+                <w:rFonts w:ascii="Calibri" w:hAnsi="Calibri" w:eastAsia="Calibri"/>
+                <w:b/>
+                <w:i w:val="0"/>
+                <w:color w:val="FFFFFF"/>
+                <w:sz w:val="17"/>
+              </w:rPr>
+              <w:t>Dato publicado</w:t>
+            </w:r>
+          </w:p>
+        </w:tc>
+      </w:tr>
+      <w:tr>
+        <w:tc>
+          <w:tcPr>
+            <w:tcW w:type="dxa" w:w="2600"/>
+            <w:vAlign w:val="top"/>
+            <w:tcMar>
+              <w:top w:w="80" w:type="dxa"/>
+              <w:start w:w="120" w:type="dxa"/>
+              <w:bottom w:w="80" w:type="dxa"/>
+              <w:end w:w="120" w:type="dxa"/>
+            </w:tcMar>
+          </w:tcPr>
+          <w:p>
+            <w:pPr>
+              <w:spacing w:after="0"/>
+            </w:pPr>
+            <w:r>
+              <w:rPr>
+                <w:rFonts w:ascii="Calibri" w:hAnsi="Calibri" w:eastAsia="Calibri"/>
+                <w:b w:val="0"/>
+                <w:i w:val="0"/>
+                <w:color w:val="203740"/>
+                <w:sz w:val="17"/>
+              </w:rPr>
+              <w:t>Nombre del proyecto</w:t>
+            </w:r>
+          </w:p>
+        </w:tc>
+        <w:tc>
+          <w:tcPr>
+            <w:tcW w:type="dxa" w:w="6760"/>
+            <w:vAlign w:val="top"/>
+            <w:tcMar>
+              <w:top w:w="80" w:type="dxa"/>
+              <w:start w:w="120" w:type="dxa"/>
+              <w:bottom w:w="80" w:type="dxa"/>
+              <w:end w:w="120" w:type="dxa"/>
+            </w:tcMar>
+          </w:tcPr>
+          <w:p>
+            <w:pPr>
+              <w:spacing w:after="0"/>
+            </w:pPr>
+            <w:r>
+              <w:rPr>
+                <w:rFonts w:ascii="Calibri" w:hAnsi="Calibri" w:eastAsia="Calibri"/>
+                <w:b w:val="0"/>
+                <w:i w:val="0"/>
+                <w:color w:val="203740"/>
+                <w:sz w:val="17"/>
+              </w:rPr>
+              <w:t>RECONSTRUCCIÓN DE LA INFRAESTRUCTURA VIAL URBANA DEL MUNICIPIO SAN VICTOR, PROVINCIA ESPAILLAT</w:t>
+            </w:r>
+          </w:p>
+        </w:tc>
+      </w:tr>
+      <w:tr>
+        <w:tc>
+          <w:tcPr>
+            <w:tcW w:type="dxa" w:w="2600"/>
             <w:shd w:fill="F7F9F9"/>
             <w:vAlign w:val="top"/>
             <w:tcMar>
@@ -6783,13 +7021,13 @@
                 <w:color w:val="203740"/>
                 <w:sz w:val="17"/>
               </w:rPr>
-              <w:t>19,649,150</w:t>
+              <w:t>Identificación</w:t>
             </w:r>
           </w:p>
         </w:tc>
         <w:tc>
           <w:tcPr>
-            <w:tcW w:type="dxa" w:w="1170"/>
+            <w:tcW w:type="dxa" w:w="6760"/>
             <w:shd w:fill="F7F9F9"/>
             <w:vAlign w:val="top"/>
             <w:tcMar>
@@ -6811,7 +7049,1812 @@
                 <w:color w:val="203740"/>
                 <w:sz w:val="17"/>
               </w:rPr>
-              <w:t>6,036,214</w:t>
+              <w:t>SNIP: 15804; Ficha MapaInversiones: 6172</w:t>
+            </w:r>
+          </w:p>
+        </w:tc>
+      </w:tr>
+      <w:tr>
+        <w:tc>
+          <w:tcPr>
+            <w:tcW w:type="dxa" w:w="2600"/>
+            <w:vAlign w:val="top"/>
+            <w:tcMar>
+              <w:top w:w="80" w:type="dxa"/>
+              <w:start w:w="120" w:type="dxa"/>
+              <w:bottom w:w="80" w:type="dxa"/>
+              <w:end w:w="120" w:type="dxa"/>
+            </w:tcMar>
+          </w:tcPr>
+          <w:p>
+            <w:pPr>
+              <w:spacing w:after="0"/>
+            </w:pPr>
+            <w:r>
+              <w:rPr>
+                <w:rFonts w:ascii="Calibri" w:hAnsi="Calibri" w:eastAsia="Calibri"/>
+                <w:b w:val="0"/>
+                <w:i w:val="0"/>
+                <w:color w:val="203740"/>
+                <w:sz w:val="17"/>
+              </w:rPr>
+              <w:t>Estado y seguimiento</w:t>
+            </w:r>
+          </w:p>
+        </w:tc>
+        <w:tc>
+          <w:tcPr>
+            <w:tcW w:type="dxa" w:w="6760"/>
+            <w:vAlign w:val="top"/>
+            <w:tcMar>
+              <w:top w:w="80" w:type="dxa"/>
+              <w:start w:w="120" w:type="dxa"/>
+              <w:bottom w:w="80" w:type="dxa"/>
+              <w:end w:w="120" w:type="dxa"/>
+            </w:tcMar>
+          </w:tcPr>
+          <w:p>
+            <w:pPr>
+              <w:spacing w:after="0"/>
+            </w:pPr>
+            <w:r>
+              <w:rPr>
+                <w:rFonts w:ascii="Calibri" w:hAnsi="Calibri" w:eastAsia="Calibri"/>
+                <w:b w:val="0"/>
+                <w:i w:val="0"/>
+                <w:color w:val="203740"/>
+                <w:sz w:val="17"/>
+              </w:rPr>
+              <w:t>Estado: EJECUCIÓN; seguimiento: Ejecución y contrato activo</w:t>
+            </w:r>
+          </w:p>
+        </w:tc>
+      </w:tr>
+      <w:tr>
+        <w:tc>
+          <w:tcPr>
+            <w:tcW w:type="dxa" w:w="2600"/>
+            <w:shd w:fill="F7F9F9"/>
+            <w:vAlign w:val="top"/>
+            <w:tcMar>
+              <w:top w:w="80" w:type="dxa"/>
+              <w:start w:w="120" w:type="dxa"/>
+              <w:bottom w:w="80" w:type="dxa"/>
+              <w:end w:w="120" w:type="dxa"/>
+            </w:tcMar>
+          </w:tcPr>
+          <w:p>
+            <w:pPr>
+              <w:spacing w:after="0"/>
+            </w:pPr>
+            <w:r>
+              <w:rPr>
+                <w:rFonts w:ascii="Calibri" w:hAnsi="Calibri" w:eastAsia="Calibri"/>
+                <w:b w:val="0"/>
+                <w:i w:val="0"/>
+                <w:color w:val="203740"/>
+                <w:sz w:val="17"/>
+              </w:rPr>
+              <w:t>Institución ejecutora</w:t>
+            </w:r>
+          </w:p>
+        </w:tc>
+        <w:tc>
+          <w:tcPr>
+            <w:tcW w:type="dxa" w:w="6760"/>
+            <w:shd w:fill="F7F9F9"/>
+            <w:vAlign w:val="top"/>
+            <w:tcMar>
+              <w:top w:w="80" w:type="dxa"/>
+              <w:start w:w="120" w:type="dxa"/>
+              <w:bottom w:w="80" w:type="dxa"/>
+              <w:end w:w="120" w:type="dxa"/>
+            </w:tcMar>
+          </w:tcPr>
+          <w:p>
+            <w:pPr>
+              <w:spacing w:after="0"/>
+            </w:pPr>
+            <w:r>
+              <w:rPr>
+                <w:rFonts w:ascii="Calibri" w:hAnsi="Calibri" w:eastAsia="Calibri"/>
+                <w:b w:val="0"/>
+                <w:i w:val="0"/>
+                <w:color w:val="203740"/>
+                <w:sz w:val="17"/>
+              </w:rPr>
+              <w:t>Principal: MINISTERIO DE OBRAS PUBLICAS Y COMUNICACIONES. Registradas: MINISTERIO DE OBRAS PUBLICAS Y COMUNICACIONES</w:t>
+            </w:r>
+          </w:p>
+        </w:tc>
+      </w:tr>
+      <w:tr>
+        <w:tc>
+          <w:tcPr>
+            <w:tcW w:type="dxa" w:w="2600"/>
+            <w:vAlign w:val="top"/>
+            <w:tcMar>
+              <w:top w:w="80" w:type="dxa"/>
+              <w:start w:w="120" w:type="dxa"/>
+              <w:bottom w:w="80" w:type="dxa"/>
+              <w:end w:w="120" w:type="dxa"/>
+            </w:tcMar>
+          </w:tcPr>
+          <w:p>
+            <w:pPr>
+              <w:spacing w:after="0"/>
+            </w:pPr>
+            <w:r>
+              <w:rPr>
+                <w:rFonts w:ascii="Calibri" w:hAnsi="Calibri" w:eastAsia="Calibri"/>
+                <w:b w:val="0"/>
+                <w:i w:val="0"/>
+                <w:color w:val="203740"/>
+                <w:sz w:val="17"/>
+              </w:rPr>
+              <w:t>Sectores</w:t>
+            </w:r>
+          </w:p>
+        </w:tc>
+        <w:tc>
+          <w:tcPr>
+            <w:tcW w:type="dxa" w:w="6760"/>
+            <w:vAlign w:val="top"/>
+            <w:tcMar>
+              <w:top w:w="80" w:type="dxa"/>
+              <w:start w:w="120" w:type="dxa"/>
+              <w:bottom w:w="80" w:type="dxa"/>
+              <w:end w:w="120" w:type="dxa"/>
+            </w:tcMar>
+          </w:tcPr>
+          <w:p>
+            <w:pPr>
+              <w:spacing w:after="0"/>
+            </w:pPr>
+            <w:r>
+              <w:rPr>
+                <w:rFonts w:ascii="Calibri" w:hAnsi="Calibri" w:eastAsia="Calibri"/>
+                <w:b w:val="0"/>
+                <w:i w:val="0"/>
+                <w:color w:val="203740"/>
+                <w:sz w:val="17"/>
+              </w:rPr>
+              <w:t>Transporte</w:t>
+            </w:r>
+          </w:p>
+        </w:tc>
+      </w:tr>
+      <w:tr>
+        <w:tc>
+          <w:tcPr>
+            <w:tcW w:type="dxa" w:w="2600"/>
+            <w:shd w:fill="F7F9F9"/>
+            <w:vAlign w:val="top"/>
+            <w:tcMar>
+              <w:top w:w="80" w:type="dxa"/>
+              <w:start w:w="120" w:type="dxa"/>
+              <w:bottom w:w="80" w:type="dxa"/>
+              <w:end w:w="120" w:type="dxa"/>
+            </w:tcMar>
+          </w:tcPr>
+          <w:p>
+            <w:pPr>
+              <w:spacing w:after="0"/>
+            </w:pPr>
+            <w:r>
+              <w:rPr>
+                <w:rFonts w:ascii="Calibri" w:hAnsi="Calibri" w:eastAsia="Calibri"/>
+                <w:b w:val="0"/>
+                <w:i w:val="0"/>
+                <w:color w:val="203740"/>
+                <w:sz w:val="17"/>
+              </w:rPr>
+              <w:t>Período</w:t>
+            </w:r>
+          </w:p>
+        </w:tc>
+        <w:tc>
+          <w:tcPr>
+            <w:tcW w:type="dxa" w:w="6760"/>
+            <w:shd w:fill="F7F9F9"/>
+            <w:vAlign w:val="top"/>
+            <w:tcMar>
+              <w:top w:w="80" w:type="dxa"/>
+              <w:start w:w="120" w:type="dxa"/>
+              <w:bottom w:w="80" w:type="dxa"/>
+              <w:end w:w="120" w:type="dxa"/>
+            </w:tcMar>
+          </w:tcPr>
+          <w:p>
+            <w:pPr>
+              <w:spacing w:after="0"/>
+            </w:pPr>
+            <w:r>
+              <w:rPr>
+                <w:rFonts w:ascii="Calibri" w:hAnsi="Calibri" w:eastAsia="Calibri"/>
+                <w:b w:val="0"/>
+                <w:i w:val="0"/>
+                <w:color w:val="203740"/>
+                <w:sz w:val="17"/>
+              </w:rPr>
+              <w:t>Inicio: 2023-01-01; término: 2027-01-31</w:t>
+            </w:r>
+          </w:p>
+        </w:tc>
+      </w:tr>
+      <w:tr>
+        <w:tc>
+          <w:tcPr>
+            <w:tcW w:type="dxa" w:w="2600"/>
+            <w:vAlign w:val="top"/>
+            <w:tcMar>
+              <w:top w:w="80" w:type="dxa"/>
+              <w:start w:w="120" w:type="dxa"/>
+              <w:bottom w:w="80" w:type="dxa"/>
+              <w:end w:w="120" w:type="dxa"/>
+            </w:tcMar>
+          </w:tcPr>
+          <w:p>
+            <w:pPr>
+              <w:spacing w:after="0"/>
+            </w:pPr>
+            <w:r>
+              <w:rPr>
+                <w:rFonts w:ascii="Calibri" w:hAnsi="Calibri" w:eastAsia="Calibri"/>
+                <w:b w:val="0"/>
+                <w:i w:val="0"/>
+                <w:color w:val="203740"/>
+                <w:sz w:val="17"/>
+              </w:rPr>
+              <w:t>Costo total del proyecto (RD$)</w:t>
+            </w:r>
+          </w:p>
+        </w:tc>
+        <w:tc>
+          <w:tcPr>
+            <w:tcW w:type="dxa" w:w="6760"/>
+            <w:vAlign w:val="top"/>
+            <w:tcMar>
+              <w:top w:w="80" w:type="dxa"/>
+              <w:start w:w="120" w:type="dxa"/>
+              <w:bottom w:w="80" w:type="dxa"/>
+              <w:end w:w="120" w:type="dxa"/>
+            </w:tcMar>
+          </w:tcPr>
+          <w:p>
+            <w:pPr>
+              <w:spacing w:after="0"/>
+            </w:pPr>
+            <w:r>
+              <w:rPr>
+                <w:rFonts w:ascii="Calibri" w:hAnsi="Calibri" w:eastAsia="Calibri"/>
+                <w:b w:val="0"/>
+                <w:i w:val="0"/>
+                <w:color w:val="203740"/>
+                <w:sz w:val="17"/>
+              </w:rPr>
+              <w:t>206,174,863</w:t>
+            </w:r>
+          </w:p>
+        </w:tc>
+      </w:tr>
+      <w:tr>
+        <w:tc>
+          <w:tcPr>
+            <w:tcW w:type="dxa" w:w="2600"/>
+            <w:shd w:fill="F7F9F9"/>
+            <w:vAlign w:val="top"/>
+            <w:tcMar>
+              <w:top w:w="80" w:type="dxa"/>
+              <w:start w:w="120" w:type="dxa"/>
+              <w:bottom w:w="80" w:type="dxa"/>
+              <w:end w:w="120" w:type="dxa"/>
+            </w:tcMar>
+          </w:tcPr>
+          <w:p>
+            <w:pPr>
+              <w:spacing w:after="0"/>
+            </w:pPr>
+            <w:r>
+              <w:rPr>
+                <w:rFonts w:ascii="Calibri" w:hAnsi="Calibri" w:eastAsia="Calibri"/>
+                <w:b w:val="0"/>
+                <w:i w:val="0"/>
+                <w:color w:val="203740"/>
+                <w:sz w:val="17"/>
+              </w:rPr>
+              <w:t>Presupuesto y ejecución 2026</w:t>
+            </w:r>
+          </w:p>
+        </w:tc>
+        <w:tc>
+          <w:tcPr>
+            <w:tcW w:type="dxa" w:w="6760"/>
+            <w:shd w:fill="F7F9F9"/>
+            <w:vAlign w:val="top"/>
+            <w:tcMar>
+              <w:top w:w="80" w:type="dxa"/>
+              <w:start w:w="120" w:type="dxa"/>
+              <w:bottom w:w="80" w:type="dxa"/>
+              <w:end w:w="120" w:type="dxa"/>
+            </w:tcMar>
+          </w:tcPr>
+          <w:p>
+            <w:pPr>
+              <w:spacing w:after="0"/>
+            </w:pPr>
+            <w:r>
+              <w:rPr>
+                <w:rFonts w:ascii="Calibri" w:hAnsi="Calibri" w:eastAsia="Calibri"/>
+                <w:b w:val="0"/>
+                <w:i w:val="0"/>
+                <w:color w:val="203740"/>
+                <w:sz w:val="17"/>
+              </w:rPr>
+              <w:t>Asignación: RD$ 105,000,032; ejecutado: RD$ 104,058,217; tasa de ejecución presupuestaria: 99.1%</w:t>
+            </w:r>
+          </w:p>
+        </w:tc>
+      </w:tr>
+      <w:tr>
+        <w:tc>
+          <w:tcPr>
+            <w:tcW w:type="dxa" w:w="2600"/>
+            <w:vAlign w:val="top"/>
+            <w:tcMar>
+              <w:top w:w="80" w:type="dxa"/>
+              <w:start w:w="120" w:type="dxa"/>
+              <w:bottom w:w="80" w:type="dxa"/>
+              <w:end w:w="120" w:type="dxa"/>
+            </w:tcMar>
+          </w:tcPr>
+          <w:p>
+            <w:pPr>
+              <w:spacing w:after="0"/>
+            </w:pPr>
+            <w:r>
+              <w:rPr>
+                <w:rFonts w:ascii="Calibri" w:hAnsi="Calibri" w:eastAsia="Calibri"/>
+                <w:b w:val="0"/>
+                <w:i w:val="0"/>
+                <w:color w:val="203740"/>
+                <w:sz w:val="17"/>
+              </w:rPr>
+              <w:t>Avances reportados</w:t>
+            </w:r>
+          </w:p>
+        </w:tc>
+        <w:tc>
+          <w:tcPr>
+            <w:tcW w:type="dxa" w:w="6760"/>
+            <w:vAlign w:val="top"/>
+            <w:tcMar>
+              <w:top w:w="80" w:type="dxa"/>
+              <w:start w:w="120" w:type="dxa"/>
+              <w:bottom w:w="80" w:type="dxa"/>
+              <w:end w:w="120" w:type="dxa"/>
+            </w:tcMar>
+          </w:tcPr>
+          <w:p>
+            <w:pPr>
+              <w:spacing w:after="0"/>
+            </w:pPr>
+            <w:r>
+              <w:rPr>
+                <w:rFonts w:ascii="Calibri" w:hAnsi="Calibri" w:eastAsia="Calibri"/>
+                <w:b w:val="0"/>
+                <w:i w:val="0"/>
+                <w:color w:val="203740"/>
+                <w:sz w:val="17"/>
+              </w:rPr>
+              <w:t>Físico: 49.0%; financiero: 49.0%</w:t>
+            </w:r>
+          </w:p>
+        </w:tc>
+      </w:tr>
+      <w:tr>
+        <w:tc>
+          <w:tcPr>
+            <w:tcW w:type="dxa" w:w="2600"/>
+            <w:shd w:fill="F7F9F9"/>
+            <w:vAlign w:val="top"/>
+            <w:tcMar>
+              <w:top w:w="80" w:type="dxa"/>
+              <w:start w:w="120" w:type="dxa"/>
+              <w:bottom w:w="80" w:type="dxa"/>
+              <w:end w:w="120" w:type="dxa"/>
+            </w:tcMar>
+          </w:tcPr>
+          <w:p>
+            <w:pPr>
+              <w:spacing w:after="0"/>
+            </w:pPr>
+            <w:r>
+              <w:rPr>
+                <w:rFonts w:ascii="Calibri" w:hAnsi="Calibri" w:eastAsia="Calibri"/>
+                <w:b w:val="0"/>
+                <w:i w:val="0"/>
+                <w:color w:val="203740"/>
+                <w:sz w:val="17"/>
+              </w:rPr>
+              <w:t>Contratos</w:t>
+            </w:r>
+          </w:p>
+        </w:tc>
+        <w:tc>
+          <w:tcPr>
+            <w:tcW w:type="dxa" w:w="6760"/>
+            <w:shd w:fill="F7F9F9"/>
+            <w:vAlign w:val="top"/>
+            <w:tcMar>
+              <w:top w:w="80" w:type="dxa"/>
+              <w:start w:w="120" w:type="dxa"/>
+              <w:bottom w:w="80" w:type="dxa"/>
+              <w:end w:w="120" w:type="dxa"/>
+            </w:tcMar>
+          </w:tcPr>
+          <w:p>
+            <w:pPr>
+              <w:spacing w:after="0"/>
+            </w:pPr>
+            <w:r>
+              <w:rPr>
+                <w:rFonts w:ascii="Calibri" w:hAnsi="Calibri" w:eastAsia="Calibri"/>
+                <w:b w:val="0"/>
+                <w:i w:val="0"/>
+                <w:color w:val="203740"/>
+                <w:sz w:val="17"/>
+              </w:rPr>
+              <w:t>Registrados: 1; activos: 1</w:t>
+            </w:r>
+          </w:p>
+        </w:tc>
+      </w:tr>
+      <w:tr>
+        <w:tc>
+          <w:tcPr>
+            <w:tcW w:type="dxa" w:w="2600"/>
+            <w:vAlign w:val="top"/>
+            <w:tcMar>
+              <w:top w:w="80" w:type="dxa"/>
+              <w:start w:w="120" w:type="dxa"/>
+              <w:bottom w:w="80" w:type="dxa"/>
+              <w:end w:w="120" w:type="dxa"/>
+            </w:tcMar>
+          </w:tcPr>
+          <w:p>
+            <w:pPr>
+              <w:spacing w:after="0"/>
+            </w:pPr>
+            <w:r>
+              <w:rPr>
+                <w:rFonts w:ascii="Calibri" w:hAnsi="Calibri" w:eastAsia="Calibri"/>
+                <w:b w:val="0"/>
+                <w:i w:val="0"/>
+                <w:color w:val="203740"/>
+                <w:sz w:val="17"/>
+              </w:rPr>
+              <w:t>Asignación territorial</w:t>
+            </w:r>
+          </w:p>
+        </w:tc>
+        <w:tc>
+          <w:tcPr>
+            <w:tcW w:type="dxa" w:w="6760"/>
+            <w:vAlign w:val="top"/>
+            <w:tcMar>
+              <w:top w:w="80" w:type="dxa"/>
+              <w:start w:w="120" w:type="dxa"/>
+              <w:bottom w:w="80" w:type="dxa"/>
+              <w:end w:w="120" w:type="dxa"/>
+            </w:tcMar>
+          </w:tcPr>
+          <w:p>
+            <w:pPr>
+              <w:spacing w:after="0"/>
+            </w:pPr>
+            <w:r>
+              <w:rPr>
+                <w:rFonts w:ascii="Calibri" w:hAnsi="Calibri" w:eastAsia="Calibri"/>
+                <w:b w:val="0"/>
+                <w:i w:val="0"/>
+                <w:color w:val="203740"/>
+                <w:sz w:val="17"/>
+              </w:rPr>
+              <w:t>Alcance: municipality; región principal: cibao_norte; provincias: ESPAILLAT; municipios: SAN VÍCTOR</w:t>
+            </w:r>
+          </w:p>
+        </w:tc>
+      </w:tr>
+      <w:tr>
+        <w:tc>
+          <w:tcPr>
+            <w:tcW w:type="dxa" w:w="2600"/>
+            <w:shd w:fill="F7F9F9"/>
+            <w:vAlign w:val="top"/>
+            <w:tcMar>
+              <w:top w:w="80" w:type="dxa"/>
+              <w:start w:w="120" w:type="dxa"/>
+              <w:bottom w:w="80" w:type="dxa"/>
+              <w:end w:w="120" w:type="dxa"/>
+            </w:tcMar>
+          </w:tcPr>
+          <w:p>
+            <w:pPr>
+              <w:spacing w:after="0"/>
+            </w:pPr>
+            <w:r>
+              <w:rPr>
+                <w:rFonts w:ascii="Calibri" w:hAnsi="Calibri" w:eastAsia="Calibri"/>
+                <w:b w:val="0"/>
+                <w:i w:val="0"/>
+                <w:color w:val="203740"/>
+                <w:sz w:val="17"/>
+              </w:rPr>
+              <w:t>Ubicaciones codificadas</w:t>
+            </w:r>
+          </w:p>
+        </w:tc>
+        <w:tc>
+          <w:tcPr>
+            <w:tcW w:type="dxa" w:w="6760"/>
+            <w:shd w:fill="F7F9F9"/>
+            <w:vAlign w:val="top"/>
+            <w:tcMar>
+              <w:top w:w="80" w:type="dxa"/>
+              <w:start w:w="120" w:type="dxa"/>
+              <w:bottom w:w="80" w:type="dxa"/>
+              <w:end w:w="120" w:type="dxa"/>
+            </w:tcMar>
+          </w:tcPr>
+          <w:p>
+            <w:pPr>
+              <w:spacing w:after="0"/>
+            </w:pPr>
+            <w:r>
+              <w:rPr>
+                <w:rFonts w:ascii="Calibri" w:hAnsi="Calibri" w:eastAsia="Calibri"/>
+                <w:b w:val="0"/>
+                <w:i w:val="0"/>
+                <w:color w:val="203740"/>
+                <w:sz w:val="17"/>
+              </w:rPr>
+              <w:t>región cibao_norte [01], provincia ESPAILLAT [09], municipio SAN VÍCTOR [010905]</w:t>
+            </w:r>
+          </w:p>
+        </w:tc>
+      </w:tr>
+      <w:tr>
+        <w:tc>
+          <w:tcPr>
+            <w:tcW w:type="dxa" w:w="2600"/>
+            <w:vAlign w:val="top"/>
+            <w:tcMar>
+              <w:top w:w="80" w:type="dxa"/>
+              <w:start w:w="120" w:type="dxa"/>
+              <w:bottom w:w="80" w:type="dxa"/>
+              <w:end w:w="120" w:type="dxa"/>
+            </w:tcMar>
+          </w:tcPr>
+          <w:p>
+            <w:pPr>
+              <w:spacing w:after="0"/>
+            </w:pPr>
+            <w:r>
+              <w:rPr>
+                <w:rFonts w:ascii="Calibri" w:hAnsi="Calibri" w:eastAsia="Calibri"/>
+                <w:b w:val="0"/>
+                <w:i w:val="0"/>
+                <w:color w:val="203740"/>
+                <w:sz w:val="17"/>
+              </w:rPr>
+              <w:t>Evidencia de ubicación</w:t>
+            </w:r>
+          </w:p>
+        </w:tc>
+        <w:tc>
+          <w:tcPr>
+            <w:tcW w:type="dxa" w:w="6760"/>
+            <w:vAlign w:val="top"/>
+            <w:tcMar>
+              <w:top w:w="80" w:type="dxa"/>
+              <w:start w:w="120" w:type="dxa"/>
+              <w:bottom w:w="80" w:type="dxa"/>
+              <w:end w:w="120" w:type="dxa"/>
+            </w:tcMar>
+          </w:tcPr>
+          <w:p>
+            <w:pPr>
+              <w:spacing w:after="0"/>
+            </w:pPr>
+            <w:r>
+              <w:rPr>
+                <w:rFonts w:ascii="Calibri" w:hAnsi="Calibri" w:eastAsia="Calibri"/>
+                <w:b w:val="0"/>
+                <w:i w:val="0"/>
+                <w:color w:val="203740"/>
+                <w:sz w:val="17"/>
+              </w:rPr>
+              <w:t>Perfil: SAN VÍCTOR (ESPAILLAT); fuente: profile; verificada: 2026-08-02T12:40:21.979Z</w:t>
+            </w:r>
+          </w:p>
+        </w:tc>
+      </w:tr>
+      <w:tr>
+        <w:tc>
+          <w:tcPr>
+            <w:tcW w:type="dxa" w:w="2600"/>
+            <w:shd w:fill="F7F9F9"/>
+            <w:vAlign w:val="top"/>
+            <w:tcMar>
+              <w:top w:w="80" w:type="dxa"/>
+              <w:start w:w="120" w:type="dxa"/>
+              <w:bottom w:w="80" w:type="dxa"/>
+              <w:end w:w="120" w:type="dxa"/>
+            </w:tcMar>
+          </w:tcPr>
+          <w:p>
+            <w:pPr>
+              <w:spacing w:after="0"/>
+            </w:pPr>
+            <w:r>
+              <w:rPr>
+                <w:rFonts w:ascii="Calibri" w:hAnsi="Calibri" w:eastAsia="Calibri"/>
+                <w:b w:val="0"/>
+                <w:i w:val="0"/>
+                <w:color w:val="203740"/>
+                <w:sz w:val="17"/>
+              </w:rPr>
+              <w:t>Clasificación territorial</w:t>
+            </w:r>
+          </w:p>
+        </w:tc>
+        <w:tc>
+          <w:tcPr>
+            <w:tcW w:type="dxa" w:w="6760"/>
+            <w:shd w:fill="F7F9F9"/>
+            <w:vAlign w:val="top"/>
+            <w:tcMar>
+              <w:top w:w="80" w:type="dxa"/>
+              <w:start w:w="120" w:type="dxa"/>
+              <w:bottom w:w="80" w:type="dxa"/>
+              <w:end w:w="120" w:type="dxa"/>
+            </w:tcMar>
+          </w:tcPr>
+          <w:p>
+            <w:pPr>
+              <w:spacing w:after="0"/>
+            </w:pPr>
+            <w:r>
+              <w:rPr>
+                <w:rFonts w:ascii="Calibri" w:hAnsi="Calibri" w:eastAsia="Calibri"/>
+                <w:b w:val="0"/>
+                <w:i w:val="0"/>
+                <w:color w:val="203740"/>
+                <w:sz w:val="17"/>
+              </w:rPr>
+              <w:t>Nacional: no; multirregional: no</w:t>
+            </w:r>
+          </w:p>
+        </w:tc>
+      </w:tr>
+      <w:tr>
+        <w:tc>
+          <w:tcPr>
+            <w:tcW w:type="dxa" w:w="2600"/>
+            <w:vAlign w:val="top"/>
+            <w:tcMar>
+              <w:top w:w="80" w:type="dxa"/>
+              <w:start w:w="120" w:type="dxa"/>
+              <w:bottom w:w="80" w:type="dxa"/>
+              <w:end w:w="120" w:type="dxa"/>
+            </w:tcMar>
+          </w:tcPr>
+          <w:p>
+            <w:pPr>
+              <w:spacing w:after="0"/>
+            </w:pPr>
+            <w:r>
+              <w:rPr>
+                <w:rFonts w:ascii="Calibri" w:hAnsi="Calibri" w:eastAsia="Calibri"/>
+                <w:b w:val="0"/>
+                <w:i w:val="0"/>
+                <w:color w:val="203740"/>
+                <w:sz w:val="17"/>
+              </w:rPr>
+              <w:t>Cobertura en archivos fuente</w:t>
+            </w:r>
+          </w:p>
+        </w:tc>
+        <w:tc>
+          <w:tcPr>
+            <w:tcW w:type="dxa" w:w="6760"/>
+            <w:vAlign w:val="top"/>
+            <w:tcMar>
+              <w:top w:w="80" w:type="dxa"/>
+              <w:start w:w="120" w:type="dxa"/>
+              <w:bottom w:w="80" w:type="dxa"/>
+              <w:end w:w="120" w:type="dxa"/>
+            </w:tcMar>
+          </w:tcPr>
+          <w:p>
+            <w:pPr>
+              <w:spacing w:after="0"/>
+            </w:pPr>
+            <w:r>
+              <w:rPr>
+                <w:rFonts w:ascii="Calibri" w:hAnsi="Calibri" w:eastAsia="Calibri"/>
+                <w:b w:val="0"/>
+                <w:i w:val="0"/>
+                <w:color w:val="203740"/>
+                <w:sz w:val="17"/>
+              </w:rPr>
+              <w:t>maestro: sí; presupuesto: sí; territorio: sí; CSV territorial: sí; perfil: sí</w:t>
+            </w:r>
+          </w:p>
+        </w:tc>
+      </w:tr>
+      <w:tr>
+        <w:tc>
+          <w:tcPr>
+            <w:tcW w:type="dxa" w:w="2600"/>
+            <w:shd w:fill="F7F9F9"/>
+            <w:vAlign w:val="top"/>
+            <w:tcMar>
+              <w:top w:w="80" w:type="dxa"/>
+              <w:start w:w="120" w:type="dxa"/>
+              <w:bottom w:w="80" w:type="dxa"/>
+              <w:end w:w="120" w:type="dxa"/>
+            </w:tcMar>
+          </w:tcPr>
+          <w:p>
+            <w:pPr>
+              <w:spacing w:after="0"/>
+            </w:pPr>
+            <w:r>
+              <w:rPr>
+                <w:rFonts w:ascii="Calibri" w:hAnsi="Calibri" w:eastAsia="Calibri"/>
+                <w:b w:val="0"/>
+                <w:i w:val="0"/>
+                <w:color w:val="203740"/>
+                <w:sz w:val="17"/>
+              </w:rPr>
+              <w:t>Enlaces oficiales</w:t>
+            </w:r>
+          </w:p>
+        </w:tc>
+        <w:tc>
+          <w:tcPr>
+            <w:tcW w:type="dxa" w:w="6760"/>
+            <w:shd w:fill="F7F9F9"/>
+            <w:vAlign w:val="top"/>
+            <w:tcMar>
+              <w:top w:w="80" w:type="dxa"/>
+              <w:start w:w="120" w:type="dxa"/>
+              <w:bottom w:w="80" w:type="dxa"/>
+              <w:end w:w="120" w:type="dxa"/>
+            </w:tcMar>
+          </w:tcPr>
+          <w:p>
+            <w:pPr>
+              <w:spacing w:after="0"/>
+            </w:pPr>
+            <w:r>
+              <w:rPr>
+                <w:rFonts w:ascii="Calibri" w:hAnsi="Calibri" w:eastAsia="Calibri"/>
+                <w:b w:val="0"/>
+                <w:i w:val="0"/>
+                <w:color w:val="203740"/>
+                <w:sz w:val="17"/>
+              </w:rPr>
+              <w:t>Perfil: https://mapainversiones.gob.do/projectprofile/6172; contrato: https://comunidad.comprasdominicana.gob.do/Public/Tendering/ContractDetailView/Index?UniqueIdentifier=DO1.PCCNTR.2302877&amp;AwardContractDetailId=720375</w:t>
+            </w:r>
+          </w:p>
+        </w:tc>
+      </w:tr>
+    </w:tbl>
+    <w:p>
+      <w:pPr>
+        <w:spacing w:after="0"/>
+      </w:pPr>
+    </w:p>
+    <w:p>
+      <w:pPr>
+        <w:pStyle w:val="Heading3"/>
+      </w:pPr>
+      <w:r>
+        <w:t>5.2.2 RECONSTRUCCIÓN CANCHA MUNICIPAL SAN VÍCTOR, PROVINCIA ESPAILLAT</w:t>
+      </w:r>
+    </w:p>
+    <w:tbl>
+      <w:tblPr>
+        <w:tblW w:type="dxa" w:w="9360"/>
+        <w:tblLayout w:type="fixed"/>
+        <w:tblLook w:firstColumn="1" w:firstRow="1" w:lastColumn="0" w:lastRow="0" w:noHBand="0" w:noVBand="1" w:val="04A0"/>
+        <w:jc w:val="center"/>
+        <w:tblInd w:w="120" w:type="dxa"/>
+        <w:tblBorders>
+          <w:top w:val="single" w:sz="5" w:color="D7E0E1"/>
+          <w:left w:val="single" w:sz="5" w:color="D7E0E1"/>
+          <w:bottom w:val="single" w:sz="5" w:color="D7E0E1"/>
+          <w:right w:val="single" w:sz="5" w:color="D7E0E1"/>
+          <w:insideH w:val="single" w:sz="5" w:color="D7E0E1"/>
+          <w:insideV w:val="single" w:sz="5" w:color="D7E0E1"/>
+        </w:tblBorders>
+      </w:tblPr>
+      <w:tblGrid>
+        <w:gridCol w:w="2600"/>
+        <w:gridCol w:w="6760"/>
+      </w:tblGrid>
+      <w:tr>
+        <w:trPr>
+          <w:tblHeader w:val="true"/>
+        </w:trPr>
+        <w:tc>
+          <w:tcPr>
+            <w:tcW w:type="dxa" w:w="2600"/>
+            <w:tcMar>
+              <w:top w:w="80" w:type="dxa"/>
+              <w:start w:w="120" w:type="dxa"/>
+              <w:bottom w:w="80" w:type="dxa"/>
+              <w:end w:w="120" w:type="dxa"/>
+            </w:tcMar>
+            <w:shd w:fill="203740"/>
+            <w:vAlign w:val="center"/>
+          </w:tcPr>
+          <w:p>
+            <w:pPr>
+              <w:spacing w:after="0"/>
+            </w:pPr>
+            <w:r>
+              <w:rPr>
+                <w:rFonts w:ascii="Calibri" w:hAnsi="Calibri" w:eastAsia="Calibri"/>
+                <w:b/>
+                <w:i w:val="0"/>
+                <w:color w:val="FFFFFF"/>
+                <w:sz w:val="17"/>
+              </w:rPr>
+              <w:t>Campo</w:t>
+            </w:r>
+          </w:p>
+        </w:tc>
+        <w:tc>
+          <w:tcPr>
+            <w:tcW w:type="dxa" w:w="6760"/>
+            <w:tcMar>
+              <w:top w:w="80" w:type="dxa"/>
+              <w:start w:w="120" w:type="dxa"/>
+              <w:bottom w:w="80" w:type="dxa"/>
+              <w:end w:w="120" w:type="dxa"/>
+            </w:tcMar>
+            <w:shd w:fill="203740"/>
+            <w:vAlign w:val="center"/>
+          </w:tcPr>
+          <w:p>
+            <w:pPr>
+              <w:spacing w:after="0"/>
+            </w:pPr>
+            <w:r>
+              <w:rPr>
+                <w:rFonts w:ascii="Calibri" w:hAnsi="Calibri" w:eastAsia="Calibri"/>
+                <w:b/>
+                <w:i w:val="0"/>
+                <w:color w:val="FFFFFF"/>
+                <w:sz w:val="17"/>
+              </w:rPr>
+              <w:t>Dato publicado</w:t>
+            </w:r>
+          </w:p>
+        </w:tc>
+      </w:tr>
+      <w:tr>
+        <w:tc>
+          <w:tcPr>
+            <w:tcW w:type="dxa" w:w="2600"/>
+            <w:vAlign w:val="top"/>
+            <w:tcMar>
+              <w:top w:w="80" w:type="dxa"/>
+              <w:start w:w="120" w:type="dxa"/>
+              <w:bottom w:w="80" w:type="dxa"/>
+              <w:end w:w="120" w:type="dxa"/>
+            </w:tcMar>
+          </w:tcPr>
+          <w:p>
+            <w:pPr>
+              <w:spacing w:after="0"/>
+            </w:pPr>
+            <w:r>
+              <w:rPr>
+                <w:rFonts w:ascii="Calibri" w:hAnsi="Calibri" w:eastAsia="Calibri"/>
+                <w:b w:val="0"/>
+                <w:i w:val="0"/>
+                <w:color w:val="203740"/>
+                <w:sz w:val="17"/>
+              </w:rPr>
+              <w:t>Nombre del proyecto</w:t>
+            </w:r>
+          </w:p>
+        </w:tc>
+        <w:tc>
+          <w:tcPr>
+            <w:tcW w:type="dxa" w:w="6760"/>
+            <w:vAlign w:val="top"/>
+            <w:tcMar>
+              <w:top w:w="80" w:type="dxa"/>
+              <w:start w:w="120" w:type="dxa"/>
+              <w:bottom w:w="80" w:type="dxa"/>
+              <w:end w:w="120" w:type="dxa"/>
+            </w:tcMar>
+          </w:tcPr>
+          <w:p>
+            <w:pPr>
+              <w:spacing w:after="0"/>
+            </w:pPr>
+            <w:r>
+              <w:rPr>
+                <w:rFonts w:ascii="Calibri" w:hAnsi="Calibri" w:eastAsia="Calibri"/>
+                <w:b w:val="0"/>
+                <w:i w:val="0"/>
+                <w:color w:val="203740"/>
+                <w:sz w:val="17"/>
+              </w:rPr>
+              <w:t>RECONSTRUCCIÓN CANCHA MUNICIPAL SAN VÍCTOR, PROVINCIA ESPAILLAT</w:t>
+            </w:r>
+          </w:p>
+        </w:tc>
+      </w:tr>
+      <w:tr>
+        <w:tc>
+          <w:tcPr>
+            <w:tcW w:type="dxa" w:w="2600"/>
+            <w:shd w:fill="F7F9F9"/>
+            <w:vAlign w:val="top"/>
+            <w:tcMar>
+              <w:top w:w="80" w:type="dxa"/>
+              <w:start w:w="120" w:type="dxa"/>
+              <w:bottom w:w="80" w:type="dxa"/>
+              <w:end w:w="120" w:type="dxa"/>
+            </w:tcMar>
+          </w:tcPr>
+          <w:p>
+            <w:pPr>
+              <w:spacing w:after="0"/>
+            </w:pPr>
+            <w:r>
+              <w:rPr>
+                <w:rFonts w:ascii="Calibri" w:hAnsi="Calibri" w:eastAsia="Calibri"/>
+                <w:b w:val="0"/>
+                <w:i w:val="0"/>
+                <w:color w:val="203740"/>
+                <w:sz w:val="17"/>
+              </w:rPr>
+              <w:t>Identificación</w:t>
+            </w:r>
+          </w:p>
+        </w:tc>
+        <w:tc>
+          <w:tcPr>
+            <w:tcW w:type="dxa" w:w="6760"/>
+            <w:shd w:fill="F7F9F9"/>
+            <w:vAlign w:val="top"/>
+            <w:tcMar>
+              <w:top w:w="80" w:type="dxa"/>
+              <w:start w:w="120" w:type="dxa"/>
+              <w:bottom w:w="80" w:type="dxa"/>
+              <w:end w:w="120" w:type="dxa"/>
+            </w:tcMar>
+          </w:tcPr>
+          <w:p>
+            <w:pPr>
+              <w:spacing w:after="0"/>
+            </w:pPr>
+            <w:r>
+              <w:rPr>
+                <w:rFonts w:ascii="Calibri" w:hAnsi="Calibri" w:eastAsia="Calibri"/>
+                <w:b w:val="0"/>
+                <w:i w:val="0"/>
+                <w:color w:val="203740"/>
+                <w:sz w:val="17"/>
+              </w:rPr>
+              <w:t>SNIP: 17121; Ficha MapaInversiones: 8790</w:t>
+            </w:r>
+          </w:p>
+        </w:tc>
+      </w:tr>
+      <w:tr>
+        <w:tc>
+          <w:tcPr>
+            <w:tcW w:type="dxa" w:w="2600"/>
+            <w:vAlign w:val="top"/>
+            <w:tcMar>
+              <w:top w:w="80" w:type="dxa"/>
+              <w:start w:w="120" w:type="dxa"/>
+              <w:bottom w:w="80" w:type="dxa"/>
+              <w:end w:w="120" w:type="dxa"/>
+            </w:tcMar>
+          </w:tcPr>
+          <w:p>
+            <w:pPr>
+              <w:spacing w:after="0"/>
+            </w:pPr>
+            <w:r>
+              <w:rPr>
+                <w:rFonts w:ascii="Calibri" w:hAnsi="Calibri" w:eastAsia="Calibri"/>
+                <w:b w:val="0"/>
+                <w:i w:val="0"/>
+                <w:color w:val="203740"/>
+                <w:sz w:val="17"/>
+              </w:rPr>
+              <w:t>Estado y seguimiento</w:t>
+            </w:r>
+          </w:p>
+        </w:tc>
+        <w:tc>
+          <w:tcPr>
+            <w:tcW w:type="dxa" w:w="6760"/>
+            <w:vAlign w:val="top"/>
+            <w:tcMar>
+              <w:top w:w="80" w:type="dxa"/>
+              <w:start w:w="120" w:type="dxa"/>
+              <w:bottom w:w="80" w:type="dxa"/>
+              <w:end w:w="120" w:type="dxa"/>
+            </w:tcMar>
+          </w:tcPr>
+          <w:p>
+            <w:pPr>
+              <w:spacing w:after="0"/>
+            </w:pPr>
+            <w:r>
+              <w:rPr>
+                <w:rFonts w:ascii="Calibri" w:hAnsi="Calibri" w:eastAsia="Calibri"/>
+                <w:b w:val="0"/>
+                <w:i w:val="0"/>
+                <w:color w:val="203740"/>
+                <w:sz w:val="17"/>
+              </w:rPr>
+              <w:t>Estado: EJECUCIÓN; seguimiento: Ejecución y contrato activo</w:t>
+            </w:r>
+          </w:p>
+        </w:tc>
+      </w:tr>
+      <w:tr>
+        <w:tc>
+          <w:tcPr>
+            <w:tcW w:type="dxa" w:w="2600"/>
+            <w:shd w:fill="F7F9F9"/>
+            <w:vAlign w:val="top"/>
+            <w:tcMar>
+              <w:top w:w="80" w:type="dxa"/>
+              <w:start w:w="120" w:type="dxa"/>
+              <w:bottom w:w="80" w:type="dxa"/>
+              <w:end w:w="120" w:type="dxa"/>
+            </w:tcMar>
+          </w:tcPr>
+          <w:p>
+            <w:pPr>
+              <w:spacing w:after="0"/>
+            </w:pPr>
+            <w:r>
+              <w:rPr>
+                <w:rFonts w:ascii="Calibri" w:hAnsi="Calibri" w:eastAsia="Calibri"/>
+                <w:b w:val="0"/>
+                <w:i w:val="0"/>
+                <w:color w:val="203740"/>
+                <w:sz w:val="17"/>
+              </w:rPr>
+              <w:t>Institución ejecutora</w:t>
+            </w:r>
+          </w:p>
+        </w:tc>
+        <w:tc>
+          <w:tcPr>
+            <w:tcW w:type="dxa" w:w="6760"/>
+            <w:shd w:fill="F7F9F9"/>
+            <w:vAlign w:val="top"/>
+            <w:tcMar>
+              <w:top w:w="80" w:type="dxa"/>
+              <w:start w:w="120" w:type="dxa"/>
+              <w:bottom w:w="80" w:type="dxa"/>
+              <w:end w:w="120" w:type="dxa"/>
+            </w:tcMar>
+          </w:tcPr>
+          <w:p>
+            <w:pPr>
+              <w:spacing w:after="0"/>
+            </w:pPr>
+            <w:r>
+              <w:rPr>
+                <w:rFonts w:ascii="Calibri" w:hAnsi="Calibri" w:eastAsia="Calibri"/>
+                <w:b w:val="0"/>
+                <w:i w:val="0"/>
+                <w:color w:val="203740"/>
+                <w:sz w:val="17"/>
+              </w:rPr>
+              <w:t>Principal: MINISTERIO DE DEPORTES Y RECREACIÓN. Registradas: MINISTERIO DE DEPORTES Y RECREACIÓN</w:t>
+            </w:r>
+          </w:p>
+        </w:tc>
+      </w:tr>
+      <w:tr>
+        <w:tc>
+          <w:tcPr>
+            <w:tcW w:type="dxa" w:w="2600"/>
+            <w:vAlign w:val="top"/>
+            <w:tcMar>
+              <w:top w:w="80" w:type="dxa"/>
+              <w:start w:w="120" w:type="dxa"/>
+              <w:bottom w:w="80" w:type="dxa"/>
+              <w:end w:w="120" w:type="dxa"/>
+            </w:tcMar>
+          </w:tcPr>
+          <w:p>
+            <w:pPr>
+              <w:spacing w:after="0"/>
+            </w:pPr>
+            <w:r>
+              <w:rPr>
+                <w:rFonts w:ascii="Calibri" w:hAnsi="Calibri" w:eastAsia="Calibri"/>
+                <w:b w:val="0"/>
+                <w:i w:val="0"/>
+                <w:color w:val="203740"/>
+                <w:sz w:val="17"/>
+              </w:rPr>
+              <w:t>Sectores</w:t>
+            </w:r>
+          </w:p>
+        </w:tc>
+        <w:tc>
+          <w:tcPr>
+            <w:tcW w:type="dxa" w:w="6760"/>
+            <w:vAlign w:val="top"/>
+            <w:tcMar>
+              <w:top w:w="80" w:type="dxa"/>
+              <w:start w:w="120" w:type="dxa"/>
+              <w:bottom w:w="80" w:type="dxa"/>
+              <w:end w:w="120" w:type="dxa"/>
+            </w:tcMar>
+          </w:tcPr>
+          <w:p>
+            <w:pPr>
+              <w:spacing w:after="0"/>
+            </w:pPr>
+            <w:r>
+              <w:rPr>
+                <w:rFonts w:ascii="Calibri" w:hAnsi="Calibri" w:eastAsia="Calibri"/>
+                <w:b w:val="0"/>
+                <w:i w:val="0"/>
+                <w:color w:val="203740"/>
+                <w:sz w:val="17"/>
+              </w:rPr>
+              <w:t>Actividades deportivas, recreativas, culturales y religiosas</w:t>
+            </w:r>
+          </w:p>
+        </w:tc>
+      </w:tr>
+      <w:tr>
+        <w:tc>
+          <w:tcPr>
+            <w:tcW w:type="dxa" w:w="2600"/>
+            <w:shd w:fill="F7F9F9"/>
+            <w:vAlign w:val="top"/>
+            <w:tcMar>
+              <w:top w:w="80" w:type="dxa"/>
+              <w:start w:w="120" w:type="dxa"/>
+              <w:bottom w:w="80" w:type="dxa"/>
+              <w:end w:w="120" w:type="dxa"/>
+            </w:tcMar>
+          </w:tcPr>
+          <w:p>
+            <w:pPr>
+              <w:spacing w:after="0"/>
+            </w:pPr>
+            <w:r>
+              <w:rPr>
+                <w:rFonts w:ascii="Calibri" w:hAnsi="Calibri" w:eastAsia="Calibri"/>
+                <w:b w:val="0"/>
+                <w:i w:val="0"/>
+                <w:color w:val="203740"/>
+                <w:sz w:val="17"/>
+              </w:rPr>
+              <w:t>Período</w:t>
+            </w:r>
+          </w:p>
+        </w:tc>
+        <w:tc>
+          <w:tcPr>
+            <w:tcW w:type="dxa" w:w="6760"/>
+            <w:shd w:fill="F7F9F9"/>
+            <w:vAlign w:val="top"/>
+            <w:tcMar>
+              <w:top w:w="80" w:type="dxa"/>
+              <w:start w:w="120" w:type="dxa"/>
+              <w:bottom w:w="80" w:type="dxa"/>
+              <w:end w:w="120" w:type="dxa"/>
+            </w:tcMar>
+          </w:tcPr>
+          <w:p>
+            <w:pPr>
+              <w:spacing w:after="0"/>
+            </w:pPr>
+            <w:r>
+              <w:rPr>
+                <w:rFonts w:ascii="Calibri" w:hAnsi="Calibri" w:eastAsia="Calibri"/>
+                <w:b w:val="0"/>
+                <w:i w:val="0"/>
+                <w:color w:val="203740"/>
+                <w:sz w:val="17"/>
+              </w:rPr>
+              <w:t>Inicio: 2026-01-01; término: 2027-01-31</w:t>
+            </w:r>
+          </w:p>
+        </w:tc>
+      </w:tr>
+      <w:tr>
+        <w:tc>
+          <w:tcPr>
+            <w:tcW w:type="dxa" w:w="2600"/>
+            <w:vAlign w:val="top"/>
+            <w:tcMar>
+              <w:top w:w="80" w:type="dxa"/>
+              <w:start w:w="120" w:type="dxa"/>
+              <w:bottom w:w="80" w:type="dxa"/>
+              <w:end w:w="120" w:type="dxa"/>
+            </w:tcMar>
+          </w:tcPr>
+          <w:p>
+            <w:pPr>
+              <w:spacing w:after="0"/>
+            </w:pPr>
+            <w:r>
+              <w:rPr>
+                <w:rFonts w:ascii="Calibri" w:hAnsi="Calibri" w:eastAsia="Calibri"/>
+                <w:b w:val="0"/>
+                <w:i w:val="0"/>
+                <w:color w:val="203740"/>
+                <w:sz w:val="17"/>
+              </w:rPr>
+              <w:t>Costo total del proyecto (RD$)</w:t>
+            </w:r>
+          </w:p>
+        </w:tc>
+        <w:tc>
+          <w:tcPr>
+            <w:tcW w:type="dxa" w:w="6760"/>
+            <w:vAlign w:val="top"/>
+            <w:tcMar>
+              <w:top w:w="80" w:type="dxa"/>
+              <w:start w:w="120" w:type="dxa"/>
+              <w:bottom w:w="80" w:type="dxa"/>
+              <w:end w:w="120" w:type="dxa"/>
+            </w:tcMar>
+          </w:tcPr>
+          <w:p>
+            <w:pPr>
+              <w:spacing w:after="0"/>
+            </w:pPr>
+            <w:r>
+              <w:rPr>
+                <w:rFonts w:ascii="Calibri" w:hAnsi="Calibri" w:eastAsia="Calibri"/>
+                <w:b w:val="0"/>
+                <w:i w:val="0"/>
+                <w:color w:val="203740"/>
+                <w:sz w:val="17"/>
+              </w:rPr>
+              <w:t>31,483,639</w:t>
+            </w:r>
+          </w:p>
+        </w:tc>
+      </w:tr>
+      <w:tr>
+        <w:tc>
+          <w:tcPr>
+            <w:tcW w:type="dxa" w:w="2600"/>
+            <w:shd w:fill="F7F9F9"/>
+            <w:vAlign w:val="top"/>
+            <w:tcMar>
+              <w:top w:w="80" w:type="dxa"/>
+              <w:start w:w="120" w:type="dxa"/>
+              <w:bottom w:w="80" w:type="dxa"/>
+              <w:end w:w="120" w:type="dxa"/>
+            </w:tcMar>
+          </w:tcPr>
+          <w:p>
+            <w:pPr>
+              <w:spacing w:after="0"/>
+            </w:pPr>
+            <w:r>
+              <w:rPr>
+                <w:rFonts w:ascii="Calibri" w:hAnsi="Calibri" w:eastAsia="Calibri"/>
+                <w:b w:val="0"/>
+                <w:i w:val="0"/>
+                <w:color w:val="203740"/>
+                <w:sz w:val="17"/>
+              </w:rPr>
+              <w:t>Presupuesto y ejecución 2026</w:t>
+            </w:r>
+          </w:p>
+        </w:tc>
+        <w:tc>
+          <w:tcPr>
+            <w:tcW w:type="dxa" w:w="6760"/>
+            <w:shd w:fill="F7F9F9"/>
+            <w:vAlign w:val="top"/>
+            <w:tcMar>
+              <w:top w:w="80" w:type="dxa"/>
+              <w:start w:w="120" w:type="dxa"/>
+              <w:bottom w:w="80" w:type="dxa"/>
+              <w:end w:w="120" w:type="dxa"/>
+            </w:tcMar>
+          </w:tcPr>
+          <w:p>
+            <w:pPr>
+              <w:spacing w:after="0"/>
+            </w:pPr>
+            <w:r>
+              <w:rPr>
+                <w:rFonts w:ascii="Calibri" w:hAnsi="Calibri" w:eastAsia="Calibri"/>
+                <w:b w:val="0"/>
+                <w:i w:val="0"/>
+                <w:color w:val="203740"/>
+                <w:sz w:val="17"/>
+              </w:rPr>
+              <w:t>Asignación: RD$ 19,649,150; ejecutado: RD$ 6,036,214; tasa de ejecución presupuestaria: 30.7%</w:t>
+            </w:r>
+          </w:p>
+        </w:tc>
+      </w:tr>
+      <w:tr>
+        <w:tc>
+          <w:tcPr>
+            <w:tcW w:type="dxa" w:w="2600"/>
+            <w:vAlign w:val="top"/>
+            <w:tcMar>
+              <w:top w:w="80" w:type="dxa"/>
+              <w:start w:w="120" w:type="dxa"/>
+              <w:bottom w:w="80" w:type="dxa"/>
+              <w:end w:w="120" w:type="dxa"/>
+            </w:tcMar>
+          </w:tcPr>
+          <w:p>
+            <w:pPr>
+              <w:spacing w:after="0"/>
+            </w:pPr>
+            <w:r>
+              <w:rPr>
+                <w:rFonts w:ascii="Calibri" w:hAnsi="Calibri" w:eastAsia="Calibri"/>
+                <w:b w:val="0"/>
+                <w:i w:val="0"/>
+                <w:color w:val="203740"/>
+                <w:sz w:val="17"/>
+              </w:rPr>
+              <w:t>Avances reportados</w:t>
+            </w:r>
+          </w:p>
+        </w:tc>
+        <w:tc>
+          <w:tcPr>
+            <w:tcW w:type="dxa" w:w="6760"/>
+            <w:vAlign w:val="top"/>
+            <w:tcMar>
+              <w:top w:w="80" w:type="dxa"/>
+              <w:start w:w="120" w:type="dxa"/>
+              <w:bottom w:w="80" w:type="dxa"/>
+              <w:end w:w="120" w:type="dxa"/>
+            </w:tcMar>
+          </w:tcPr>
+          <w:p>
+            <w:pPr>
+              <w:spacing w:after="0"/>
+            </w:pPr>
+            <w:r>
+              <w:rPr>
+                <w:rFonts w:ascii="Calibri" w:hAnsi="Calibri" w:eastAsia="Calibri"/>
+                <w:b w:val="0"/>
+                <w:i w:val="0"/>
+                <w:color w:val="203740"/>
+                <w:sz w:val="17"/>
+              </w:rPr>
+              <w:t>Físico: 0.0%; financiero: 0.0%</w:t>
+            </w:r>
+          </w:p>
+        </w:tc>
+      </w:tr>
+      <w:tr>
+        <w:tc>
+          <w:tcPr>
+            <w:tcW w:type="dxa" w:w="2600"/>
+            <w:shd w:fill="F7F9F9"/>
+            <w:vAlign w:val="top"/>
+            <w:tcMar>
+              <w:top w:w="80" w:type="dxa"/>
+              <w:start w:w="120" w:type="dxa"/>
+              <w:bottom w:w="80" w:type="dxa"/>
+              <w:end w:w="120" w:type="dxa"/>
+            </w:tcMar>
+          </w:tcPr>
+          <w:p>
+            <w:pPr>
+              <w:spacing w:after="0"/>
+            </w:pPr>
+            <w:r>
+              <w:rPr>
+                <w:rFonts w:ascii="Calibri" w:hAnsi="Calibri" w:eastAsia="Calibri"/>
+                <w:b w:val="0"/>
+                <w:i w:val="0"/>
+                <w:color w:val="203740"/>
+                <w:sz w:val="17"/>
+              </w:rPr>
+              <w:t>Contratos</w:t>
+            </w:r>
+          </w:p>
+        </w:tc>
+        <w:tc>
+          <w:tcPr>
+            <w:tcW w:type="dxa" w:w="6760"/>
+            <w:shd w:fill="F7F9F9"/>
+            <w:vAlign w:val="top"/>
+            <w:tcMar>
+              <w:top w:w="80" w:type="dxa"/>
+              <w:start w:w="120" w:type="dxa"/>
+              <w:bottom w:w="80" w:type="dxa"/>
+              <w:end w:w="120" w:type="dxa"/>
+            </w:tcMar>
+          </w:tcPr>
+          <w:p>
+            <w:pPr>
+              <w:spacing w:after="0"/>
+            </w:pPr>
+            <w:r>
+              <w:rPr>
+                <w:rFonts w:ascii="Calibri" w:hAnsi="Calibri" w:eastAsia="Calibri"/>
+                <w:b w:val="0"/>
+                <w:i w:val="0"/>
+                <w:color w:val="203740"/>
+                <w:sz w:val="17"/>
+              </w:rPr>
+              <w:t>Registrados: 20; activos: 20</w:t>
+            </w:r>
+          </w:p>
+        </w:tc>
+      </w:tr>
+      <w:tr>
+        <w:tc>
+          <w:tcPr>
+            <w:tcW w:type="dxa" w:w="2600"/>
+            <w:vAlign w:val="top"/>
+            <w:tcMar>
+              <w:top w:w="80" w:type="dxa"/>
+              <w:start w:w="120" w:type="dxa"/>
+              <w:bottom w:w="80" w:type="dxa"/>
+              <w:end w:w="120" w:type="dxa"/>
+            </w:tcMar>
+          </w:tcPr>
+          <w:p>
+            <w:pPr>
+              <w:spacing w:after="0"/>
+            </w:pPr>
+            <w:r>
+              <w:rPr>
+                <w:rFonts w:ascii="Calibri" w:hAnsi="Calibri" w:eastAsia="Calibri"/>
+                <w:b w:val="0"/>
+                <w:i w:val="0"/>
+                <w:color w:val="203740"/>
+                <w:sz w:val="17"/>
+              </w:rPr>
+              <w:t>Asignación territorial</w:t>
+            </w:r>
+          </w:p>
+        </w:tc>
+        <w:tc>
+          <w:tcPr>
+            <w:tcW w:type="dxa" w:w="6760"/>
+            <w:vAlign w:val="top"/>
+            <w:tcMar>
+              <w:top w:w="80" w:type="dxa"/>
+              <w:start w:w="120" w:type="dxa"/>
+              <w:bottom w:w="80" w:type="dxa"/>
+              <w:end w:w="120" w:type="dxa"/>
+            </w:tcMar>
+          </w:tcPr>
+          <w:p>
+            <w:pPr>
+              <w:spacing w:after="0"/>
+            </w:pPr>
+            <w:r>
+              <w:rPr>
+                <w:rFonts w:ascii="Calibri" w:hAnsi="Calibri" w:eastAsia="Calibri"/>
+                <w:b w:val="0"/>
+                <w:i w:val="0"/>
+                <w:color w:val="203740"/>
+                <w:sz w:val="17"/>
+              </w:rPr>
+              <w:t>Alcance: municipality; región principal: cibao_norte; provincias: ESPAILLAT; municipios: SAN VÍCTOR</w:t>
+            </w:r>
+          </w:p>
+        </w:tc>
+      </w:tr>
+      <w:tr>
+        <w:tc>
+          <w:tcPr>
+            <w:tcW w:type="dxa" w:w="2600"/>
+            <w:shd w:fill="F7F9F9"/>
+            <w:vAlign w:val="top"/>
+            <w:tcMar>
+              <w:top w:w="80" w:type="dxa"/>
+              <w:start w:w="120" w:type="dxa"/>
+              <w:bottom w:w="80" w:type="dxa"/>
+              <w:end w:w="120" w:type="dxa"/>
+            </w:tcMar>
+          </w:tcPr>
+          <w:p>
+            <w:pPr>
+              <w:spacing w:after="0"/>
+            </w:pPr>
+            <w:r>
+              <w:rPr>
+                <w:rFonts w:ascii="Calibri" w:hAnsi="Calibri" w:eastAsia="Calibri"/>
+                <w:b w:val="0"/>
+                <w:i w:val="0"/>
+                <w:color w:val="203740"/>
+                <w:sz w:val="17"/>
+              </w:rPr>
+              <w:t>Ubicaciones codificadas</w:t>
+            </w:r>
+          </w:p>
+        </w:tc>
+        <w:tc>
+          <w:tcPr>
+            <w:tcW w:type="dxa" w:w="6760"/>
+            <w:shd w:fill="F7F9F9"/>
+            <w:vAlign w:val="top"/>
+            <w:tcMar>
+              <w:top w:w="80" w:type="dxa"/>
+              <w:start w:w="120" w:type="dxa"/>
+              <w:bottom w:w="80" w:type="dxa"/>
+              <w:end w:w="120" w:type="dxa"/>
+            </w:tcMar>
+          </w:tcPr>
+          <w:p>
+            <w:pPr>
+              <w:spacing w:after="0"/>
+            </w:pPr>
+            <w:r>
+              <w:rPr>
+                <w:rFonts w:ascii="Calibri" w:hAnsi="Calibri" w:eastAsia="Calibri"/>
+                <w:b w:val="0"/>
+                <w:i w:val="0"/>
+                <w:color w:val="203740"/>
+                <w:sz w:val="17"/>
+              </w:rPr>
+              <w:t>región cibao_norte [01], provincia ESPAILLAT [09], municipio SAN VÍCTOR [010905]</w:t>
+            </w:r>
+          </w:p>
+        </w:tc>
+      </w:tr>
+      <w:tr>
+        <w:tc>
+          <w:tcPr>
+            <w:tcW w:type="dxa" w:w="2600"/>
+            <w:vAlign w:val="top"/>
+            <w:tcMar>
+              <w:top w:w="80" w:type="dxa"/>
+              <w:start w:w="120" w:type="dxa"/>
+              <w:bottom w:w="80" w:type="dxa"/>
+              <w:end w:w="120" w:type="dxa"/>
+            </w:tcMar>
+          </w:tcPr>
+          <w:p>
+            <w:pPr>
+              <w:spacing w:after="0"/>
+            </w:pPr>
+            <w:r>
+              <w:rPr>
+                <w:rFonts w:ascii="Calibri" w:hAnsi="Calibri" w:eastAsia="Calibri"/>
+                <w:b w:val="0"/>
+                <w:i w:val="0"/>
+                <w:color w:val="203740"/>
+                <w:sz w:val="17"/>
+              </w:rPr>
+              <w:t>Evidencia de ubicación</w:t>
+            </w:r>
+          </w:p>
+        </w:tc>
+        <w:tc>
+          <w:tcPr>
+            <w:tcW w:type="dxa" w:w="6760"/>
+            <w:vAlign w:val="top"/>
+            <w:tcMar>
+              <w:top w:w="80" w:type="dxa"/>
+              <w:start w:w="120" w:type="dxa"/>
+              <w:bottom w:w="80" w:type="dxa"/>
+              <w:end w:w="120" w:type="dxa"/>
+            </w:tcMar>
+          </w:tcPr>
+          <w:p>
+            <w:pPr>
+              <w:spacing w:after="0"/>
+            </w:pPr>
+            <w:r>
+              <w:rPr>
+                <w:rFonts w:ascii="Calibri" w:hAnsi="Calibri" w:eastAsia="Calibri"/>
+                <w:b w:val="0"/>
+                <w:i w:val="0"/>
+                <w:color w:val="203740"/>
+                <w:sz w:val="17"/>
+              </w:rPr>
+              <w:t>Perfil: SAN VÍCTOR (ESPAILLAT); fuente: profile; verificada: 2026-08-02T12:40:54.230Z</w:t>
+            </w:r>
+          </w:p>
+        </w:tc>
+      </w:tr>
+      <w:tr>
+        <w:tc>
+          <w:tcPr>
+            <w:tcW w:type="dxa" w:w="2600"/>
+            <w:shd w:fill="F7F9F9"/>
+            <w:vAlign w:val="top"/>
+            <w:tcMar>
+              <w:top w:w="80" w:type="dxa"/>
+              <w:start w:w="120" w:type="dxa"/>
+              <w:bottom w:w="80" w:type="dxa"/>
+              <w:end w:w="120" w:type="dxa"/>
+            </w:tcMar>
+          </w:tcPr>
+          <w:p>
+            <w:pPr>
+              <w:spacing w:after="0"/>
+            </w:pPr>
+            <w:r>
+              <w:rPr>
+                <w:rFonts w:ascii="Calibri" w:hAnsi="Calibri" w:eastAsia="Calibri"/>
+                <w:b w:val="0"/>
+                <w:i w:val="0"/>
+                <w:color w:val="203740"/>
+                <w:sz w:val="17"/>
+              </w:rPr>
+              <w:t>Clasificación territorial</w:t>
+            </w:r>
+          </w:p>
+        </w:tc>
+        <w:tc>
+          <w:tcPr>
+            <w:tcW w:type="dxa" w:w="6760"/>
+            <w:shd w:fill="F7F9F9"/>
+            <w:vAlign w:val="top"/>
+            <w:tcMar>
+              <w:top w:w="80" w:type="dxa"/>
+              <w:start w:w="120" w:type="dxa"/>
+              <w:bottom w:w="80" w:type="dxa"/>
+              <w:end w:w="120" w:type="dxa"/>
+            </w:tcMar>
+          </w:tcPr>
+          <w:p>
+            <w:pPr>
+              <w:spacing w:after="0"/>
+            </w:pPr>
+            <w:r>
+              <w:rPr>
+                <w:rFonts w:ascii="Calibri" w:hAnsi="Calibri" w:eastAsia="Calibri"/>
+                <w:b w:val="0"/>
+                <w:i w:val="0"/>
+                <w:color w:val="203740"/>
+                <w:sz w:val="17"/>
+              </w:rPr>
+              <w:t>Nacional: no; multirregional: no</w:t>
+            </w:r>
+          </w:p>
+        </w:tc>
+      </w:tr>
+      <w:tr>
+        <w:tc>
+          <w:tcPr>
+            <w:tcW w:type="dxa" w:w="2600"/>
+            <w:vAlign w:val="top"/>
+            <w:tcMar>
+              <w:top w:w="80" w:type="dxa"/>
+              <w:start w:w="120" w:type="dxa"/>
+              <w:bottom w:w="80" w:type="dxa"/>
+              <w:end w:w="120" w:type="dxa"/>
+            </w:tcMar>
+          </w:tcPr>
+          <w:p>
+            <w:pPr>
+              <w:spacing w:after="0"/>
+            </w:pPr>
+            <w:r>
+              <w:rPr>
+                <w:rFonts w:ascii="Calibri" w:hAnsi="Calibri" w:eastAsia="Calibri"/>
+                <w:b w:val="0"/>
+                <w:i w:val="0"/>
+                <w:color w:val="203740"/>
+                <w:sz w:val="17"/>
+              </w:rPr>
+              <w:t>Cobertura en archivos fuente</w:t>
+            </w:r>
+          </w:p>
+        </w:tc>
+        <w:tc>
+          <w:tcPr>
+            <w:tcW w:type="dxa" w:w="6760"/>
+            <w:vAlign w:val="top"/>
+            <w:tcMar>
+              <w:top w:w="80" w:type="dxa"/>
+              <w:start w:w="120" w:type="dxa"/>
+              <w:bottom w:w="80" w:type="dxa"/>
+              <w:end w:w="120" w:type="dxa"/>
+            </w:tcMar>
+          </w:tcPr>
+          <w:p>
+            <w:pPr>
+              <w:spacing w:after="0"/>
+            </w:pPr>
+            <w:r>
+              <w:rPr>
+                <w:rFonts w:ascii="Calibri" w:hAnsi="Calibri" w:eastAsia="Calibri"/>
+                <w:b w:val="0"/>
+                <w:i w:val="0"/>
+                <w:color w:val="203740"/>
+                <w:sz w:val="17"/>
+              </w:rPr>
+              <w:t>maestro: sí; presupuesto: sí; territorio: sí; CSV territorial: sí; perfil: sí</w:t>
+            </w:r>
+          </w:p>
+        </w:tc>
+      </w:tr>
+      <w:tr>
+        <w:tc>
+          <w:tcPr>
+            <w:tcW w:type="dxa" w:w="2600"/>
+            <w:shd w:fill="F7F9F9"/>
+            <w:vAlign w:val="top"/>
+            <w:tcMar>
+              <w:top w:w="80" w:type="dxa"/>
+              <w:start w:w="120" w:type="dxa"/>
+              <w:bottom w:w="80" w:type="dxa"/>
+              <w:end w:w="120" w:type="dxa"/>
+            </w:tcMar>
+          </w:tcPr>
+          <w:p>
+            <w:pPr>
+              <w:spacing w:after="0"/>
+            </w:pPr>
+            <w:r>
+              <w:rPr>
+                <w:rFonts w:ascii="Calibri" w:hAnsi="Calibri" w:eastAsia="Calibri"/>
+                <w:b w:val="0"/>
+                <w:i w:val="0"/>
+                <w:color w:val="203740"/>
+                <w:sz w:val="17"/>
+              </w:rPr>
+              <w:t>Enlaces oficiales</w:t>
+            </w:r>
+          </w:p>
+        </w:tc>
+        <w:tc>
+          <w:tcPr>
+            <w:tcW w:type="dxa" w:w="6760"/>
+            <w:shd w:fill="F7F9F9"/>
+            <w:vAlign w:val="top"/>
+            <w:tcMar>
+              <w:top w:w="80" w:type="dxa"/>
+              <w:start w:w="120" w:type="dxa"/>
+              <w:bottom w:w="80" w:type="dxa"/>
+              <w:end w:w="120" w:type="dxa"/>
+            </w:tcMar>
+          </w:tcPr>
+          <w:p>
+            <w:pPr>
+              <w:spacing w:after="0"/>
+            </w:pPr>
+            <w:r>
+              <w:rPr>
+                <w:rFonts w:ascii="Calibri" w:hAnsi="Calibri" w:eastAsia="Calibri"/>
+                <w:b w:val="0"/>
+                <w:i w:val="0"/>
+                <w:color w:val="203740"/>
+                <w:sz w:val="17"/>
+              </w:rPr>
+              <w:t>Perfil: https://mapainversiones.gob.do/projectprofile/8790; contrato: https://comunidad.comprasdominicana.gob.do/Public/Tendering/ContractDetailView/Index?UniqueIdentifier=DO1.PCCNTR.2296624&amp;AwardContractDetailId=717224</w:t>
             </w:r>
           </w:p>
         </w:tc>

</xml_diff>